<commit_message>
dom work part 2 task 2 done
</commit_message>
<xml_diff>
--- a/result-repeat-print-docs/11-date-time.docx
+++ b/result-repeat-print-docs/11-date-time.docx
@@ -10,16 +10,16 @@
         <mc:AlternateContent>
           <mc:Choice Requires="wps">
             <w:drawing>
-              <wp:anchor distT="45720" distB="45720" distL="114300" distR="114300" simplePos="0" relativeHeight="251663360" behindDoc="0" locked="0" layoutInCell="1" allowOverlap="1" wp14:anchorId="565D72BE" wp14:editId="28A92693">
+              <wp:anchor distT="45720" distB="45720" distL="114300" distR="114300" simplePos="0" relativeHeight="251663360" behindDoc="0" locked="0" layoutInCell="1" allowOverlap="1" wp14:anchorId="565D72BE" wp14:editId="311446AD">
                 <wp:simplePos x="0" y="0"/>
                 <wp:positionH relativeFrom="column">
-                  <wp:posOffset>5742240</wp:posOffset>
+                  <wp:posOffset>5121882</wp:posOffset>
                 </wp:positionH>
                 <wp:positionV relativeFrom="paragraph">
-                  <wp:posOffset>-460966</wp:posOffset>
+                  <wp:posOffset>-461673</wp:posOffset>
                 </wp:positionV>
-                <wp:extent cx="2800985" cy="11807371"/>
-                <wp:effectExtent l="0" t="0" r="18415" b="22860"/>
+                <wp:extent cx="4313196" cy="5267740"/>
+                <wp:effectExtent l="0" t="0" r="11430" b="28575"/>
                 <wp:wrapNone/>
                 <wp:docPr id="4" name="Text Box 2"/>
                 <wp:cNvGraphicFramePr>
@@ -34,7 +34,7 @@
                       <wps:spPr bwMode="auto">
                         <a:xfrm>
                           <a:off x="0" y="0"/>
-                          <a:ext cx="2800985" cy="11807371"/>
+                          <a:ext cx="4313196" cy="5267740"/>
                         </a:xfrm>
                         <a:prstGeom prst="rect">
                           <a:avLst/>
@@ -56,6 +56,1074 @@
                           <w:p>
                             <w:pPr>
                               <w:spacing w:after="0" w:line="240" w:lineRule="auto"/>
+                              <w:rPr>
+                                <w:rFonts w:ascii="Times New Roman" w:eastAsia="Times New Roman" w:hAnsi="Times New Roman" w:cs="Times New Roman"/>
+                                <w:sz w:val="24"/>
+                                <w:szCs w:val="24"/>
+                                <w:lang w:val="ru-RU"/>
+                              </w:rPr>
+                            </w:pPr>
+                            <w:r>
+                              <w:rPr>
+                                <w:rFonts w:ascii="Times New Roman" w:eastAsia="Times New Roman" w:hAnsi="Symbol" w:cs="Times New Roman"/>
+                                <w:sz w:val="24"/>
+                                <w:szCs w:val="24"/>
+                              </w:rPr>
+                              <w:t></w:t>
+                            </w:r>
+                            <w:r>
+                              <w:rPr>
+                                <w:rFonts w:ascii="Times New Roman" w:eastAsia="Times New Roman" w:hAnsi="Times New Roman" w:cs="Times New Roman"/>
+                                <w:sz w:val="24"/>
+                                <w:szCs w:val="24"/>
+                                <w:lang w:val="ru-RU"/>
+                              </w:rPr>
+                              <w:t xml:space="preserve">  </w:t>
+                            </w:r>
+                            <w:r>
+                              <w:rPr>
+                                <w:rFonts w:ascii="Times New Roman" w:eastAsia="Times New Roman" w:hAnsi="Times New Roman" w:cs="Times New Roman"/>
+                                <w:b/>
+                                <w:bCs/>
+                                <w:sz w:val="24"/>
+                                <w:szCs w:val="24"/>
+                                <w:lang w:val="ru-RU"/>
+                              </w:rPr>
+                              <w:t xml:space="preserve">Смысл объекта </w:t>
+                            </w:r>
+                            <w:r>
+                              <w:rPr>
+                                <w:rFonts w:ascii="Times New Roman" w:eastAsia="Times New Roman" w:hAnsi="Times New Roman" w:cs="Times New Roman"/>
+                                <w:b/>
+                                <w:bCs/>
+                                <w:sz w:val="24"/>
+                                <w:szCs w:val="24"/>
+                              </w:rPr>
+                              <w:t>Date</w:t>
+                            </w:r>
+                            <w:r>
+                              <w:rPr>
+                                <w:rFonts w:ascii="Times New Roman" w:eastAsia="Times New Roman" w:hAnsi="Times New Roman" w:cs="Times New Roman"/>
+                                <w:sz w:val="24"/>
+                                <w:szCs w:val="24"/>
+                                <w:lang w:val="ru-RU"/>
+                              </w:rPr>
+                              <w:t xml:space="preserve">: Не строка (статичная "наклейка"), а "коробка с инструментами" или "часы с будильником" — хранит </w:t>
+                            </w:r>
+                            <w:r>
+                              <w:rPr>
+                                <w:rFonts w:ascii="Times New Roman" w:eastAsia="Times New Roman" w:hAnsi="Times New Roman" w:cs="Times New Roman"/>
+                                <w:sz w:val="24"/>
+                                <w:szCs w:val="24"/>
+                              </w:rPr>
+                              <w:t>UTC</w:t>
+                            </w:r>
+                            <w:r>
+                              <w:rPr>
+                                <w:rFonts w:ascii="Times New Roman" w:eastAsia="Times New Roman" w:hAnsi="Times New Roman" w:cs="Times New Roman"/>
+                                <w:sz w:val="24"/>
+                                <w:szCs w:val="24"/>
+                                <w:lang w:val="ru-RU"/>
+                              </w:rPr>
+                              <w:t>-</w:t>
+                            </w:r>
+                            <w:r>
+                              <w:rPr>
+                                <w:rFonts w:ascii="Times New Roman" w:eastAsia="Times New Roman" w:hAnsi="Times New Roman" w:cs="Times New Roman"/>
+                                <w:sz w:val="24"/>
+                                <w:szCs w:val="24"/>
+                              </w:rPr>
+                              <w:t>timestamp</w:t>
+                            </w:r>
+                            <w:r>
+                              <w:rPr>
+                                <w:rFonts w:ascii="Times New Roman" w:eastAsia="Times New Roman" w:hAnsi="Times New Roman" w:cs="Times New Roman"/>
+                                <w:sz w:val="24"/>
+                                <w:szCs w:val="24"/>
+                                <w:lang w:val="ru-RU"/>
+                              </w:rPr>
+                              <w:t xml:space="preserve"> (мс от 1.01.1970), с методами для </w:t>
+                            </w:r>
+                            <w:r>
+                              <w:rPr>
+                                <w:rFonts w:ascii="Times New Roman" w:eastAsia="Times New Roman" w:hAnsi="Times New Roman" w:cs="Times New Roman"/>
+                                <w:sz w:val="24"/>
+                                <w:szCs w:val="24"/>
+                              </w:rPr>
+                              <w:t>get</w:t>
+                            </w:r>
+                            <w:r>
+                              <w:rPr>
+                                <w:rFonts w:ascii="Times New Roman" w:eastAsia="Times New Roman" w:hAnsi="Times New Roman" w:cs="Times New Roman"/>
+                                <w:sz w:val="24"/>
+                                <w:szCs w:val="24"/>
+                                <w:lang w:val="ru-RU"/>
+                              </w:rPr>
+                              <w:t>/</w:t>
+                            </w:r>
+                            <w:r>
+                              <w:rPr>
+                                <w:rFonts w:ascii="Times New Roman" w:eastAsia="Times New Roman" w:hAnsi="Times New Roman" w:cs="Times New Roman"/>
+                                <w:sz w:val="24"/>
+                                <w:szCs w:val="24"/>
+                              </w:rPr>
+                              <w:t>set</w:t>
+                            </w:r>
+                            <w:r>
+                              <w:rPr>
+                                <w:rFonts w:ascii="Times New Roman" w:eastAsia="Times New Roman" w:hAnsi="Times New Roman" w:cs="Times New Roman"/>
+                                <w:sz w:val="24"/>
+                                <w:szCs w:val="24"/>
+                                <w:lang w:val="ru-RU"/>
+                              </w:rPr>
+                              <w:t xml:space="preserve"> (компоненты: год/месяц/день/часы), арифметики (разница в мс), форматирования (</w:t>
+                            </w:r>
+                            <w:r>
+                              <w:rPr>
+                                <w:rFonts w:ascii="Times New Roman" w:eastAsia="Times New Roman" w:hAnsi="Times New Roman" w:cs="Times New Roman"/>
+                                <w:sz w:val="24"/>
+                                <w:szCs w:val="24"/>
+                              </w:rPr>
+                              <w:t>toISOString</w:t>
+                            </w:r>
+                            <w:r>
+                              <w:rPr>
+                                <w:rFonts w:ascii="Times New Roman" w:eastAsia="Times New Roman" w:hAnsi="Times New Roman" w:cs="Times New Roman"/>
+                                <w:sz w:val="24"/>
+                                <w:szCs w:val="24"/>
+                                <w:lang w:val="ru-RU"/>
+                              </w:rPr>
+                              <w:t xml:space="preserve">() для </w:t>
+                            </w:r>
+                            <w:r>
+                              <w:rPr>
+                                <w:rFonts w:ascii="Times New Roman" w:eastAsia="Times New Roman" w:hAnsi="Times New Roman" w:cs="Times New Roman"/>
+                                <w:sz w:val="24"/>
+                                <w:szCs w:val="24"/>
+                              </w:rPr>
+                              <w:t>UTC</w:t>
+                            </w:r>
+                            <w:r>
+                              <w:rPr>
+                                <w:rFonts w:ascii="Times New Roman" w:eastAsia="Times New Roman" w:hAnsi="Times New Roman" w:cs="Times New Roman"/>
+                                <w:sz w:val="24"/>
+                                <w:szCs w:val="24"/>
+                                <w:lang w:val="ru-RU"/>
+                              </w:rPr>
+                              <w:t xml:space="preserve">, </w:t>
+                            </w:r>
+                            <w:r>
+                              <w:rPr>
+                                <w:rFonts w:ascii="Times New Roman" w:eastAsia="Times New Roman" w:hAnsi="Times New Roman" w:cs="Times New Roman"/>
+                                <w:sz w:val="24"/>
+                                <w:szCs w:val="24"/>
+                              </w:rPr>
+                              <w:t>toString</w:t>
+                            </w:r>
+                            <w:r>
+                              <w:rPr>
+                                <w:rFonts w:ascii="Times New Roman" w:eastAsia="Times New Roman" w:hAnsi="Times New Roman" w:cs="Times New Roman"/>
+                                <w:sz w:val="24"/>
+                                <w:szCs w:val="24"/>
+                                <w:lang w:val="ru-RU"/>
+                              </w:rPr>
+                              <w:t xml:space="preserve">() для локали). Упрощает расчёты (добавление дней, валидацию), избегает багов с високосными/поясами. </w:t>
+                            </w:r>
+                          </w:p>
+                          <w:p>
+                            <w:pPr>
+                              <w:spacing w:after="0" w:line="240" w:lineRule="auto"/>
+                              <w:rPr>
+                                <w:rFonts w:ascii="Times New Roman" w:eastAsia="Times New Roman" w:hAnsi="Times New Roman" w:cs="Times New Roman"/>
+                                <w:sz w:val="24"/>
+                                <w:szCs w:val="24"/>
+                                <w:lang w:val="ru-RU"/>
+                              </w:rPr>
+                            </w:pPr>
+                            <w:r>
+                              <w:rPr>
+                                <w:rFonts w:ascii="Times New Roman" w:eastAsia="Times New Roman" w:hAnsi="Symbol" w:cs="Times New Roman"/>
+                                <w:sz w:val="24"/>
+                                <w:szCs w:val="24"/>
+                              </w:rPr>
+                              <w:t></w:t>
+                            </w:r>
+                            <w:r>
+                              <w:rPr>
+                                <w:rFonts w:ascii="Times New Roman" w:eastAsia="Times New Roman" w:hAnsi="Times New Roman" w:cs="Times New Roman"/>
+                                <w:sz w:val="24"/>
+                                <w:szCs w:val="24"/>
+                                <w:lang w:val="ru-RU"/>
+                              </w:rPr>
+                              <w:t xml:space="preserve">  </w:t>
+                            </w:r>
+                            <w:r>
+                              <w:rPr>
+                                <w:rFonts w:ascii="Times New Roman" w:eastAsia="Times New Roman" w:hAnsi="Times New Roman" w:cs="Times New Roman"/>
+                                <w:b/>
+                                <w:bCs/>
+                                <w:sz w:val="24"/>
+                                <w:szCs w:val="24"/>
+                              </w:rPr>
+                              <w:t>Set</w:t>
+                            </w:r>
+                            <w:r>
+                              <w:rPr>
+                                <w:rFonts w:ascii="Times New Roman" w:eastAsia="Times New Roman" w:hAnsi="Times New Roman" w:cs="Times New Roman"/>
+                                <w:b/>
+                                <w:bCs/>
+                                <w:sz w:val="24"/>
+                                <w:szCs w:val="24"/>
+                                <w:lang w:val="ru-RU"/>
+                              </w:rPr>
+                              <w:t>-методы</w:t>
+                            </w:r>
+                            <w:r>
+                              <w:rPr>
+                                <w:rFonts w:ascii="Times New Roman" w:eastAsia="Times New Roman" w:hAnsi="Times New Roman" w:cs="Times New Roman"/>
+                                <w:sz w:val="24"/>
+                                <w:szCs w:val="24"/>
+                                <w:lang w:val="ru-RU"/>
+                              </w:rPr>
+                              <w:t xml:space="preserve">: Для модификации </w:t>
+                            </w:r>
+                            <w:r>
+                              <w:rPr>
+                                <w:rFonts w:ascii="Times New Roman" w:eastAsia="Times New Roman" w:hAnsi="Times New Roman" w:cs="Times New Roman"/>
+                                <w:sz w:val="24"/>
+                                <w:szCs w:val="24"/>
+                              </w:rPr>
+                              <w:t>in</w:t>
+                            </w:r>
+                            <w:r>
+                              <w:rPr>
+                                <w:rFonts w:ascii="Times New Roman" w:eastAsia="Times New Roman" w:hAnsi="Times New Roman" w:cs="Times New Roman"/>
+                                <w:sz w:val="24"/>
+                                <w:szCs w:val="24"/>
+                                <w:lang w:val="ru-RU"/>
+                              </w:rPr>
+                              <w:t>-</w:t>
+                            </w:r>
+                            <w:r>
+                              <w:rPr>
+                                <w:rFonts w:ascii="Times New Roman" w:eastAsia="Times New Roman" w:hAnsi="Times New Roman" w:cs="Times New Roman"/>
+                                <w:sz w:val="24"/>
+                                <w:szCs w:val="24"/>
+                              </w:rPr>
+                              <w:t>place</w:t>
+                            </w:r>
+                            <w:r>
+                              <w:rPr>
+                                <w:rFonts w:ascii="Times New Roman" w:eastAsia="Times New Roman" w:hAnsi="Times New Roman" w:cs="Times New Roman"/>
+                                <w:sz w:val="24"/>
+                                <w:szCs w:val="24"/>
+                                <w:lang w:val="ru-RU"/>
+                              </w:rPr>
+                              <w:t xml:space="preserve"> (напр. </w:t>
+                            </w:r>
+                            <w:r>
+                              <w:rPr>
+                                <w:rFonts w:ascii="Times New Roman" w:eastAsia="Times New Roman" w:hAnsi="Times New Roman" w:cs="Times New Roman"/>
+                                <w:sz w:val="24"/>
+                                <w:szCs w:val="24"/>
+                              </w:rPr>
+                              <w:t>setDate</w:t>
+                            </w:r>
+                            <w:r>
+                              <w:rPr>
+                                <w:rFonts w:ascii="Times New Roman" w:eastAsia="Times New Roman" w:hAnsi="Times New Roman" w:cs="Times New Roman"/>
+                                <w:sz w:val="24"/>
+                                <w:szCs w:val="24"/>
+                                <w:lang w:val="ru-RU"/>
+                              </w:rPr>
+                              <w:t xml:space="preserve">() +5 для доставки заказа: </w:t>
+                            </w:r>
+                            <w:r>
+                              <w:rPr>
+                                <w:rFonts w:ascii="Times New Roman" w:eastAsia="Times New Roman" w:hAnsi="Times New Roman" w:cs="Times New Roman"/>
+                                <w:sz w:val="24"/>
+                                <w:szCs w:val="24"/>
+                              </w:rPr>
+                              <w:t>new</w:t>
+                            </w:r>
+                            <w:r>
+                              <w:rPr>
+                                <w:rFonts w:ascii="Times New Roman" w:eastAsia="Times New Roman" w:hAnsi="Times New Roman" w:cs="Times New Roman"/>
+                                <w:sz w:val="24"/>
+                                <w:szCs w:val="24"/>
+                                <w:lang w:val="ru-RU"/>
+                              </w:rPr>
+                              <w:t xml:space="preserve"> </w:t>
+                            </w:r>
+                            <w:r>
+                              <w:rPr>
+                                <w:rFonts w:ascii="Times New Roman" w:eastAsia="Times New Roman" w:hAnsi="Times New Roman" w:cs="Times New Roman"/>
+                                <w:sz w:val="24"/>
+                                <w:szCs w:val="24"/>
+                              </w:rPr>
+                              <w:t>Date</w:t>
+                            </w:r>
+                            <w:r>
+                              <w:rPr>
+                                <w:rFonts w:ascii="Times New Roman" w:eastAsia="Times New Roman" w:hAnsi="Times New Roman" w:cs="Times New Roman"/>
+                                <w:sz w:val="24"/>
+                                <w:szCs w:val="24"/>
+                                <w:lang w:val="ru-RU"/>
+                              </w:rPr>
+                              <w:t>(</w:t>
+                            </w:r>
+                            <w:r>
+                              <w:rPr>
+                                <w:rFonts w:ascii="Times New Roman" w:eastAsia="Times New Roman" w:hAnsi="Times New Roman" w:cs="Times New Roman"/>
+                                <w:sz w:val="24"/>
+                                <w:szCs w:val="24"/>
+                              </w:rPr>
+                              <w:t>order</w:t>
+                            </w:r>
+                            <w:r>
+                              <w:rPr>
+                                <w:rFonts w:ascii="Times New Roman" w:eastAsia="Times New Roman" w:hAnsi="Times New Roman" w:cs="Times New Roman"/>
+                                <w:sz w:val="24"/>
+                                <w:szCs w:val="24"/>
+                                <w:lang w:val="ru-RU"/>
+                              </w:rPr>
+                              <w:t>).</w:t>
+                            </w:r>
+                            <w:r>
+                              <w:rPr>
+                                <w:rFonts w:ascii="Times New Roman" w:eastAsia="Times New Roman" w:hAnsi="Times New Roman" w:cs="Times New Roman"/>
+                                <w:sz w:val="24"/>
+                                <w:szCs w:val="24"/>
+                              </w:rPr>
+                              <w:t>setDate</w:t>
+                            </w:r>
+                            <w:r>
+                              <w:rPr>
+                                <w:rFonts w:ascii="Times New Roman" w:eastAsia="Times New Roman" w:hAnsi="Times New Roman" w:cs="Times New Roman"/>
+                                <w:sz w:val="24"/>
+                                <w:szCs w:val="24"/>
+                                <w:lang w:val="ru-RU"/>
+                              </w:rPr>
+                              <w:t>(</w:t>
+                            </w:r>
+                            <w:r>
+                              <w:rPr>
+                                <w:rFonts w:ascii="Times New Roman" w:eastAsia="Times New Roman" w:hAnsi="Times New Roman" w:cs="Times New Roman"/>
+                                <w:sz w:val="24"/>
+                                <w:szCs w:val="24"/>
+                              </w:rPr>
+                              <w:t>order</w:t>
+                            </w:r>
+                            <w:r>
+                              <w:rPr>
+                                <w:rFonts w:ascii="Times New Roman" w:eastAsia="Times New Roman" w:hAnsi="Times New Roman" w:cs="Times New Roman"/>
+                                <w:sz w:val="24"/>
+                                <w:szCs w:val="24"/>
+                                <w:lang w:val="ru-RU"/>
+                              </w:rPr>
+                              <w:t>.</w:t>
+                            </w:r>
+                            <w:r>
+                              <w:rPr>
+                                <w:rFonts w:ascii="Times New Roman" w:eastAsia="Times New Roman" w:hAnsi="Times New Roman" w:cs="Times New Roman"/>
+                                <w:sz w:val="24"/>
+                                <w:szCs w:val="24"/>
+                              </w:rPr>
+                              <w:t>getDate</w:t>
+                            </w:r>
+                            <w:r>
+                              <w:rPr>
+                                <w:rFonts w:ascii="Times New Roman" w:eastAsia="Times New Roman" w:hAnsi="Times New Roman" w:cs="Times New Roman"/>
+                                <w:sz w:val="24"/>
+                                <w:szCs w:val="24"/>
+                                <w:lang w:val="ru-RU"/>
+                              </w:rPr>
+                              <w:t xml:space="preserve">() +5)). Без них — ручные расчёты или пересоздание. </w:t>
+                            </w:r>
+                          </w:p>
+                          <w:p>
+                            <w:pPr>
+                              <w:spacing w:after="0" w:line="240" w:lineRule="auto"/>
+                              <w:rPr>
+                                <w:rFonts w:ascii="Times New Roman" w:eastAsia="Times New Roman" w:hAnsi="Times New Roman" w:cs="Times New Roman"/>
+                                <w:sz w:val="24"/>
+                                <w:szCs w:val="24"/>
+                                <w:lang w:val="ru-RU"/>
+                              </w:rPr>
+                            </w:pPr>
+                            <w:r>
+                              <w:rPr>
+                                <w:rFonts w:ascii="Times New Roman" w:eastAsia="Times New Roman" w:hAnsi="Symbol" w:cs="Times New Roman"/>
+                                <w:sz w:val="24"/>
+                                <w:szCs w:val="24"/>
+                              </w:rPr>
+                              <w:t></w:t>
+                            </w:r>
+                            <w:r>
+                              <w:rPr>
+                                <w:rFonts w:ascii="Times New Roman" w:eastAsia="Times New Roman" w:hAnsi="Times New Roman" w:cs="Times New Roman"/>
+                                <w:sz w:val="24"/>
+                                <w:szCs w:val="24"/>
+                                <w:lang w:val="ru-RU"/>
+                              </w:rPr>
+                              <w:t xml:space="preserve">  </w:t>
+                            </w:r>
+                            <w:r>
+                              <w:rPr>
+                                <w:rFonts w:ascii="Times New Roman" w:eastAsia="Times New Roman" w:hAnsi="Times New Roman" w:cs="Times New Roman"/>
+                                <w:b/>
+                                <w:bCs/>
+                                <w:sz w:val="24"/>
+                                <w:szCs w:val="24"/>
+                              </w:rPr>
+                              <w:t>Unix</w:t>
+                            </w:r>
+                            <w:r>
+                              <w:rPr>
+                                <w:rFonts w:ascii="Times New Roman" w:eastAsia="Times New Roman" w:hAnsi="Times New Roman" w:cs="Times New Roman"/>
+                                <w:b/>
+                                <w:bCs/>
+                                <w:sz w:val="24"/>
+                                <w:szCs w:val="24"/>
+                                <w:lang w:val="ru-RU"/>
+                              </w:rPr>
+                              <w:t xml:space="preserve"> </w:t>
+                            </w:r>
+                            <w:r>
+                              <w:rPr>
+                                <w:rFonts w:ascii="Times New Roman" w:eastAsia="Times New Roman" w:hAnsi="Times New Roman" w:cs="Times New Roman"/>
+                                <w:b/>
+                                <w:bCs/>
+                                <w:sz w:val="24"/>
+                                <w:szCs w:val="24"/>
+                              </w:rPr>
+                              <w:t>epoch</w:t>
+                            </w:r>
+                            <w:r>
+                              <w:rPr>
+                                <w:rFonts w:ascii="Times New Roman" w:eastAsia="Times New Roman" w:hAnsi="Times New Roman" w:cs="Times New Roman"/>
+                                <w:sz w:val="24"/>
+                                <w:szCs w:val="24"/>
+                                <w:lang w:val="ru-RU"/>
+                              </w:rPr>
+                              <w:t xml:space="preserve">: 1.01.1970 00:00 </w:t>
+                            </w:r>
+                            <w:r>
+                              <w:rPr>
+                                <w:rFonts w:ascii="Times New Roman" w:eastAsia="Times New Roman" w:hAnsi="Times New Roman" w:cs="Times New Roman"/>
+                                <w:sz w:val="24"/>
+                                <w:szCs w:val="24"/>
+                              </w:rPr>
+                              <w:t>UTC</w:t>
+                            </w:r>
+                            <w:r>
+                              <w:rPr>
+                                <w:rFonts w:ascii="Times New Roman" w:eastAsia="Times New Roman" w:hAnsi="Times New Roman" w:cs="Times New Roman"/>
+                                <w:sz w:val="24"/>
+                                <w:szCs w:val="24"/>
+                                <w:lang w:val="ru-RU"/>
+                              </w:rPr>
+                              <w:t xml:space="preserve"> (</w:t>
+                            </w:r>
+                            <w:r>
+                              <w:rPr>
+                                <w:rFonts w:ascii="Times New Roman" w:eastAsia="Times New Roman" w:hAnsi="Times New Roman" w:cs="Times New Roman"/>
+                                <w:sz w:val="24"/>
+                                <w:szCs w:val="24"/>
+                              </w:rPr>
+                              <w:t>GMT</w:t>
+                            </w:r>
+                            <w:r>
+                              <w:rPr>
+                                <w:rFonts w:ascii="Times New Roman" w:eastAsia="Times New Roman" w:hAnsi="Times New Roman" w:cs="Times New Roman"/>
+                                <w:sz w:val="24"/>
+                                <w:szCs w:val="24"/>
+                                <w:lang w:val="ru-RU"/>
+                              </w:rPr>
+                              <w:t>+0) — исторический выбор (</w:t>
+                            </w:r>
+                            <w:r>
+                              <w:rPr>
+                                <w:rFonts w:ascii="Times New Roman" w:eastAsia="Times New Roman" w:hAnsi="Times New Roman" w:cs="Times New Roman"/>
+                                <w:sz w:val="24"/>
+                                <w:szCs w:val="24"/>
+                              </w:rPr>
+                              <w:t>Unix</w:t>
+                            </w:r>
+                            <w:r>
+                              <w:rPr>
+                                <w:rFonts w:ascii="Times New Roman" w:eastAsia="Times New Roman" w:hAnsi="Times New Roman" w:cs="Times New Roman"/>
+                                <w:sz w:val="24"/>
+                                <w:szCs w:val="24"/>
+                                <w:lang w:val="ru-RU"/>
+                              </w:rPr>
+                              <w:t xml:space="preserve"> 1970-х, 32-бит до 2038). </w:t>
+                            </w:r>
+                            <w:r>
+                              <w:rPr>
+                                <w:rFonts w:ascii="Times New Roman" w:eastAsia="Times New Roman" w:hAnsi="Times New Roman" w:cs="Times New Roman"/>
+                                <w:sz w:val="24"/>
+                                <w:szCs w:val="24"/>
+                              </w:rPr>
+                              <w:t>UTC</w:t>
+                            </w:r>
+                            <w:r>
+                              <w:rPr>
+                                <w:rFonts w:ascii="Times New Roman" w:eastAsia="Times New Roman" w:hAnsi="Times New Roman" w:cs="Times New Roman"/>
+                                <w:sz w:val="24"/>
+                                <w:szCs w:val="24"/>
+                                <w:lang w:val="ru-RU"/>
+                              </w:rPr>
+                              <w:t xml:space="preserve"> — современный стандарт (атомные часы, без </w:t>
+                            </w:r>
+                            <w:r>
+                              <w:rPr>
+                                <w:rFonts w:ascii="Times New Roman" w:eastAsia="Times New Roman" w:hAnsi="Times New Roman" w:cs="Times New Roman"/>
+                                <w:sz w:val="24"/>
+                                <w:szCs w:val="24"/>
+                              </w:rPr>
+                              <w:t>DST</w:t>
+                            </w:r>
+                            <w:r>
+                              <w:rPr>
+                                <w:rFonts w:ascii="Times New Roman" w:eastAsia="Times New Roman" w:hAnsi="Times New Roman" w:cs="Times New Roman"/>
+                                <w:sz w:val="24"/>
+                                <w:szCs w:val="24"/>
+                                <w:lang w:val="ru-RU"/>
+                              </w:rPr>
+                              <w:t xml:space="preserve">), </w:t>
+                            </w:r>
+                            <w:r>
+                              <w:rPr>
+                                <w:rFonts w:ascii="Times New Roman" w:eastAsia="Times New Roman" w:hAnsi="Times New Roman" w:cs="Times New Roman"/>
+                                <w:sz w:val="24"/>
+                                <w:szCs w:val="24"/>
+                              </w:rPr>
+                              <w:t>GMT</w:t>
+                            </w:r>
+                            <w:r>
+                              <w:rPr>
+                                <w:rFonts w:ascii="Times New Roman" w:eastAsia="Times New Roman" w:hAnsi="Times New Roman" w:cs="Times New Roman"/>
+                                <w:sz w:val="24"/>
+                                <w:szCs w:val="24"/>
+                                <w:lang w:val="ru-RU"/>
+                              </w:rPr>
+                              <w:t xml:space="preserve"> — старый (солнечный, с </w:t>
+                            </w:r>
+                            <w:r>
+                              <w:rPr>
+                                <w:rFonts w:ascii="Times New Roman" w:eastAsia="Times New Roman" w:hAnsi="Times New Roman" w:cs="Times New Roman"/>
+                                <w:sz w:val="24"/>
+                                <w:szCs w:val="24"/>
+                              </w:rPr>
+                              <w:t>Zulu</w:t>
+                            </w:r>
+                            <w:r>
+                              <w:rPr>
+                                <w:rFonts w:ascii="Times New Roman" w:eastAsia="Times New Roman" w:hAnsi="Times New Roman" w:cs="Times New Roman"/>
+                                <w:sz w:val="24"/>
+                                <w:szCs w:val="24"/>
+                                <w:lang w:val="ru-RU"/>
+                              </w:rPr>
+                              <w:t>=</w:t>
+                            </w:r>
+                            <w:r>
+                              <w:rPr>
+                                <w:rFonts w:ascii="Times New Roman" w:eastAsia="Times New Roman" w:hAnsi="Times New Roman" w:cs="Times New Roman"/>
+                                <w:sz w:val="24"/>
+                                <w:szCs w:val="24"/>
+                              </w:rPr>
+                              <w:t>Z</w:t>
+                            </w:r>
+                            <w:r>
+                              <w:rPr>
+                                <w:rFonts w:ascii="Times New Roman" w:eastAsia="Times New Roman" w:hAnsi="Times New Roman" w:cs="Times New Roman"/>
+                                <w:sz w:val="24"/>
+                                <w:szCs w:val="24"/>
+                                <w:lang w:val="ru-RU"/>
+                              </w:rPr>
+                              <w:t xml:space="preserve"> для </w:t>
+                            </w:r>
+                            <w:r>
+                              <w:rPr>
+                                <w:rFonts w:ascii="Times New Roman" w:eastAsia="Times New Roman" w:hAnsi="Times New Roman" w:cs="Times New Roman"/>
+                                <w:sz w:val="24"/>
+                                <w:szCs w:val="24"/>
+                              </w:rPr>
+                              <w:t>UTC</w:t>
+                            </w:r>
+                            <w:r>
+                              <w:rPr>
+                                <w:rFonts w:ascii="Times New Roman" w:eastAsia="Times New Roman" w:hAnsi="Times New Roman" w:cs="Times New Roman"/>
+                                <w:sz w:val="24"/>
+                                <w:szCs w:val="24"/>
+                                <w:lang w:val="ru-RU"/>
+                              </w:rPr>
+                              <w:t xml:space="preserve">+0). </w:t>
+                            </w:r>
+                          </w:p>
+                          <w:p>
+                            <w:pPr>
+                              <w:spacing w:after="0" w:line="240" w:lineRule="auto"/>
+                              <w:rPr>
+                                <w:rFonts w:ascii="Times New Roman" w:eastAsia="Times New Roman" w:hAnsi="Times New Roman" w:cs="Times New Roman"/>
+                                <w:sz w:val="24"/>
+                                <w:szCs w:val="24"/>
+                                <w:lang w:val="ru-RU"/>
+                              </w:rPr>
+                            </w:pPr>
+                            <w:r>
+                              <w:rPr>
+                                <w:rFonts w:ascii="Times New Roman" w:eastAsia="Times New Roman" w:hAnsi="Symbol" w:cs="Times New Roman"/>
+                                <w:sz w:val="24"/>
+                                <w:szCs w:val="24"/>
+                              </w:rPr>
+                              <w:t></w:t>
+                            </w:r>
+                            <w:r>
+                              <w:rPr>
+                                <w:rFonts w:ascii="Times New Roman" w:eastAsia="Times New Roman" w:hAnsi="Times New Roman" w:cs="Times New Roman"/>
+                                <w:sz w:val="24"/>
+                                <w:szCs w:val="24"/>
+                                <w:lang w:val="ru-RU"/>
+                              </w:rPr>
+                              <w:t xml:space="preserve">  </w:t>
+                            </w:r>
+                            <w:r>
+                              <w:rPr>
+                                <w:rFonts w:ascii="Times New Roman" w:eastAsia="Times New Roman" w:hAnsi="Times New Roman" w:cs="Times New Roman"/>
+                                <w:b/>
+                                <w:bCs/>
+                                <w:sz w:val="24"/>
+                                <w:szCs w:val="24"/>
+                                <w:lang w:val="ru-RU"/>
+                              </w:rPr>
+                              <w:t>Вывод в консоли</w:t>
+                            </w:r>
+                            <w:r>
+                              <w:rPr>
+                                <w:rFonts w:ascii="Times New Roman" w:eastAsia="Times New Roman" w:hAnsi="Times New Roman" w:cs="Times New Roman"/>
+                                <w:sz w:val="24"/>
+                                <w:szCs w:val="24"/>
+                                <w:lang w:val="ru-RU"/>
+                              </w:rPr>
+                              <w:t xml:space="preserve">: </w:t>
+                            </w:r>
+                            <w:r>
+                              <w:rPr>
+                                <w:rFonts w:ascii="Times New Roman" w:eastAsia="Times New Roman" w:hAnsi="Times New Roman" w:cs="Times New Roman"/>
+                                <w:sz w:val="24"/>
+                                <w:szCs w:val="24"/>
+                              </w:rPr>
+                              <w:t>console</w:t>
+                            </w:r>
+                            <w:r>
+                              <w:rPr>
+                                <w:rFonts w:ascii="Times New Roman" w:eastAsia="Times New Roman" w:hAnsi="Times New Roman" w:cs="Times New Roman"/>
+                                <w:sz w:val="24"/>
+                                <w:szCs w:val="24"/>
+                                <w:lang w:val="ru-RU"/>
+                              </w:rPr>
+                              <w:t>.</w:t>
+                            </w:r>
+                            <w:r>
+                              <w:rPr>
+                                <w:rFonts w:ascii="Times New Roman" w:eastAsia="Times New Roman" w:hAnsi="Times New Roman" w:cs="Times New Roman"/>
+                                <w:sz w:val="24"/>
+                                <w:szCs w:val="24"/>
+                              </w:rPr>
+                              <w:t>log</w:t>
+                            </w:r>
+                            <w:r>
+                              <w:rPr>
+                                <w:rFonts w:ascii="Times New Roman" w:eastAsia="Times New Roman" w:hAnsi="Times New Roman" w:cs="Times New Roman"/>
+                                <w:sz w:val="24"/>
+                                <w:szCs w:val="24"/>
+                                <w:lang w:val="ru-RU"/>
+                              </w:rPr>
+                              <w:t>(</w:t>
+                            </w:r>
+                            <w:r>
+                              <w:rPr>
+                                <w:rFonts w:ascii="Times New Roman" w:eastAsia="Times New Roman" w:hAnsi="Times New Roman" w:cs="Times New Roman"/>
+                                <w:sz w:val="24"/>
+                                <w:szCs w:val="24"/>
+                              </w:rPr>
+                              <w:t>date</w:t>
+                            </w:r>
+                            <w:r>
+                              <w:rPr>
+                                <w:rFonts w:ascii="Times New Roman" w:eastAsia="Times New Roman" w:hAnsi="Times New Roman" w:cs="Times New Roman"/>
+                                <w:sz w:val="24"/>
+                                <w:szCs w:val="24"/>
+                                <w:lang w:val="ru-RU"/>
+                              </w:rPr>
+                              <w:t xml:space="preserve">) = </w:t>
+                            </w:r>
+                            <w:r>
+                              <w:rPr>
+                                <w:rFonts w:ascii="Times New Roman" w:eastAsia="Times New Roman" w:hAnsi="Times New Roman" w:cs="Times New Roman"/>
+                                <w:sz w:val="24"/>
+                                <w:szCs w:val="24"/>
+                              </w:rPr>
+                              <w:t>toString</w:t>
+                            </w:r>
+                            <w:r>
+                              <w:rPr>
+                                <w:rFonts w:ascii="Times New Roman" w:eastAsia="Times New Roman" w:hAnsi="Times New Roman" w:cs="Times New Roman"/>
+                                <w:sz w:val="24"/>
+                                <w:szCs w:val="24"/>
+                                <w:lang w:val="ru-RU"/>
+                              </w:rPr>
+                              <w:t>() (локаль: "</w:t>
+                            </w:r>
+                            <w:r>
+                              <w:rPr>
+                                <w:rFonts w:ascii="Times New Roman" w:eastAsia="Times New Roman" w:hAnsi="Times New Roman" w:cs="Times New Roman"/>
+                                <w:sz w:val="24"/>
+                                <w:szCs w:val="24"/>
+                              </w:rPr>
+                              <w:t>Wed</w:t>
+                            </w:r>
+                            <w:r>
+                              <w:rPr>
+                                <w:rFonts w:ascii="Times New Roman" w:eastAsia="Times New Roman" w:hAnsi="Times New Roman" w:cs="Times New Roman"/>
+                                <w:sz w:val="24"/>
+                                <w:szCs w:val="24"/>
+                                <w:lang w:val="ru-RU"/>
+                              </w:rPr>
+                              <w:t xml:space="preserve"> </w:t>
+                            </w:r>
+                            <w:r>
+                              <w:rPr>
+                                <w:rFonts w:ascii="Times New Roman" w:eastAsia="Times New Roman" w:hAnsi="Times New Roman" w:cs="Times New Roman"/>
+                                <w:sz w:val="24"/>
+                                <w:szCs w:val="24"/>
+                              </w:rPr>
+                              <w:t>Dec</w:t>
+                            </w:r>
+                            <w:r>
+                              <w:rPr>
+                                <w:rFonts w:ascii="Times New Roman" w:eastAsia="Times New Roman" w:hAnsi="Times New Roman" w:cs="Times New Roman"/>
+                                <w:sz w:val="24"/>
+                                <w:szCs w:val="24"/>
+                                <w:lang w:val="ru-RU"/>
+                              </w:rPr>
+                              <w:t xml:space="preserve"> 31 2025 00:00:00 </w:t>
+                            </w:r>
+                            <w:r>
+                              <w:rPr>
+                                <w:rFonts w:ascii="Times New Roman" w:eastAsia="Times New Roman" w:hAnsi="Times New Roman" w:cs="Times New Roman"/>
+                                <w:sz w:val="24"/>
+                                <w:szCs w:val="24"/>
+                              </w:rPr>
+                              <w:t>GMT</w:t>
+                            </w:r>
+                            <w:r>
+                              <w:rPr>
+                                <w:rFonts w:ascii="Times New Roman" w:eastAsia="Times New Roman" w:hAnsi="Times New Roman" w:cs="Times New Roman"/>
+                                <w:sz w:val="24"/>
+                                <w:szCs w:val="24"/>
+                                <w:lang w:val="ru-RU"/>
+                              </w:rPr>
+                              <w:t>+0300 (</w:t>
+                            </w:r>
+                            <w:r>
+                              <w:rPr>
+                                <w:rFonts w:ascii="Times New Roman" w:eastAsia="Times New Roman" w:hAnsi="Times New Roman" w:cs="Times New Roman"/>
+                                <w:sz w:val="24"/>
+                                <w:szCs w:val="24"/>
+                              </w:rPr>
+                              <w:t>MSK</w:t>
+                            </w:r>
+                            <w:r>
+                              <w:rPr>
+                                <w:rFonts w:ascii="Times New Roman" w:eastAsia="Times New Roman" w:hAnsi="Times New Roman" w:cs="Times New Roman"/>
+                                <w:sz w:val="24"/>
+                                <w:szCs w:val="24"/>
+                                <w:lang w:val="ru-RU"/>
+                              </w:rPr>
+                              <w:t xml:space="preserve">)"); </w:t>
+                            </w:r>
+                            <w:r>
+                              <w:rPr>
+                                <w:rFonts w:ascii="Times New Roman" w:eastAsia="Times New Roman" w:hAnsi="Times New Roman" w:cs="Times New Roman"/>
+                                <w:sz w:val="24"/>
+                                <w:szCs w:val="24"/>
+                              </w:rPr>
+                              <w:t>toISOString</w:t>
+                            </w:r>
+                            <w:r>
+                              <w:rPr>
+                                <w:rFonts w:ascii="Times New Roman" w:eastAsia="Times New Roman" w:hAnsi="Times New Roman" w:cs="Times New Roman"/>
+                                <w:sz w:val="24"/>
+                                <w:szCs w:val="24"/>
+                                <w:lang w:val="ru-RU"/>
+                              </w:rPr>
+                              <w:t xml:space="preserve">() = </w:t>
+                            </w:r>
+                            <w:r>
+                              <w:rPr>
+                                <w:rFonts w:ascii="Times New Roman" w:eastAsia="Times New Roman" w:hAnsi="Times New Roman" w:cs="Times New Roman"/>
+                                <w:sz w:val="24"/>
+                                <w:szCs w:val="24"/>
+                              </w:rPr>
+                              <w:t>UTC</w:t>
+                            </w:r>
+                            <w:r>
+                              <w:rPr>
+                                <w:rFonts w:ascii="Times New Roman" w:eastAsia="Times New Roman" w:hAnsi="Times New Roman" w:cs="Times New Roman"/>
+                                <w:sz w:val="24"/>
+                                <w:szCs w:val="24"/>
+                                <w:lang w:val="ru-RU"/>
+                              </w:rPr>
+                              <w:t xml:space="preserve"> </w:t>
+                            </w:r>
+                            <w:r>
+                              <w:rPr>
+                                <w:rFonts w:ascii="Times New Roman" w:eastAsia="Times New Roman" w:hAnsi="Times New Roman" w:cs="Times New Roman"/>
+                                <w:sz w:val="24"/>
+                                <w:szCs w:val="24"/>
+                              </w:rPr>
+                              <w:t>ISO</w:t>
+                            </w:r>
+                            <w:r>
+                              <w:rPr>
+                                <w:rFonts w:ascii="Times New Roman" w:eastAsia="Times New Roman" w:hAnsi="Times New Roman" w:cs="Times New Roman"/>
+                                <w:sz w:val="24"/>
+                                <w:szCs w:val="24"/>
+                                <w:lang w:val="ru-RU"/>
+                              </w:rPr>
+                              <w:t xml:space="preserve"> ("2025-12-30</w:t>
+                            </w:r>
+                            <w:r>
+                              <w:rPr>
+                                <w:rFonts w:ascii="Times New Roman" w:eastAsia="Times New Roman" w:hAnsi="Times New Roman" w:cs="Times New Roman"/>
+                                <w:sz w:val="24"/>
+                                <w:szCs w:val="24"/>
+                              </w:rPr>
+                              <w:t>T</w:t>
+                            </w:r>
+                            <w:r>
+                              <w:rPr>
+                                <w:rFonts w:ascii="Times New Roman" w:eastAsia="Times New Roman" w:hAnsi="Times New Roman" w:cs="Times New Roman"/>
+                                <w:sz w:val="24"/>
+                                <w:szCs w:val="24"/>
+                                <w:lang w:val="ru-RU"/>
+                              </w:rPr>
+                              <w:t>21:00:00.000</w:t>
+                            </w:r>
+                            <w:r>
+                              <w:rPr>
+                                <w:rFonts w:ascii="Times New Roman" w:eastAsia="Times New Roman" w:hAnsi="Times New Roman" w:cs="Times New Roman"/>
+                                <w:sz w:val="24"/>
+                                <w:szCs w:val="24"/>
+                              </w:rPr>
+                              <w:t>Z</w:t>
+                            </w:r>
+                            <w:r>
+                              <w:rPr>
+                                <w:rFonts w:ascii="Times New Roman" w:eastAsia="Times New Roman" w:hAnsi="Times New Roman" w:cs="Times New Roman"/>
+                                <w:sz w:val="24"/>
+                                <w:szCs w:val="24"/>
+                                <w:lang w:val="ru-RU"/>
+                              </w:rPr>
+                              <w:t xml:space="preserve">"). </w:t>
+                            </w:r>
+                            <w:r>
+                              <w:rPr>
+                                <w:rFonts w:ascii="Times New Roman" w:eastAsia="Times New Roman" w:hAnsi="Times New Roman" w:cs="Times New Roman"/>
+                                <w:sz w:val="24"/>
+                                <w:szCs w:val="24"/>
+                              </w:rPr>
+                              <w:t>T</w:t>
+                            </w:r>
+                            <w:r>
+                              <w:rPr>
+                                <w:rFonts w:ascii="Times New Roman" w:eastAsia="Times New Roman" w:hAnsi="Times New Roman" w:cs="Times New Roman"/>
+                                <w:sz w:val="24"/>
+                                <w:szCs w:val="24"/>
+                                <w:lang w:val="ru-RU"/>
+                              </w:rPr>
+                              <w:t xml:space="preserve"> — разделитель дата/время; </w:t>
+                            </w:r>
+                            <w:r>
+                              <w:rPr>
+                                <w:rFonts w:ascii="Times New Roman" w:eastAsia="Times New Roman" w:hAnsi="Times New Roman" w:cs="Times New Roman"/>
+                                <w:sz w:val="24"/>
+                                <w:szCs w:val="24"/>
+                              </w:rPr>
+                              <w:t>Z</w:t>
+                            </w:r>
+                            <w:r>
+                              <w:rPr>
+                                <w:rFonts w:ascii="Times New Roman" w:eastAsia="Times New Roman" w:hAnsi="Times New Roman" w:cs="Times New Roman"/>
+                                <w:sz w:val="24"/>
+                                <w:szCs w:val="24"/>
+                                <w:lang w:val="ru-RU"/>
+                              </w:rPr>
+                              <w:t xml:space="preserve"> — </w:t>
+                            </w:r>
+                            <w:r>
+                              <w:rPr>
+                                <w:rFonts w:ascii="Times New Roman" w:eastAsia="Times New Roman" w:hAnsi="Times New Roman" w:cs="Times New Roman"/>
+                                <w:sz w:val="24"/>
+                                <w:szCs w:val="24"/>
+                              </w:rPr>
+                              <w:t>Zulu</w:t>
+                            </w:r>
+                            <w:r>
+                              <w:rPr>
+                                <w:rFonts w:ascii="Times New Roman" w:eastAsia="Times New Roman" w:hAnsi="Times New Roman" w:cs="Times New Roman"/>
+                                <w:sz w:val="24"/>
+                                <w:szCs w:val="24"/>
+                                <w:lang w:val="ru-RU"/>
+                              </w:rPr>
+                              <w:t>/</w:t>
+                            </w:r>
+                            <w:r>
+                              <w:rPr>
+                                <w:rFonts w:ascii="Times New Roman" w:eastAsia="Times New Roman" w:hAnsi="Times New Roman" w:cs="Times New Roman"/>
+                                <w:sz w:val="24"/>
+                                <w:szCs w:val="24"/>
+                              </w:rPr>
+                              <w:t>UTC</w:t>
+                            </w:r>
+                            <w:r>
+                              <w:rPr>
+                                <w:rFonts w:ascii="Times New Roman" w:eastAsia="Times New Roman" w:hAnsi="Times New Roman" w:cs="Times New Roman"/>
+                                <w:sz w:val="24"/>
+                                <w:szCs w:val="24"/>
+                                <w:lang w:val="ru-RU"/>
+                              </w:rPr>
+                              <w:t xml:space="preserve">+0. Разница </w:t>
+                            </w:r>
+                            <w:r>
+                              <w:rPr>
+                                <w:rFonts w:ascii="Times New Roman" w:eastAsia="Times New Roman" w:hAnsi="Times New Roman" w:cs="Times New Roman"/>
+                                <w:sz w:val="24"/>
+                                <w:szCs w:val="24"/>
+                              </w:rPr>
+                              <w:t>CodePen</w:t>
+                            </w:r>
+                            <w:r>
+                              <w:rPr>
+                                <w:rFonts w:ascii="Times New Roman" w:eastAsia="Times New Roman" w:hAnsi="Times New Roman" w:cs="Times New Roman"/>
+                                <w:sz w:val="24"/>
+                                <w:szCs w:val="24"/>
+                                <w:lang w:val="ru-RU"/>
+                              </w:rPr>
+                              <w:t xml:space="preserve">/локаль — от </w:t>
+                            </w:r>
+                            <w:r>
+                              <w:rPr>
+                                <w:rFonts w:ascii="Times New Roman" w:eastAsia="Times New Roman" w:hAnsi="Times New Roman" w:cs="Times New Roman"/>
+                                <w:sz w:val="24"/>
+                                <w:szCs w:val="24"/>
+                              </w:rPr>
+                              <w:t>DevTools</w:t>
+                            </w:r>
+                            <w:r>
+                              <w:rPr>
+                                <w:rFonts w:ascii="Times New Roman" w:eastAsia="Times New Roman" w:hAnsi="Times New Roman" w:cs="Times New Roman"/>
+                                <w:sz w:val="24"/>
+                                <w:szCs w:val="24"/>
+                                <w:lang w:val="ru-RU"/>
+                              </w:rPr>
+                              <w:t xml:space="preserve"> (расширение/версия). </w:t>
+                            </w:r>
+                          </w:p>
+                          <w:p>
+                            <w:pPr>
+                              <w:spacing w:after="0" w:line="240" w:lineRule="auto"/>
+                              <w:rPr>
+                                <w:rFonts w:ascii="Times New Roman" w:eastAsia="Times New Roman" w:hAnsi="Times New Roman" w:cs="Times New Roman"/>
+                                <w:sz w:val="24"/>
+                                <w:szCs w:val="24"/>
+                              </w:rPr>
+                            </w:pPr>
+                            <w:r>
+                              <w:rPr>
+                                <w:rFonts w:ascii="Times New Roman" w:eastAsia="Times New Roman" w:hAnsi="Symbol" w:cs="Times New Roman"/>
+                                <w:sz w:val="24"/>
+                                <w:szCs w:val="24"/>
+                              </w:rPr>
+                              <w:t></w:t>
+                            </w:r>
+                            <w:r>
+                              <w:rPr>
+                                <w:rFonts w:ascii="Times New Roman" w:eastAsia="Times New Roman" w:hAnsi="Times New Roman" w:cs="Times New Roman"/>
+                                <w:sz w:val="24"/>
+                                <w:szCs w:val="24"/>
+                              </w:rPr>
+                              <w:t xml:space="preserve">  </w:t>
+                            </w:r>
+                            <w:r>
+                              <w:rPr>
+                                <w:rFonts w:ascii="Times New Roman" w:eastAsia="Times New Roman" w:hAnsi="Times New Roman" w:cs="Times New Roman"/>
+                                <w:b/>
+                                <w:bCs/>
+                                <w:sz w:val="24"/>
+                                <w:szCs w:val="24"/>
+                              </w:rPr>
+                              <w:t>Кодовые нюансы</w:t>
+                            </w:r>
+                            <w:r>
+                              <w:rPr>
+                                <w:rFonts w:ascii="Times New Roman" w:eastAsia="Times New Roman" w:hAnsi="Times New Roman" w:cs="Times New Roman"/>
+                                <w:sz w:val="24"/>
+                                <w:szCs w:val="24"/>
+                              </w:rPr>
+                              <w:t xml:space="preserve">: date2 - date1 = мс (без getTime()); new Date() ≡ new Date(Date.now()). Для +дней: new Date(date.getTime() + days * 86400000). </w:t>
+                            </w:r>
+                          </w:p>
+                          <w:p>
+                            <w:pPr>
+                              <w:spacing w:after="0" w:line="240" w:lineRule="auto"/>
+                              <w:rPr>
+                                <w:rFonts w:ascii="Times New Roman" w:eastAsia="Times New Roman" w:hAnsi="Times New Roman" w:cs="Times New Roman"/>
+                                <w:sz w:val="24"/>
+                                <w:szCs w:val="24"/>
+                              </w:rPr>
+                            </w:pPr>
+                            <w:r>
+                              <w:rPr>
+                                <w:rFonts w:ascii="Times New Roman" w:eastAsia="Times New Roman" w:hAnsi="Symbol" w:cs="Times New Roman"/>
+                                <w:sz w:val="24"/>
+                                <w:szCs w:val="24"/>
+                              </w:rPr>
+                              <w:t></w:t>
+                            </w:r>
+                            <w:r>
+                              <w:rPr>
+                                <w:rFonts w:ascii="Times New Roman" w:eastAsia="Times New Roman" w:hAnsi="Times New Roman" w:cs="Times New Roman"/>
+                                <w:sz w:val="24"/>
+                                <w:szCs w:val="24"/>
+                              </w:rPr>
+                              <w:t xml:space="preserve">  </w:t>
+                            </w:r>
+                            <w:r>
+                              <w:rPr>
+                                <w:rFonts w:ascii="Times New Roman" w:eastAsia="Times New Roman" w:hAnsi="Times New Roman" w:cs="Times New Roman"/>
+                                <w:b/>
+                                <w:bCs/>
+                                <w:sz w:val="24"/>
+                                <w:szCs w:val="24"/>
+                              </w:rPr>
+                              <w:t>Сравнения</w:t>
+                            </w:r>
+                            <w:r>
+                              <w:rPr>
+                                <w:rFonts w:ascii="Times New Roman" w:eastAsia="Times New Roman" w:hAnsi="Times New Roman" w:cs="Times New Roman"/>
+                                <w:sz w:val="24"/>
+                                <w:szCs w:val="24"/>
+                              </w:rPr>
+                              <w:t xml:space="preserve">: JS Date — не топ (mutable, слабые пояса; лучше date-fns). Аналоги: Python datetime (immutable), Java java.time (эталон). Везде есть (кроме минималистичных ЯП). </w:t>
+                            </w:r>
+                          </w:p>
+                          <w:p>
+                            <w:pPr>
+                              <w:spacing w:after="0" w:line="240" w:lineRule="auto"/>
                               <w:ind w:left="142"/>
                               <w:rPr>
                                 <w:rFonts w:ascii="inherit" w:eastAsia="Times New Roman" w:hAnsi="inherit" w:cs="Calibri"/>
@@ -65,6 +1133,40 @@
                                 <w:lang w:val="ru-RU"/>
                               </w:rPr>
                             </w:pPr>
+                            <w:r>
+                              <w:rPr>
+                                <w:rFonts w:ascii="Times New Roman" w:eastAsia="Times New Roman" w:hAnsi="Symbol" w:cs="Times New Roman"/>
+                                <w:sz w:val="24"/>
+                                <w:szCs w:val="24"/>
+                              </w:rPr>
+                              <w:t></w:t>
+                            </w:r>
+                            <w:r>
+                              <w:rPr>
+                                <w:rFonts w:ascii="Times New Roman" w:eastAsia="Times New Roman" w:hAnsi="Times New Roman" w:cs="Times New Roman"/>
+                                <w:sz w:val="24"/>
+                                <w:szCs w:val="24"/>
+                              </w:rPr>
+                              <w:t xml:space="preserve">  </w:t>
+                            </w:r>
+                            <w:r>
+                              <w:rPr>
+                                <w:rFonts w:ascii="Times New Roman" w:eastAsia="Times New Roman" w:hAnsi="Times New Roman" w:cs="Times New Roman"/>
+                                <w:b/>
+                                <w:bCs/>
+                                <w:sz w:val="24"/>
+                                <w:szCs w:val="24"/>
+                              </w:rPr>
+                              <w:t>Аналогии для памяти</w:t>
+                            </w:r>
+                            <w:r>
+                              <w:rPr>
+                                <w:rFonts w:ascii="Times New Roman" w:eastAsia="Times New Roman" w:hAnsi="Times New Roman" w:cs="Times New Roman"/>
+                                <w:sz w:val="24"/>
+                                <w:szCs w:val="24"/>
+                              </w:rPr>
+                              <w:t>: Строка = "сжигаемая бумажка" (хрупкая для планов); объект = "часы" (динамика, надёжность).</w:t>
+                            </w:r>
                           </w:p>
                         </w:txbxContent>
                       </wps:txbx>
@@ -89,12 +1191,1080 @@
                 <v:stroke joinstyle="miter"/>
                 <v:path gradientshapeok="t" o:connecttype="rect"/>
               </v:shapetype>
-              <v:shape id="Text Box 2" o:spid="_x0000_s1026" type="#_x0000_t202" style="position:absolute;margin-left:452.15pt;margin-top:-36.3pt;width:220.55pt;height:929.7pt;z-index:251663360;visibility:visible;mso-wrap-style:square;mso-width-percent:0;mso-height-percent:0;mso-wrap-distance-left:9pt;mso-wrap-distance-top:3.6pt;mso-wrap-distance-right:9pt;mso-wrap-distance-bottom:3.6pt;mso-position-horizontal:absolute;mso-position-horizontal-relative:text;mso-position-vertical:absolute;mso-position-vertical-relative:text;mso-width-percent:0;mso-height-percent:0;mso-width-relative:margin;mso-height-relative:margin;v-text-anchor:top" o:gfxdata="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">
+              <v:shape id="Text Box 2" o:spid="_x0000_s1026" type="#_x0000_t202" style="position:absolute;margin-left:403.3pt;margin-top:-36.35pt;width:339.6pt;height:414.8pt;z-index:251663360;visibility:visible;mso-wrap-style:square;mso-width-percent:0;mso-height-percent:0;mso-wrap-distance-left:9pt;mso-wrap-distance-top:3.6pt;mso-wrap-distance-right:9pt;mso-wrap-distance-bottom:3.6pt;mso-position-horizontal:absolute;mso-position-horizontal-relative:text;mso-position-vertical:absolute;mso-position-vertical-relative:text;mso-width-percent:0;mso-height-percent:0;mso-width-relative:margin;mso-height-relative:margin;v-text-anchor:top" o:gfxdata="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">
                 <v:textbox>
                   <w:txbxContent>
                     <w:p>
                       <w:pPr>
                         <w:spacing w:after="0" w:line="240" w:lineRule="auto"/>
+                        <w:rPr>
+                          <w:rFonts w:ascii="Times New Roman" w:eastAsia="Times New Roman" w:hAnsi="Times New Roman" w:cs="Times New Roman"/>
+                          <w:sz w:val="24"/>
+                          <w:szCs w:val="24"/>
+                          <w:lang w:val="ru-RU"/>
+                        </w:rPr>
+                      </w:pPr>
+                      <w:r>
+                        <w:rPr>
+                          <w:rFonts w:ascii="Times New Roman" w:eastAsia="Times New Roman" w:hAnsi="Symbol" w:cs="Times New Roman"/>
+                          <w:sz w:val="24"/>
+                          <w:szCs w:val="24"/>
+                        </w:rPr>
+                        <w:t></w:t>
+                      </w:r>
+                      <w:r>
+                        <w:rPr>
+                          <w:rFonts w:ascii="Times New Roman" w:eastAsia="Times New Roman" w:hAnsi="Times New Roman" w:cs="Times New Roman"/>
+                          <w:sz w:val="24"/>
+                          <w:szCs w:val="24"/>
+                          <w:lang w:val="ru-RU"/>
+                        </w:rPr>
+                        <w:t xml:space="preserve">  </w:t>
+                      </w:r>
+                      <w:r>
+                        <w:rPr>
+                          <w:rFonts w:ascii="Times New Roman" w:eastAsia="Times New Roman" w:hAnsi="Times New Roman" w:cs="Times New Roman"/>
+                          <w:b/>
+                          <w:bCs/>
+                          <w:sz w:val="24"/>
+                          <w:szCs w:val="24"/>
+                          <w:lang w:val="ru-RU"/>
+                        </w:rPr>
+                        <w:t xml:space="preserve">Смысл объекта </w:t>
+                      </w:r>
+                      <w:r>
+                        <w:rPr>
+                          <w:rFonts w:ascii="Times New Roman" w:eastAsia="Times New Roman" w:hAnsi="Times New Roman" w:cs="Times New Roman"/>
+                          <w:b/>
+                          <w:bCs/>
+                          <w:sz w:val="24"/>
+                          <w:szCs w:val="24"/>
+                        </w:rPr>
+                        <w:t>Date</w:t>
+                      </w:r>
+                      <w:r>
+                        <w:rPr>
+                          <w:rFonts w:ascii="Times New Roman" w:eastAsia="Times New Roman" w:hAnsi="Times New Roman" w:cs="Times New Roman"/>
+                          <w:sz w:val="24"/>
+                          <w:szCs w:val="24"/>
+                          <w:lang w:val="ru-RU"/>
+                        </w:rPr>
+                        <w:t xml:space="preserve">: Не строка (статичная "наклейка"), а "коробка с инструментами" или "часы с будильником" — хранит </w:t>
+                      </w:r>
+                      <w:r>
+                        <w:rPr>
+                          <w:rFonts w:ascii="Times New Roman" w:eastAsia="Times New Roman" w:hAnsi="Times New Roman" w:cs="Times New Roman"/>
+                          <w:sz w:val="24"/>
+                          <w:szCs w:val="24"/>
+                        </w:rPr>
+                        <w:t>UTC</w:t>
+                      </w:r>
+                      <w:r>
+                        <w:rPr>
+                          <w:rFonts w:ascii="Times New Roman" w:eastAsia="Times New Roman" w:hAnsi="Times New Roman" w:cs="Times New Roman"/>
+                          <w:sz w:val="24"/>
+                          <w:szCs w:val="24"/>
+                          <w:lang w:val="ru-RU"/>
+                        </w:rPr>
+                        <w:t>-</w:t>
+                      </w:r>
+                      <w:r>
+                        <w:rPr>
+                          <w:rFonts w:ascii="Times New Roman" w:eastAsia="Times New Roman" w:hAnsi="Times New Roman" w:cs="Times New Roman"/>
+                          <w:sz w:val="24"/>
+                          <w:szCs w:val="24"/>
+                        </w:rPr>
+                        <w:t>timestamp</w:t>
+                      </w:r>
+                      <w:r>
+                        <w:rPr>
+                          <w:rFonts w:ascii="Times New Roman" w:eastAsia="Times New Roman" w:hAnsi="Times New Roman" w:cs="Times New Roman"/>
+                          <w:sz w:val="24"/>
+                          <w:szCs w:val="24"/>
+                          <w:lang w:val="ru-RU"/>
+                        </w:rPr>
+                        <w:t xml:space="preserve"> (мс от 1.01.1970), с методами для </w:t>
+                      </w:r>
+                      <w:r>
+                        <w:rPr>
+                          <w:rFonts w:ascii="Times New Roman" w:eastAsia="Times New Roman" w:hAnsi="Times New Roman" w:cs="Times New Roman"/>
+                          <w:sz w:val="24"/>
+                          <w:szCs w:val="24"/>
+                        </w:rPr>
+                        <w:t>get</w:t>
+                      </w:r>
+                      <w:r>
+                        <w:rPr>
+                          <w:rFonts w:ascii="Times New Roman" w:eastAsia="Times New Roman" w:hAnsi="Times New Roman" w:cs="Times New Roman"/>
+                          <w:sz w:val="24"/>
+                          <w:szCs w:val="24"/>
+                          <w:lang w:val="ru-RU"/>
+                        </w:rPr>
+                        <w:t>/</w:t>
+                      </w:r>
+                      <w:r>
+                        <w:rPr>
+                          <w:rFonts w:ascii="Times New Roman" w:eastAsia="Times New Roman" w:hAnsi="Times New Roman" w:cs="Times New Roman"/>
+                          <w:sz w:val="24"/>
+                          <w:szCs w:val="24"/>
+                        </w:rPr>
+                        <w:t>set</w:t>
+                      </w:r>
+                      <w:r>
+                        <w:rPr>
+                          <w:rFonts w:ascii="Times New Roman" w:eastAsia="Times New Roman" w:hAnsi="Times New Roman" w:cs="Times New Roman"/>
+                          <w:sz w:val="24"/>
+                          <w:szCs w:val="24"/>
+                          <w:lang w:val="ru-RU"/>
+                        </w:rPr>
+                        <w:t xml:space="preserve"> (компоненты: год/месяц/день/часы), арифметики (разница в мс), форматирования (</w:t>
+                      </w:r>
+                      <w:r>
+                        <w:rPr>
+                          <w:rFonts w:ascii="Times New Roman" w:eastAsia="Times New Roman" w:hAnsi="Times New Roman" w:cs="Times New Roman"/>
+                          <w:sz w:val="24"/>
+                          <w:szCs w:val="24"/>
+                        </w:rPr>
+                        <w:t>toISOString</w:t>
+                      </w:r>
+                      <w:r>
+                        <w:rPr>
+                          <w:rFonts w:ascii="Times New Roman" w:eastAsia="Times New Roman" w:hAnsi="Times New Roman" w:cs="Times New Roman"/>
+                          <w:sz w:val="24"/>
+                          <w:szCs w:val="24"/>
+                          <w:lang w:val="ru-RU"/>
+                        </w:rPr>
+                        <w:t xml:space="preserve">() для </w:t>
+                      </w:r>
+                      <w:r>
+                        <w:rPr>
+                          <w:rFonts w:ascii="Times New Roman" w:eastAsia="Times New Roman" w:hAnsi="Times New Roman" w:cs="Times New Roman"/>
+                          <w:sz w:val="24"/>
+                          <w:szCs w:val="24"/>
+                        </w:rPr>
+                        <w:t>UTC</w:t>
+                      </w:r>
+                      <w:r>
+                        <w:rPr>
+                          <w:rFonts w:ascii="Times New Roman" w:eastAsia="Times New Roman" w:hAnsi="Times New Roman" w:cs="Times New Roman"/>
+                          <w:sz w:val="24"/>
+                          <w:szCs w:val="24"/>
+                          <w:lang w:val="ru-RU"/>
+                        </w:rPr>
+                        <w:t xml:space="preserve">, </w:t>
+                      </w:r>
+                      <w:r>
+                        <w:rPr>
+                          <w:rFonts w:ascii="Times New Roman" w:eastAsia="Times New Roman" w:hAnsi="Times New Roman" w:cs="Times New Roman"/>
+                          <w:sz w:val="24"/>
+                          <w:szCs w:val="24"/>
+                        </w:rPr>
+                        <w:t>toString</w:t>
+                      </w:r>
+                      <w:r>
+                        <w:rPr>
+                          <w:rFonts w:ascii="Times New Roman" w:eastAsia="Times New Roman" w:hAnsi="Times New Roman" w:cs="Times New Roman"/>
+                          <w:sz w:val="24"/>
+                          <w:szCs w:val="24"/>
+                          <w:lang w:val="ru-RU"/>
+                        </w:rPr>
+                        <w:t xml:space="preserve">() для локали). Упрощает расчёты (добавление дней, валидацию), избегает багов с високосными/поясами. </w:t>
+                      </w:r>
+                    </w:p>
+                    <w:p>
+                      <w:pPr>
+                        <w:spacing w:after="0" w:line="240" w:lineRule="auto"/>
+                        <w:rPr>
+                          <w:rFonts w:ascii="Times New Roman" w:eastAsia="Times New Roman" w:hAnsi="Times New Roman" w:cs="Times New Roman"/>
+                          <w:sz w:val="24"/>
+                          <w:szCs w:val="24"/>
+                          <w:lang w:val="ru-RU"/>
+                        </w:rPr>
+                      </w:pPr>
+                      <w:r>
+                        <w:rPr>
+                          <w:rFonts w:ascii="Times New Roman" w:eastAsia="Times New Roman" w:hAnsi="Symbol" w:cs="Times New Roman"/>
+                          <w:sz w:val="24"/>
+                          <w:szCs w:val="24"/>
+                        </w:rPr>
+                        <w:t></w:t>
+                      </w:r>
+                      <w:r>
+                        <w:rPr>
+                          <w:rFonts w:ascii="Times New Roman" w:eastAsia="Times New Roman" w:hAnsi="Times New Roman" w:cs="Times New Roman"/>
+                          <w:sz w:val="24"/>
+                          <w:szCs w:val="24"/>
+                          <w:lang w:val="ru-RU"/>
+                        </w:rPr>
+                        <w:t xml:space="preserve">  </w:t>
+                      </w:r>
+                      <w:r>
+                        <w:rPr>
+                          <w:rFonts w:ascii="Times New Roman" w:eastAsia="Times New Roman" w:hAnsi="Times New Roman" w:cs="Times New Roman"/>
+                          <w:b/>
+                          <w:bCs/>
+                          <w:sz w:val="24"/>
+                          <w:szCs w:val="24"/>
+                        </w:rPr>
+                        <w:t>Set</w:t>
+                      </w:r>
+                      <w:r>
+                        <w:rPr>
+                          <w:rFonts w:ascii="Times New Roman" w:eastAsia="Times New Roman" w:hAnsi="Times New Roman" w:cs="Times New Roman"/>
+                          <w:b/>
+                          <w:bCs/>
+                          <w:sz w:val="24"/>
+                          <w:szCs w:val="24"/>
+                          <w:lang w:val="ru-RU"/>
+                        </w:rPr>
+                        <w:t>-методы</w:t>
+                      </w:r>
+                      <w:r>
+                        <w:rPr>
+                          <w:rFonts w:ascii="Times New Roman" w:eastAsia="Times New Roman" w:hAnsi="Times New Roman" w:cs="Times New Roman"/>
+                          <w:sz w:val="24"/>
+                          <w:szCs w:val="24"/>
+                          <w:lang w:val="ru-RU"/>
+                        </w:rPr>
+                        <w:t xml:space="preserve">: Для модификации </w:t>
+                      </w:r>
+                      <w:r>
+                        <w:rPr>
+                          <w:rFonts w:ascii="Times New Roman" w:eastAsia="Times New Roman" w:hAnsi="Times New Roman" w:cs="Times New Roman"/>
+                          <w:sz w:val="24"/>
+                          <w:szCs w:val="24"/>
+                        </w:rPr>
+                        <w:t>in</w:t>
+                      </w:r>
+                      <w:r>
+                        <w:rPr>
+                          <w:rFonts w:ascii="Times New Roman" w:eastAsia="Times New Roman" w:hAnsi="Times New Roman" w:cs="Times New Roman"/>
+                          <w:sz w:val="24"/>
+                          <w:szCs w:val="24"/>
+                          <w:lang w:val="ru-RU"/>
+                        </w:rPr>
+                        <w:t>-</w:t>
+                      </w:r>
+                      <w:r>
+                        <w:rPr>
+                          <w:rFonts w:ascii="Times New Roman" w:eastAsia="Times New Roman" w:hAnsi="Times New Roman" w:cs="Times New Roman"/>
+                          <w:sz w:val="24"/>
+                          <w:szCs w:val="24"/>
+                        </w:rPr>
+                        <w:t>place</w:t>
+                      </w:r>
+                      <w:r>
+                        <w:rPr>
+                          <w:rFonts w:ascii="Times New Roman" w:eastAsia="Times New Roman" w:hAnsi="Times New Roman" w:cs="Times New Roman"/>
+                          <w:sz w:val="24"/>
+                          <w:szCs w:val="24"/>
+                          <w:lang w:val="ru-RU"/>
+                        </w:rPr>
+                        <w:t xml:space="preserve"> (напр. </w:t>
+                      </w:r>
+                      <w:r>
+                        <w:rPr>
+                          <w:rFonts w:ascii="Times New Roman" w:eastAsia="Times New Roman" w:hAnsi="Times New Roman" w:cs="Times New Roman"/>
+                          <w:sz w:val="24"/>
+                          <w:szCs w:val="24"/>
+                        </w:rPr>
+                        <w:t>setDate</w:t>
+                      </w:r>
+                      <w:r>
+                        <w:rPr>
+                          <w:rFonts w:ascii="Times New Roman" w:eastAsia="Times New Roman" w:hAnsi="Times New Roman" w:cs="Times New Roman"/>
+                          <w:sz w:val="24"/>
+                          <w:szCs w:val="24"/>
+                          <w:lang w:val="ru-RU"/>
+                        </w:rPr>
+                        <w:t xml:space="preserve">() +5 для доставки заказа: </w:t>
+                      </w:r>
+                      <w:r>
+                        <w:rPr>
+                          <w:rFonts w:ascii="Times New Roman" w:eastAsia="Times New Roman" w:hAnsi="Times New Roman" w:cs="Times New Roman"/>
+                          <w:sz w:val="24"/>
+                          <w:szCs w:val="24"/>
+                        </w:rPr>
+                        <w:t>new</w:t>
+                      </w:r>
+                      <w:r>
+                        <w:rPr>
+                          <w:rFonts w:ascii="Times New Roman" w:eastAsia="Times New Roman" w:hAnsi="Times New Roman" w:cs="Times New Roman"/>
+                          <w:sz w:val="24"/>
+                          <w:szCs w:val="24"/>
+                          <w:lang w:val="ru-RU"/>
+                        </w:rPr>
+                        <w:t xml:space="preserve"> </w:t>
+                      </w:r>
+                      <w:r>
+                        <w:rPr>
+                          <w:rFonts w:ascii="Times New Roman" w:eastAsia="Times New Roman" w:hAnsi="Times New Roman" w:cs="Times New Roman"/>
+                          <w:sz w:val="24"/>
+                          <w:szCs w:val="24"/>
+                        </w:rPr>
+                        <w:t>Date</w:t>
+                      </w:r>
+                      <w:r>
+                        <w:rPr>
+                          <w:rFonts w:ascii="Times New Roman" w:eastAsia="Times New Roman" w:hAnsi="Times New Roman" w:cs="Times New Roman"/>
+                          <w:sz w:val="24"/>
+                          <w:szCs w:val="24"/>
+                          <w:lang w:val="ru-RU"/>
+                        </w:rPr>
+                        <w:t>(</w:t>
+                      </w:r>
+                      <w:r>
+                        <w:rPr>
+                          <w:rFonts w:ascii="Times New Roman" w:eastAsia="Times New Roman" w:hAnsi="Times New Roman" w:cs="Times New Roman"/>
+                          <w:sz w:val="24"/>
+                          <w:szCs w:val="24"/>
+                        </w:rPr>
+                        <w:t>order</w:t>
+                      </w:r>
+                      <w:r>
+                        <w:rPr>
+                          <w:rFonts w:ascii="Times New Roman" w:eastAsia="Times New Roman" w:hAnsi="Times New Roman" w:cs="Times New Roman"/>
+                          <w:sz w:val="24"/>
+                          <w:szCs w:val="24"/>
+                          <w:lang w:val="ru-RU"/>
+                        </w:rPr>
+                        <w:t>).</w:t>
+                      </w:r>
+                      <w:r>
+                        <w:rPr>
+                          <w:rFonts w:ascii="Times New Roman" w:eastAsia="Times New Roman" w:hAnsi="Times New Roman" w:cs="Times New Roman"/>
+                          <w:sz w:val="24"/>
+                          <w:szCs w:val="24"/>
+                        </w:rPr>
+                        <w:t>setDate</w:t>
+                      </w:r>
+                      <w:r>
+                        <w:rPr>
+                          <w:rFonts w:ascii="Times New Roman" w:eastAsia="Times New Roman" w:hAnsi="Times New Roman" w:cs="Times New Roman"/>
+                          <w:sz w:val="24"/>
+                          <w:szCs w:val="24"/>
+                          <w:lang w:val="ru-RU"/>
+                        </w:rPr>
+                        <w:t>(</w:t>
+                      </w:r>
+                      <w:r>
+                        <w:rPr>
+                          <w:rFonts w:ascii="Times New Roman" w:eastAsia="Times New Roman" w:hAnsi="Times New Roman" w:cs="Times New Roman"/>
+                          <w:sz w:val="24"/>
+                          <w:szCs w:val="24"/>
+                        </w:rPr>
+                        <w:t>order</w:t>
+                      </w:r>
+                      <w:r>
+                        <w:rPr>
+                          <w:rFonts w:ascii="Times New Roman" w:eastAsia="Times New Roman" w:hAnsi="Times New Roman" w:cs="Times New Roman"/>
+                          <w:sz w:val="24"/>
+                          <w:szCs w:val="24"/>
+                          <w:lang w:val="ru-RU"/>
+                        </w:rPr>
+                        <w:t>.</w:t>
+                      </w:r>
+                      <w:r>
+                        <w:rPr>
+                          <w:rFonts w:ascii="Times New Roman" w:eastAsia="Times New Roman" w:hAnsi="Times New Roman" w:cs="Times New Roman"/>
+                          <w:sz w:val="24"/>
+                          <w:szCs w:val="24"/>
+                        </w:rPr>
+                        <w:t>getDate</w:t>
+                      </w:r>
+                      <w:r>
+                        <w:rPr>
+                          <w:rFonts w:ascii="Times New Roman" w:eastAsia="Times New Roman" w:hAnsi="Times New Roman" w:cs="Times New Roman"/>
+                          <w:sz w:val="24"/>
+                          <w:szCs w:val="24"/>
+                          <w:lang w:val="ru-RU"/>
+                        </w:rPr>
+                        <w:t xml:space="preserve">() +5)). Без них — ручные расчёты или пересоздание. </w:t>
+                      </w:r>
+                    </w:p>
+                    <w:p>
+                      <w:pPr>
+                        <w:spacing w:after="0" w:line="240" w:lineRule="auto"/>
+                        <w:rPr>
+                          <w:rFonts w:ascii="Times New Roman" w:eastAsia="Times New Roman" w:hAnsi="Times New Roman" w:cs="Times New Roman"/>
+                          <w:sz w:val="24"/>
+                          <w:szCs w:val="24"/>
+                          <w:lang w:val="ru-RU"/>
+                        </w:rPr>
+                      </w:pPr>
+                      <w:r>
+                        <w:rPr>
+                          <w:rFonts w:ascii="Times New Roman" w:eastAsia="Times New Roman" w:hAnsi="Symbol" w:cs="Times New Roman"/>
+                          <w:sz w:val="24"/>
+                          <w:szCs w:val="24"/>
+                        </w:rPr>
+                        <w:t></w:t>
+                      </w:r>
+                      <w:r>
+                        <w:rPr>
+                          <w:rFonts w:ascii="Times New Roman" w:eastAsia="Times New Roman" w:hAnsi="Times New Roman" w:cs="Times New Roman"/>
+                          <w:sz w:val="24"/>
+                          <w:szCs w:val="24"/>
+                          <w:lang w:val="ru-RU"/>
+                        </w:rPr>
+                        <w:t xml:space="preserve">  </w:t>
+                      </w:r>
+                      <w:r>
+                        <w:rPr>
+                          <w:rFonts w:ascii="Times New Roman" w:eastAsia="Times New Roman" w:hAnsi="Times New Roman" w:cs="Times New Roman"/>
+                          <w:b/>
+                          <w:bCs/>
+                          <w:sz w:val="24"/>
+                          <w:szCs w:val="24"/>
+                        </w:rPr>
+                        <w:t>Unix</w:t>
+                      </w:r>
+                      <w:r>
+                        <w:rPr>
+                          <w:rFonts w:ascii="Times New Roman" w:eastAsia="Times New Roman" w:hAnsi="Times New Roman" w:cs="Times New Roman"/>
+                          <w:b/>
+                          <w:bCs/>
+                          <w:sz w:val="24"/>
+                          <w:szCs w:val="24"/>
+                          <w:lang w:val="ru-RU"/>
+                        </w:rPr>
+                        <w:t xml:space="preserve"> </w:t>
+                      </w:r>
+                      <w:r>
+                        <w:rPr>
+                          <w:rFonts w:ascii="Times New Roman" w:eastAsia="Times New Roman" w:hAnsi="Times New Roman" w:cs="Times New Roman"/>
+                          <w:b/>
+                          <w:bCs/>
+                          <w:sz w:val="24"/>
+                          <w:szCs w:val="24"/>
+                        </w:rPr>
+                        <w:t>epoch</w:t>
+                      </w:r>
+                      <w:r>
+                        <w:rPr>
+                          <w:rFonts w:ascii="Times New Roman" w:eastAsia="Times New Roman" w:hAnsi="Times New Roman" w:cs="Times New Roman"/>
+                          <w:sz w:val="24"/>
+                          <w:szCs w:val="24"/>
+                          <w:lang w:val="ru-RU"/>
+                        </w:rPr>
+                        <w:t xml:space="preserve">: 1.01.1970 00:00 </w:t>
+                      </w:r>
+                      <w:r>
+                        <w:rPr>
+                          <w:rFonts w:ascii="Times New Roman" w:eastAsia="Times New Roman" w:hAnsi="Times New Roman" w:cs="Times New Roman"/>
+                          <w:sz w:val="24"/>
+                          <w:szCs w:val="24"/>
+                        </w:rPr>
+                        <w:t>UTC</w:t>
+                      </w:r>
+                      <w:r>
+                        <w:rPr>
+                          <w:rFonts w:ascii="Times New Roman" w:eastAsia="Times New Roman" w:hAnsi="Times New Roman" w:cs="Times New Roman"/>
+                          <w:sz w:val="24"/>
+                          <w:szCs w:val="24"/>
+                          <w:lang w:val="ru-RU"/>
+                        </w:rPr>
+                        <w:t xml:space="preserve"> (</w:t>
+                      </w:r>
+                      <w:r>
+                        <w:rPr>
+                          <w:rFonts w:ascii="Times New Roman" w:eastAsia="Times New Roman" w:hAnsi="Times New Roman" w:cs="Times New Roman"/>
+                          <w:sz w:val="24"/>
+                          <w:szCs w:val="24"/>
+                        </w:rPr>
+                        <w:t>GMT</w:t>
+                      </w:r>
+                      <w:r>
+                        <w:rPr>
+                          <w:rFonts w:ascii="Times New Roman" w:eastAsia="Times New Roman" w:hAnsi="Times New Roman" w:cs="Times New Roman"/>
+                          <w:sz w:val="24"/>
+                          <w:szCs w:val="24"/>
+                          <w:lang w:val="ru-RU"/>
+                        </w:rPr>
+                        <w:t>+0) — исторический выбор (</w:t>
+                      </w:r>
+                      <w:r>
+                        <w:rPr>
+                          <w:rFonts w:ascii="Times New Roman" w:eastAsia="Times New Roman" w:hAnsi="Times New Roman" w:cs="Times New Roman"/>
+                          <w:sz w:val="24"/>
+                          <w:szCs w:val="24"/>
+                        </w:rPr>
+                        <w:t>Unix</w:t>
+                      </w:r>
+                      <w:r>
+                        <w:rPr>
+                          <w:rFonts w:ascii="Times New Roman" w:eastAsia="Times New Roman" w:hAnsi="Times New Roman" w:cs="Times New Roman"/>
+                          <w:sz w:val="24"/>
+                          <w:szCs w:val="24"/>
+                          <w:lang w:val="ru-RU"/>
+                        </w:rPr>
+                        <w:t xml:space="preserve"> 1970-х, 32-бит до 2038). </w:t>
+                      </w:r>
+                      <w:r>
+                        <w:rPr>
+                          <w:rFonts w:ascii="Times New Roman" w:eastAsia="Times New Roman" w:hAnsi="Times New Roman" w:cs="Times New Roman"/>
+                          <w:sz w:val="24"/>
+                          <w:szCs w:val="24"/>
+                        </w:rPr>
+                        <w:t>UTC</w:t>
+                      </w:r>
+                      <w:r>
+                        <w:rPr>
+                          <w:rFonts w:ascii="Times New Roman" w:eastAsia="Times New Roman" w:hAnsi="Times New Roman" w:cs="Times New Roman"/>
+                          <w:sz w:val="24"/>
+                          <w:szCs w:val="24"/>
+                          <w:lang w:val="ru-RU"/>
+                        </w:rPr>
+                        <w:t xml:space="preserve"> — современный стандарт (атомные часы, без </w:t>
+                      </w:r>
+                      <w:r>
+                        <w:rPr>
+                          <w:rFonts w:ascii="Times New Roman" w:eastAsia="Times New Roman" w:hAnsi="Times New Roman" w:cs="Times New Roman"/>
+                          <w:sz w:val="24"/>
+                          <w:szCs w:val="24"/>
+                        </w:rPr>
+                        <w:t>DST</w:t>
+                      </w:r>
+                      <w:r>
+                        <w:rPr>
+                          <w:rFonts w:ascii="Times New Roman" w:eastAsia="Times New Roman" w:hAnsi="Times New Roman" w:cs="Times New Roman"/>
+                          <w:sz w:val="24"/>
+                          <w:szCs w:val="24"/>
+                          <w:lang w:val="ru-RU"/>
+                        </w:rPr>
+                        <w:t xml:space="preserve">), </w:t>
+                      </w:r>
+                      <w:r>
+                        <w:rPr>
+                          <w:rFonts w:ascii="Times New Roman" w:eastAsia="Times New Roman" w:hAnsi="Times New Roman" w:cs="Times New Roman"/>
+                          <w:sz w:val="24"/>
+                          <w:szCs w:val="24"/>
+                        </w:rPr>
+                        <w:t>GMT</w:t>
+                      </w:r>
+                      <w:r>
+                        <w:rPr>
+                          <w:rFonts w:ascii="Times New Roman" w:eastAsia="Times New Roman" w:hAnsi="Times New Roman" w:cs="Times New Roman"/>
+                          <w:sz w:val="24"/>
+                          <w:szCs w:val="24"/>
+                          <w:lang w:val="ru-RU"/>
+                        </w:rPr>
+                        <w:t xml:space="preserve"> — старый (солнечный, с </w:t>
+                      </w:r>
+                      <w:r>
+                        <w:rPr>
+                          <w:rFonts w:ascii="Times New Roman" w:eastAsia="Times New Roman" w:hAnsi="Times New Roman" w:cs="Times New Roman"/>
+                          <w:sz w:val="24"/>
+                          <w:szCs w:val="24"/>
+                        </w:rPr>
+                        <w:t>Zulu</w:t>
+                      </w:r>
+                      <w:r>
+                        <w:rPr>
+                          <w:rFonts w:ascii="Times New Roman" w:eastAsia="Times New Roman" w:hAnsi="Times New Roman" w:cs="Times New Roman"/>
+                          <w:sz w:val="24"/>
+                          <w:szCs w:val="24"/>
+                          <w:lang w:val="ru-RU"/>
+                        </w:rPr>
+                        <w:t>=</w:t>
+                      </w:r>
+                      <w:r>
+                        <w:rPr>
+                          <w:rFonts w:ascii="Times New Roman" w:eastAsia="Times New Roman" w:hAnsi="Times New Roman" w:cs="Times New Roman"/>
+                          <w:sz w:val="24"/>
+                          <w:szCs w:val="24"/>
+                        </w:rPr>
+                        <w:t>Z</w:t>
+                      </w:r>
+                      <w:r>
+                        <w:rPr>
+                          <w:rFonts w:ascii="Times New Roman" w:eastAsia="Times New Roman" w:hAnsi="Times New Roman" w:cs="Times New Roman"/>
+                          <w:sz w:val="24"/>
+                          <w:szCs w:val="24"/>
+                          <w:lang w:val="ru-RU"/>
+                        </w:rPr>
+                        <w:t xml:space="preserve"> для </w:t>
+                      </w:r>
+                      <w:r>
+                        <w:rPr>
+                          <w:rFonts w:ascii="Times New Roman" w:eastAsia="Times New Roman" w:hAnsi="Times New Roman" w:cs="Times New Roman"/>
+                          <w:sz w:val="24"/>
+                          <w:szCs w:val="24"/>
+                        </w:rPr>
+                        <w:t>UTC</w:t>
+                      </w:r>
+                      <w:r>
+                        <w:rPr>
+                          <w:rFonts w:ascii="Times New Roman" w:eastAsia="Times New Roman" w:hAnsi="Times New Roman" w:cs="Times New Roman"/>
+                          <w:sz w:val="24"/>
+                          <w:szCs w:val="24"/>
+                          <w:lang w:val="ru-RU"/>
+                        </w:rPr>
+                        <w:t xml:space="preserve">+0). </w:t>
+                      </w:r>
+                    </w:p>
+                    <w:p>
+                      <w:pPr>
+                        <w:spacing w:after="0" w:line="240" w:lineRule="auto"/>
+                        <w:rPr>
+                          <w:rFonts w:ascii="Times New Roman" w:eastAsia="Times New Roman" w:hAnsi="Times New Roman" w:cs="Times New Roman"/>
+                          <w:sz w:val="24"/>
+                          <w:szCs w:val="24"/>
+                          <w:lang w:val="ru-RU"/>
+                        </w:rPr>
+                      </w:pPr>
+                      <w:r>
+                        <w:rPr>
+                          <w:rFonts w:ascii="Times New Roman" w:eastAsia="Times New Roman" w:hAnsi="Symbol" w:cs="Times New Roman"/>
+                          <w:sz w:val="24"/>
+                          <w:szCs w:val="24"/>
+                        </w:rPr>
+                        <w:t></w:t>
+                      </w:r>
+                      <w:r>
+                        <w:rPr>
+                          <w:rFonts w:ascii="Times New Roman" w:eastAsia="Times New Roman" w:hAnsi="Times New Roman" w:cs="Times New Roman"/>
+                          <w:sz w:val="24"/>
+                          <w:szCs w:val="24"/>
+                          <w:lang w:val="ru-RU"/>
+                        </w:rPr>
+                        <w:t xml:space="preserve">  </w:t>
+                      </w:r>
+                      <w:r>
+                        <w:rPr>
+                          <w:rFonts w:ascii="Times New Roman" w:eastAsia="Times New Roman" w:hAnsi="Times New Roman" w:cs="Times New Roman"/>
+                          <w:b/>
+                          <w:bCs/>
+                          <w:sz w:val="24"/>
+                          <w:szCs w:val="24"/>
+                          <w:lang w:val="ru-RU"/>
+                        </w:rPr>
+                        <w:t>Вывод в консоли</w:t>
+                      </w:r>
+                      <w:r>
+                        <w:rPr>
+                          <w:rFonts w:ascii="Times New Roman" w:eastAsia="Times New Roman" w:hAnsi="Times New Roman" w:cs="Times New Roman"/>
+                          <w:sz w:val="24"/>
+                          <w:szCs w:val="24"/>
+                          <w:lang w:val="ru-RU"/>
+                        </w:rPr>
+                        <w:t xml:space="preserve">: </w:t>
+                      </w:r>
+                      <w:r>
+                        <w:rPr>
+                          <w:rFonts w:ascii="Times New Roman" w:eastAsia="Times New Roman" w:hAnsi="Times New Roman" w:cs="Times New Roman"/>
+                          <w:sz w:val="24"/>
+                          <w:szCs w:val="24"/>
+                        </w:rPr>
+                        <w:t>console</w:t>
+                      </w:r>
+                      <w:r>
+                        <w:rPr>
+                          <w:rFonts w:ascii="Times New Roman" w:eastAsia="Times New Roman" w:hAnsi="Times New Roman" w:cs="Times New Roman"/>
+                          <w:sz w:val="24"/>
+                          <w:szCs w:val="24"/>
+                          <w:lang w:val="ru-RU"/>
+                        </w:rPr>
+                        <w:t>.</w:t>
+                      </w:r>
+                      <w:r>
+                        <w:rPr>
+                          <w:rFonts w:ascii="Times New Roman" w:eastAsia="Times New Roman" w:hAnsi="Times New Roman" w:cs="Times New Roman"/>
+                          <w:sz w:val="24"/>
+                          <w:szCs w:val="24"/>
+                        </w:rPr>
+                        <w:t>log</w:t>
+                      </w:r>
+                      <w:r>
+                        <w:rPr>
+                          <w:rFonts w:ascii="Times New Roman" w:eastAsia="Times New Roman" w:hAnsi="Times New Roman" w:cs="Times New Roman"/>
+                          <w:sz w:val="24"/>
+                          <w:szCs w:val="24"/>
+                          <w:lang w:val="ru-RU"/>
+                        </w:rPr>
+                        <w:t>(</w:t>
+                      </w:r>
+                      <w:r>
+                        <w:rPr>
+                          <w:rFonts w:ascii="Times New Roman" w:eastAsia="Times New Roman" w:hAnsi="Times New Roman" w:cs="Times New Roman"/>
+                          <w:sz w:val="24"/>
+                          <w:szCs w:val="24"/>
+                        </w:rPr>
+                        <w:t>date</w:t>
+                      </w:r>
+                      <w:r>
+                        <w:rPr>
+                          <w:rFonts w:ascii="Times New Roman" w:eastAsia="Times New Roman" w:hAnsi="Times New Roman" w:cs="Times New Roman"/>
+                          <w:sz w:val="24"/>
+                          <w:szCs w:val="24"/>
+                          <w:lang w:val="ru-RU"/>
+                        </w:rPr>
+                        <w:t xml:space="preserve">) = </w:t>
+                      </w:r>
+                      <w:r>
+                        <w:rPr>
+                          <w:rFonts w:ascii="Times New Roman" w:eastAsia="Times New Roman" w:hAnsi="Times New Roman" w:cs="Times New Roman"/>
+                          <w:sz w:val="24"/>
+                          <w:szCs w:val="24"/>
+                        </w:rPr>
+                        <w:t>toString</w:t>
+                      </w:r>
+                      <w:r>
+                        <w:rPr>
+                          <w:rFonts w:ascii="Times New Roman" w:eastAsia="Times New Roman" w:hAnsi="Times New Roman" w:cs="Times New Roman"/>
+                          <w:sz w:val="24"/>
+                          <w:szCs w:val="24"/>
+                          <w:lang w:val="ru-RU"/>
+                        </w:rPr>
+                        <w:t>() (локаль: "</w:t>
+                      </w:r>
+                      <w:r>
+                        <w:rPr>
+                          <w:rFonts w:ascii="Times New Roman" w:eastAsia="Times New Roman" w:hAnsi="Times New Roman" w:cs="Times New Roman"/>
+                          <w:sz w:val="24"/>
+                          <w:szCs w:val="24"/>
+                        </w:rPr>
+                        <w:t>Wed</w:t>
+                      </w:r>
+                      <w:r>
+                        <w:rPr>
+                          <w:rFonts w:ascii="Times New Roman" w:eastAsia="Times New Roman" w:hAnsi="Times New Roman" w:cs="Times New Roman"/>
+                          <w:sz w:val="24"/>
+                          <w:szCs w:val="24"/>
+                          <w:lang w:val="ru-RU"/>
+                        </w:rPr>
+                        <w:t xml:space="preserve"> </w:t>
+                      </w:r>
+                      <w:r>
+                        <w:rPr>
+                          <w:rFonts w:ascii="Times New Roman" w:eastAsia="Times New Roman" w:hAnsi="Times New Roman" w:cs="Times New Roman"/>
+                          <w:sz w:val="24"/>
+                          <w:szCs w:val="24"/>
+                        </w:rPr>
+                        <w:t>Dec</w:t>
+                      </w:r>
+                      <w:r>
+                        <w:rPr>
+                          <w:rFonts w:ascii="Times New Roman" w:eastAsia="Times New Roman" w:hAnsi="Times New Roman" w:cs="Times New Roman"/>
+                          <w:sz w:val="24"/>
+                          <w:szCs w:val="24"/>
+                          <w:lang w:val="ru-RU"/>
+                        </w:rPr>
+                        <w:t xml:space="preserve"> 31 2025 00:00:00 </w:t>
+                      </w:r>
+                      <w:r>
+                        <w:rPr>
+                          <w:rFonts w:ascii="Times New Roman" w:eastAsia="Times New Roman" w:hAnsi="Times New Roman" w:cs="Times New Roman"/>
+                          <w:sz w:val="24"/>
+                          <w:szCs w:val="24"/>
+                        </w:rPr>
+                        <w:t>GMT</w:t>
+                      </w:r>
+                      <w:r>
+                        <w:rPr>
+                          <w:rFonts w:ascii="Times New Roman" w:eastAsia="Times New Roman" w:hAnsi="Times New Roman" w:cs="Times New Roman"/>
+                          <w:sz w:val="24"/>
+                          <w:szCs w:val="24"/>
+                          <w:lang w:val="ru-RU"/>
+                        </w:rPr>
+                        <w:t>+0300 (</w:t>
+                      </w:r>
+                      <w:r>
+                        <w:rPr>
+                          <w:rFonts w:ascii="Times New Roman" w:eastAsia="Times New Roman" w:hAnsi="Times New Roman" w:cs="Times New Roman"/>
+                          <w:sz w:val="24"/>
+                          <w:szCs w:val="24"/>
+                        </w:rPr>
+                        <w:t>MSK</w:t>
+                      </w:r>
+                      <w:r>
+                        <w:rPr>
+                          <w:rFonts w:ascii="Times New Roman" w:eastAsia="Times New Roman" w:hAnsi="Times New Roman" w:cs="Times New Roman"/>
+                          <w:sz w:val="24"/>
+                          <w:szCs w:val="24"/>
+                          <w:lang w:val="ru-RU"/>
+                        </w:rPr>
+                        <w:t xml:space="preserve">)"); </w:t>
+                      </w:r>
+                      <w:r>
+                        <w:rPr>
+                          <w:rFonts w:ascii="Times New Roman" w:eastAsia="Times New Roman" w:hAnsi="Times New Roman" w:cs="Times New Roman"/>
+                          <w:sz w:val="24"/>
+                          <w:szCs w:val="24"/>
+                        </w:rPr>
+                        <w:t>toISOString</w:t>
+                      </w:r>
+                      <w:r>
+                        <w:rPr>
+                          <w:rFonts w:ascii="Times New Roman" w:eastAsia="Times New Roman" w:hAnsi="Times New Roman" w:cs="Times New Roman"/>
+                          <w:sz w:val="24"/>
+                          <w:szCs w:val="24"/>
+                          <w:lang w:val="ru-RU"/>
+                        </w:rPr>
+                        <w:t xml:space="preserve">() = </w:t>
+                      </w:r>
+                      <w:r>
+                        <w:rPr>
+                          <w:rFonts w:ascii="Times New Roman" w:eastAsia="Times New Roman" w:hAnsi="Times New Roman" w:cs="Times New Roman"/>
+                          <w:sz w:val="24"/>
+                          <w:szCs w:val="24"/>
+                        </w:rPr>
+                        <w:t>UTC</w:t>
+                      </w:r>
+                      <w:r>
+                        <w:rPr>
+                          <w:rFonts w:ascii="Times New Roman" w:eastAsia="Times New Roman" w:hAnsi="Times New Roman" w:cs="Times New Roman"/>
+                          <w:sz w:val="24"/>
+                          <w:szCs w:val="24"/>
+                          <w:lang w:val="ru-RU"/>
+                        </w:rPr>
+                        <w:t xml:space="preserve"> </w:t>
+                      </w:r>
+                      <w:r>
+                        <w:rPr>
+                          <w:rFonts w:ascii="Times New Roman" w:eastAsia="Times New Roman" w:hAnsi="Times New Roman" w:cs="Times New Roman"/>
+                          <w:sz w:val="24"/>
+                          <w:szCs w:val="24"/>
+                        </w:rPr>
+                        <w:t>ISO</w:t>
+                      </w:r>
+                      <w:r>
+                        <w:rPr>
+                          <w:rFonts w:ascii="Times New Roman" w:eastAsia="Times New Roman" w:hAnsi="Times New Roman" w:cs="Times New Roman"/>
+                          <w:sz w:val="24"/>
+                          <w:szCs w:val="24"/>
+                          <w:lang w:val="ru-RU"/>
+                        </w:rPr>
+                        <w:t xml:space="preserve"> ("2025-12-30</w:t>
+                      </w:r>
+                      <w:r>
+                        <w:rPr>
+                          <w:rFonts w:ascii="Times New Roman" w:eastAsia="Times New Roman" w:hAnsi="Times New Roman" w:cs="Times New Roman"/>
+                          <w:sz w:val="24"/>
+                          <w:szCs w:val="24"/>
+                        </w:rPr>
+                        <w:t>T</w:t>
+                      </w:r>
+                      <w:r>
+                        <w:rPr>
+                          <w:rFonts w:ascii="Times New Roman" w:eastAsia="Times New Roman" w:hAnsi="Times New Roman" w:cs="Times New Roman"/>
+                          <w:sz w:val="24"/>
+                          <w:szCs w:val="24"/>
+                          <w:lang w:val="ru-RU"/>
+                        </w:rPr>
+                        <w:t>21:00:00.000</w:t>
+                      </w:r>
+                      <w:r>
+                        <w:rPr>
+                          <w:rFonts w:ascii="Times New Roman" w:eastAsia="Times New Roman" w:hAnsi="Times New Roman" w:cs="Times New Roman"/>
+                          <w:sz w:val="24"/>
+                          <w:szCs w:val="24"/>
+                        </w:rPr>
+                        <w:t>Z</w:t>
+                      </w:r>
+                      <w:r>
+                        <w:rPr>
+                          <w:rFonts w:ascii="Times New Roman" w:eastAsia="Times New Roman" w:hAnsi="Times New Roman" w:cs="Times New Roman"/>
+                          <w:sz w:val="24"/>
+                          <w:szCs w:val="24"/>
+                          <w:lang w:val="ru-RU"/>
+                        </w:rPr>
+                        <w:t xml:space="preserve">"). </w:t>
+                      </w:r>
+                      <w:r>
+                        <w:rPr>
+                          <w:rFonts w:ascii="Times New Roman" w:eastAsia="Times New Roman" w:hAnsi="Times New Roman" w:cs="Times New Roman"/>
+                          <w:sz w:val="24"/>
+                          <w:szCs w:val="24"/>
+                        </w:rPr>
+                        <w:t>T</w:t>
+                      </w:r>
+                      <w:r>
+                        <w:rPr>
+                          <w:rFonts w:ascii="Times New Roman" w:eastAsia="Times New Roman" w:hAnsi="Times New Roman" w:cs="Times New Roman"/>
+                          <w:sz w:val="24"/>
+                          <w:szCs w:val="24"/>
+                          <w:lang w:val="ru-RU"/>
+                        </w:rPr>
+                        <w:t xml:space="preserve"> — разделитель дата/время; </w:t>
+                      </w:r>
+                      <w:r>
+                        <w:rPr>
+                          <w:rFonts w:ascii="Times New Roman" w:eastAsia="Times New Roman" w:hAnsi="Times New Roman" w:cs="Times New Roman"/>
+                          <w:sz w:val="24"/>
+                          <w:szCs w:val="24"/>
+                        </w:rPr>
+                        <w:t>Z</w:t>
+                      </w:r>
+                      <w:r>
+                        <w:rPr>
+                          <w:rFonts w:ascii="Times New Roman" w:eastAsia="Times New Roman" w:hAnsi="Times New Roman" w:cs="Times New Roman"/>
+                          <w:sz w:val="24"/>
+                          <w:szCs w:val="24"/>
+                          <w:lang w:val="ru-RU"/>
+                        </w:rPr>
+                        <w:t xml:space="preserve"> — </w:t>
+                      </w:r>
+                      <w:r>
+                        <w:rPr>
+                          <w:rFonts w:ascii="Times New Roman" w:eastAsia="Times New Roman" w:hAnsi="Times New Roman" w:cs="Times New Roman"/>
+                          <w:sz w:val="24"/>
+                          <w:szCs w:val="24"/>
+                        </w:rPr>
+                        <w:t>Zulu</w:t>
+                      </w:r>
+                      <w:r>
+                        <w:rPr>
+                          <w:rFonts w:ascii="Times New Roman" w:eastAsia="Times New Roman" w:hAnsi="Times New Roman" w:cs="Times New Roman"/>
+                          <w:sz w:val="24"/>
+                          <w:szCs w:val="24"/>
+                          <w:lang w:val="ru-RU"/>
+                        </w:rPr>
+                        <w:t>/</w:t>
+                      </w:r>
+                      <w:r>
+                        <w:rPr>
+                          <w:rFonts w:ascii="Times New Roman" w:eastAsia="Times New Roman" w:hAnsi="Times New Roman" w:cs="Times New Roman"/>
+                          <w:sz w:val="24"/>
+                          <w:szCs w:val="24"/>
+                        </w:rPr>
+                        <w:t>UTC</w:t>
+                      </w:r>
+                      <w:r>
+                        <w:rPr>
+                          <w:rFonts w:ascii="Times New Roman" w:eastAsia="Times New Roman" w:hAnsi="Times New Roman" w:cs="Times New Roman"/>
+                          <w:sz w:val="24"/>
+                          <w:szCs w:val="24"/>
+                          <w:lang w:val="ru-RU"/>
+                        </w:rPr>
+                        <w:t xml:space="preserve">+0. Разница </w:t>
+                      </w:r>
+                      <w:r>
+                        <w:rPr>
+                          <w:rFonts w:ascii="Times New Roman" w:eastAsia="Times New Roman" w:hAnsi="Times New Roman" w:cs="Times New Roman"/>
+                          <w:sz w:val="24"/>
+                          <w:szCs w:val="24"/>
+                        </w:rPr>
+                        <w:t>CodePen</w:t>
+                      </w:r>
+                      <w:r>
+                        <w:rPr>
+                          <w:rFonts w:ascii="Times New Roman" w:eastAsia="Times New Roman" w:hAnsi="Times New Roman" w:cs="Times New Roman"/>
+                          <w:sz w:val="24"/>
+                          <w:szCs w:val="24"/>
+                          <w:lang w:val="ru-RU"/>
+                        </w:rPr>
+                        <w:t xml:space="preserve">/локаль — от </w:t>
+                      </w:r>
+                      <w:r>
+                        <w:rPr>
+                          <w:rFonts w:ascii="Times New Roman" w:eastAsia="Times New Roman" w:hAnsi="Times New Roman" w:cs="Times New Roman"/>
+                          <w:sz w:val="24"/>
+                          <w:szCs w:val="24"/>
+                        </w:rPr>
+                        <w:t>DevTools</w:t>
+                      </w:r>
+                      <w:r>
+                        <w:rPr>
+                          <w:rFonts w:ascii="Times New Roman" w:eastAsia="Times New Roman" w:hAnsi="Times New Roman" w:cs="Times New Roman"/>
+                          <w:sz w:val="24"/>
+                          <w:szCs w:val="24"/>
+                          <w:lang w:val="ru-RU"/>
+                        </w:rPr>
+                        <w:t xml:space="preserve"> (расширение/версия). </w:t>
+                      </w:r>
+                    </w:p>
+                    <w:p>
+                      <w:pPr>
+                        <w:spacing w:after="0" w:line="240" w:lineRule="auto"/>
+                        <w:rPr>
+                          <w:rFonts w:ascii="Times New Roman" w:eastAsia="Times New Roman" w:hAnsi="Times New Roman" w:cs="Times New Roman"/>
+                          <w:sz w:val="24"/>
+                          <w:szCs w:val="24"/>
+                        </w:rPr>
+                      </w:pPr>
+                      <w:r>
+                        <w:rPr>
+                          <w:rFonts w:ascii="Times New Roman" w:eastAsia="Times New Roman" w:hAnsi="Symbol" w:cs="Times New Roman"/>
+                          <w:sz w:val="24"/>
+                          <w:szCs w:val="24"/>
+                        </w:rPr>
+                        <w:t></w:t>
+                      </w:r>
+                      <w:r>
+                        <w:rPr>
+                          <w:rFonts w:ascii="Times New Roman" w:eastAsia="Times New Roman" w:hAnsi="Times New Roman" w:cs="Times New Roman"/>
+                          <w:sz w:val="24"/>
+                          <w:szCs w:val="24"/>
+                        </w:rPr>
+                        <w:t xml:space="preserve">  </w:t>
+                      </w:r>
+                      <w:r>
+                        <w:rPr>
+                          <w:rFonts w:ascii="Times New Roman" w:eastAsia="Times New Roman" w:hAnsi="Times New Roman" w:cs="Times New Roman"/>
+                          <w:b/>
+                          <w:bCs/>
+                          <w:sz w:val="24"/>
+                          <w:szCs w:val="24"/>
+                        </w:rPr>
+                        <w:t>Кодовые нюансы</w:t>
+                      </w:r>
+                      <w:r>
+                        <w:rPr>
+                          <w:rFonts w:ascii="Times New Roman" w:eastAsia="Times New Roman" w:hAnsi="Times New Roman" w:cs="Times New Roman"/>
+                          <w:sz w:val="24"/>
+                          <w:szCs w:val="24"/>
+                        </w:rPr>
+                        <w:t xml:space="preserve">: date2 - date1 = мс (без getTime()); new Date() ≡ new Date(Date.now()). Для +дней: new Date(date.getTime() + days * 86400000). </w:t>
+                      </w:r>
+                    </w:p>
+                    <w:p>
+                      <w:pPr>
+                        <w:spacing w:after="0" w:line="240" w:lineRule="auto"/>
+                        <w:rPr>
+                          <w:rFonts w:ascii="Times New Roman" w:eastAsia="Times New Roman" w:hAnsi="Times New Roman" w:cs="Times New Roman"/>
+                          <w:sz w:val="24"/>
+                          <w:szCs w:val="24"/>
+                        </w:rPr>
+                      </w:pPr>
+                      <w:r>
+                        <w:rPr>
+                          <w:rFonts w:ascii="Times New Roman" w:eastAsia="Times New Roman" w:hAnsi="Symbol" w:cs="Times New Roman"/>
+                          <w:sz w:val="24"/>
+                          <w:szCs w:val="24"/>
+                        </w:rPr>
+                        <w:t></w:t>
+                      </w:r>
+                      <w:r>
+                        <w:rPr>
+                          <w:rFonts w:ascii="Times New Roman" w:eastAsia="Times New Roman" w:hAnsi="Times New Roman" w:cs="Times New Roman"/>
+                          <w:sz w:val="24"/>
+                          <w:szCs w:val="24"/>
+                        </w:rPr>
+                        <w:t xml:space="preserve">  </w:t>
+                      </w:r>
+                      <w:r>
+                        <w:rPr>
+                          <w:rFonts w:ascii="Times New Roman" w:eastAsia="Times New Roman" w:hAnsi="Times New Roman" w:cs="Times New Roman"/>
+                          <w:b/>
+                          <w:bCs/>
+                          <w:sz w:val="24"/>
+                          <w:szCs w:val="24"/>
+                        </w:rPr>
+                        <w:t>Сравнения</w:t>
+                      </w:r>
+                      <w:r>
+                        <w:rPr>
+                          <w:rFonts w:ascii="Times New Roman" w:eastAsia="Times New Roman" w:hAnsi="Times New Roman" w:cs="Times New Roman"/>
+                          <w:sz w:val="24"/>
+                          <w:szCs w:val="24"/>
+                        </w:rPr>
+                        <w:t xml:space="preserve">: JS Date — не топ (mutable, слабые пояса; лучше date-fns). Аналоги: Python datetime (immutable), Java java.time (эталон). Везде есть (кроме минималистичных ЯП). </w:t>
+                      </w:r>
+                    </w:p>
+                    <w:p>
+                      <w:pPr>
+                        <w:spacing w:after="0" w:line="240" w:lineRule="auto"/>
                         <w:ind w:left="142"/>
                         <w:rPr>
                           <w:rFonts w:ascii="inherit" w:eastAsia="Times New Roman" w:hAnsi="inherit" w:cs="Calibri"/>
@@ -104,6 +2274,40 @@
                           <w:lang w:val="ru-RU"/>
                         </w:rPr>
                       </w:pPr>
+                      <w:r>
+                        <w:rPr>
+                          <w:rFonts w:ascii="Times New Roman" w:eastAsia="Times New Roman" w:hAnsi="Symbol" w:cs="Times New Roman"/>
+                          <w:sz w:val="24"/>
+                          <w:szCs w:val="24"/>
+                        </w:rPr>
+                        <w:t></w:t>
+                      </w:r>
+                      <w:r>
+                        <w:rPr>
+                          <w:rFonts w:ascii="Times New Roman" w:eastAsia="Times New Roman" w:hAnsi="Times New Roman" w:cs="Times New Roman"/>
+                          <w:sz w:val="24"/>
+                          <w:szCs w:val="24"/>
+                        </w:rPr>
+                        <w:t xml:space="preserve">  </w:t>
+                      </w:r>
+                      <w:r>
+                        <w:rPr>
+                          <w:rFonts w:ascii="Times New Roman" w:eastAsia="Times New Roman" w:hAnsi="Times New Roman" w:cs="Times New Roman"/>
+                          <w:b/>
+                          <w:bCs/>
+                          <w:sz w:val="24"/>
+                          <w:szCs w:val="24"/>
+                        </w:rPr>
+                        <w:t>Аналогии для памяти</w:t>
+                      </w:r>
+                      <w:r>
+                        <w:rPr>
+                          <w:rFonts w:ascii="Times New Roman" w:eastAsia="Times New Roman" w:hAnsi="Times New Roman" w:cs="Times New Roman"/>
+                          <w:sz w:val="24"/>
+                          <w:szCs w:val="24"/>
+                        </w:rPr>
+                        <w:t>: Строка = "сжигаемая бумажка" (хрупкая для планов); объект = "часы" (динамика, надёжность).</w:t>
+                      </w:r>
                     </w:p>
                   </w:txbxContent>
                 </v:textbox>
@@ -185,33 +2389,7 @@
                                 <w:szCs w:val="16"/>
                                 <w:shd w:val="clear" w:color="auto" w:fill="FBFBFB"/>
                               </w:rPr>
-                              <w:t>Изменение даты: </w:t>
-                            </w:r>
-                            <w:proofErr w:type="gramStart"/>
-                            <w:r>
-                              <w:rPr>
-                                <w:rFonts w:ascii="Lato" w:eastAsia="Times New Roman" w:hAnsi="Lato" w:cs="Calibri"/>
-                                <w:b/>
-                                <w:bCs/>
-                                <w:color w:val="2E2E2E"/>
-                                <w:sz w:val="16"/>
-                                <w:szCs w:val="16"/>
-                                <w:shd w:val="clear" w:color="auto" w:fill="FBFBFB"/>
-                              </w:rPr>
-                              <w:t>setFullYear(</w:t>
-                            </w:r>
-                            <w:proofErr w:type="gramEnd"/>
-                            <w:r>
-                              <w:rPr>
-                                <w:rFonts w:ascii="Lato" w:eastAsia="Times New Roman" w:hAnsi="Lato" w:cs="Calibri"/>
-                                <w:b/>
-                                <w:bCs/>
-                                <w:color w:val="2E2E2E"/>
-                                <w:sz w:val="16"/>
-                                <w:szCs w:val="16"/>
-                                <w:shd w:val="clear" w:color="auto" w:fill="FBFBFB"/>
-                              </w:rPr>
-                              <w:t>), setMonth(), setDate()</w:t>
+                              <w:t>Изменение даты: setFullYear(), setMonth(), setDate()</w:t>
                             </w:r>
                           </w:p>
                           <w:p>
@@ -274,7 +2452,6 @@
                                 </w:rPr>
                                 <w:t>Метод </w:t>
                               </w:r>
-                              <w:proofErr w:type="gramStart"/>
                               <w:r>
                                 <w:rPr>
                                   <w:rFonts w:ascii="Consolas" w:eastAsia="Times New Roman" w:hAnsi="Consolas" w:cs="Calibri"/>
@@ -284,19 +2461,7 @@
                                   <w:u w:val="single"/>
                                   <w:shd w:val="clear" w:color="auto" w:fill="FBFBFB"/>
                                 </w:rPr>
-                                <w:t>setFullYear(</w:t>
-                              </w:r>
-                              <w:proofErr w:type="gramEnd"/>
-                              <w:r>
-                                <w:rPr>
-                                  <w:rFonts w:ascii="Consolas" w:eastAsia="Times New Roman" w:hAnsi="Consolas" w:cs="Calibri"/>
-                                  <w:color w:val="0000FF"/>
-                                  <w:sz w:val="14"/>
-                                  <w:szCs w:val="14"/>
-                                  <w:u w:val="single"/>
-                                  <w:shd w:val="clear" w:color="auto" w:fill="FBFBFB"/>
-                                </w:rPr>
-                                <w:t>)</w:t>
+                                <w:t>setFullYear()</w:t>
                               </w:r>
                             </w:hyperlink>
                             <w:r>
@@ -337,7 +2502,6 @@
                                 </w:rPr>
                                 <w:t>Метод </w:t>
                               </w:r>
-                              <w:proofErr w:type="gramStart"/>
                               <w:r>
                                 <w:rPr>
                                   <w:rFonts w:ascii="Consolas" w:eastAsia="Times New Roman" w:hAnsi="Consolas" w:cs="Calibri"/>
@@ -347,19 +2511,7 @@
                                   <w:u w:val="single"/>
                                   <w:shd w:val="clear" w:color="auto" w:fill="FBFBFB"/>
                                 </w:rPr>
-                                <w:t>setMonth(</w:t>
-                              </w:r>
-                              <w:proofErr w:type="gramEnd"/>
-                              <w:r>
-                                <w:rPr>
-                                  <w:rFonts w:ascii="Consolas" w:eastAsia="Times New Roman" w:hAnsi="Consolas" w:cs="Calibri"/>
-                                  <w:color w:val="0000FF"/>
-                                  <w:sz w:val="14"/>
-                                  <w:szCs w:val="14"/>
-                                  <w:u w:val="single"/>
-                                  <w:shd w:val="clear" w:color="auto" w:fill="FBFBFB"/>
-                                </w:rPr>
-                                <w:t>)</w:t>
+                                <w:t>setMonth()</w:t>
                               </w:r>
                             </w:hyperlink>
                             <w:r>
@@ -400,7 +2552,6 @@
                                 </w:rPr>
                                 <w:t>Метод </w:t>
                               </w:r>
-                              <w:proofErr w:type="gramStart"/>
                               <w:r>
                                 <w:rPr>
                                   <w:rFonts w:ascii="Consolas" w:eastAsia="Times New Roman" w:hAnsi="Consolas" w:cs="Calibri"/>
@@ -410,19 +2561,7 @@
                                   <w:u w:val="single"/>
                                   <w:shd w:val="clear" w:color="auto" w:fill="FBFBFB"/>
                                 </w:rPr>
-                                <w:t>setDate(</w:t>
-                              </w:r>
-                              <w:proofErr w:type="gramEnd"/>
-                              <w:r>
-                                <w:rPr>
-                                  <w:rFonts w:ascii="Consolas" w:eastAsia="Times New Roman" w:hAnsi="Consolas" w:cs="Calibri"/>
-                                  <w:color w:val="0000FF"/>
-                                  <w:sz w:val="14"/>
-                                  <w:szCs w:val="14"/>
-                                  <w:u w:val="single"/>
-                                  <w:shd w:val="clear" w:color="auto" w:fill="FBFBFB"/>
-                                </w:rPr>
-                                <w:t>)</w:t>
+                                <w:t>setDate()</w:t>
                               </w:r>
                             </w:hyperlink>
                             <w:r>
@@ -525,7 +2664,6 @@
                               </w:rPr>
                               <w:t xml:space="preserve"> </w:t>
                             </w:r>
-                            <w:proofErr w:type="gramStart"/>
                             <w:r>
                               <w:rPr>
                                 <w:rFonts w:ascii="Consolas" w:eastAsia="Times New Roman" w:hAnsi="Consolas" w:cs="Times New Roman"/>
@@ -544,7 +2682,6 @@
                               </w:rPr>
                               <w:t>(</w:t>
                             </w:r>
-                            <w:proofErr w:type="gramEnd"/>
                             <w:r>
                               <w:rPr>
                                 <w:rFonts w:ascii="Consolas" w:eastAsia="Times New Roman" w:hAnsi="Consolas" w:cs="Times New Roman"/>
@@ -575,7 +2712,6 @@
                                 <w:szCs w:val="14"/>
                               </w:rPr>
                             </w:pPr>
-                            <w:proofErr w:type="gramStart"/>
                             <w:r>
                               <w:rPr>
                                 <w:rFonts w:ascii="Consolas" w:eastAsia="Times New Roman" w:hAnsi="Consolas" w:cs="Times New Roman"/>
@@ -603,7 +2739,6 @@
                               </w:rPr>
                               <w:t>setFullYear</w:t>
                             </w:r>
-                            <w:proofErr w:type="gramEnd"/>
                             <w:r>
                               <w:rPr>
                                 <w:rFonts w:ascii="Consolas" w:eastAsia="Times New Roman" w:hAnsi="Consolas" w:cs="Times New Roman"/>
@@ -643,7 +2778,6 @@
                                 <w:szCs w:val="14"/>
                               </w:rPr>
                             </w:pPr>
-                            <w:proofErr w:type="gramStart"/>
                             <w:r>
                               <w:rPr>
                                 <w:rFonts w:ascii="Consolas" w:eastAsia="Times New Roman" w:hAnsi="Consolas" w:cs="Times New Roman"/>
@@ -671,7 +2805,6 @@
                               </w:rPr>
                               <w:t>setMonth</w:t>
                             </w:r>
-                            <w:proofErr w:type="gramEnd"/>
                             <w:r>
                               <w:rPr>
                                 <w:rFonts w:ascii="Consolas" w:eastAsia="Times New Roman" w:hAnsi="Consolas" w:cs="Times New Roman"/>
@@ -711,7 +2844,6 @@
                                 <w:szCs w:val="14"/>
                               </w:rPr>
                             </w:pPr>
-                            <w:proofErr w:type="gramStart"/>
                             <w:r>
                               <w:rPr>
                                 <w:rFonts w:ascii="Consolas" w:eastAsia="Times New Roman" w:hAnsi="Consolas" w:cs="Times New Roman"/>
@@ -739,7 +2871,6 @@
                               </w:rPr>
                               <w:t>setDate</w:t>
                             </w:r>
-                            <w:proofErr w:type="gramEnd"/>
                             <w:r>
                               <w:rPr>
                                 <w:rFonts w:ascii="Consolas" w:eastAsia="Times New Roman" w:hAnsi="Consolas" w:cs="Times New Roman"/>
@@ -779,7 +2910,6 @@
                                 <w:szCs w:val="14"/>
                               </w:rPr>
                             </w:pPr>
-                            <w:proofErr w:type="gramStart"/>
                             <w:r>
                               <w:rPr>
                                 <w:rFonts w:ascii="Consolas" w:eastAsia="Times New Roman" w:hAnsi="Consolas" w:cs="Times New Roman"/>
@@ -816,7 +2946,6 @@
                               </w:rPr>
                               <w:t>(</w:t>
                             </w:r>
-                            <w:proofErr w:type="gramEnd"/>
                             <w:r>
                               <w:rPr>
                                 <w:rFonts w:ascii="Consolas" w:eastAsia="Times New Roman" w:hAnsi="Consolas" w:cs="Times New Roman"/>
@@ -906,33 +3035,7 @@
                                 <w:szCs w:val="16"/>
                                 <w:shd w:val="clear" w:color="auto" w:fill="FBFBFB"/>
                               </w:rPr>
-                              <w:t>Изменение времени: </w:t>
-                            </w:r>
-                            <w:proofErr w:type="gramStart"/>
-                            <w:r>
-                              <w:rPr>
-                                <w:rFonts w:ascii="Lato" w:eastAsia="Times New Roman" w:hAnsi="Lato" w:cs="Calibri"/>
-                                <w:b/>
-                                <w:bCs/>
-                                <w:color w:val="2E2E2E"/>
-                                <w:sz w:val="16"/>
-                                <w:szCs w:val="16"/>
-                                <w:shd w:val="clear" w:color="auto" w:fill="FBFBFB"/>
-                              </w:rPr>
-                              <w:t>setHours(</w:t>
-                            </w:r>
-                            <w:proofErr w:type="gramEnd"/>
-                            <w:r>
-                              <w:rPr>
-                                <w:rFonts w:ascii="Lato" w:eastAsia="Times New Roman" w:hAnsi="Lato" w:cs="Calibri"/>
-                                <w:b/>
-                                <w:bCs/>
-                                <w:color w:val="2E2E2E"/>
-                                <w:sz w:val="16"/>
-                                <w:szCs w:val="16"/>
-                                <w:shd w:val="clear" w:color="auto" w:fill="FBFBFB"/>
-                              </w:rPr>
-                              <w:t>), setMinutes(), setSeconds(), setMilliseconds()</w:t>
+                              <w:t>Изменение времени: setHours(), setMinutes(), setSeconds(), setMilliseconds()</w:t>
                             </w:r>
                           </w:p>
                           <w:p>
@@ -986,7 +3089,6 @@
                                 </w:rPr>
                                 <w:t>Метод </w:t>
                               </w:r>
-                              <w:proofErr w:type="gramStart"/>
                               <w:r>
                                 <w:rPr>
                                   <w:rFonts w:ascii="Consolas" w:eastAsia="Times New Roman" w:hAnsi="Consolas" w:cs="Calibri"/>
@@ -996,19 +3098,7 @@
                                   <w:u w:val="single"/>
                                   <w:shd w:val="clear" w:color="auto" w:fill="FBFBFB"/>
                                 </w:rPr>
-                                <w:t>setHours(</w:t>
-                              </w:r>
-                              <w:proofErr w:type="gramEnd"/>
-                              <w:r>
-                                <w:rPr>
-                                  <w:rFonts w:ascii="Consolas" w:eastAsia="Times New Roman" w:hAnsi="Consolas" w:cs="Calibri"/>
-                                  <w:color w:val="0000FF"/>
-                                  <w:sz w:val="14"/>
-                                  <w:szCs w:val="14"/>
-                                  <w:u w:val="single"/>
-                                  <w:shd w:val="clear" w:color="auto" w:fill="FBFBFB"/>
-                                </w:rPr>
-                                <w:t>)</w:t>
+                                <w:t>setHours()</w:t>
                               </w:r>
                             </w:hyperlink>
                             <w:r>
@@ -1049,7 +3139,6 @@
                                 </w:rPr>
                                 <w:t>Метод </w:t>
                               </w:r>
-                              <w:proofErr w:type="gramStart"/>
                               <w:r>
                                 <w:rPr>
                                   <w:rFonts w:ascii="Consolas" w:eastAsia="Times New Roman" w:hAnsi="Consolas" w:cs="Calibri"/>
@@ -1059,19 +3148,7 @@
                                   <w:u w:val="single"/>
                                   <w:shd w:val="clear" w:color="auto" w:fill="FBFBFB"/>
                                 </w:rPr>
-                                <w:t>setMinutes(</w:t>
-                              </w:r>
-                              <w:proofErr w:type="gramEnd"/>
-                              <w:r>
-                                <w:rPr>
-                                  <w:rFonts w:ascii="Consolas" w:eastAsia="Times New Roman" w:hAnsi="Consolas" w:cs="Calibri"/>
-                                  <w:color w:val="0000FF"/>
-                                  <w:sz w:val="14"/>
-                                  <w:szCs w:val="14"/>
-                                  <w:u w:val="single"/>
-                                  <w:shd w:val="clear" w:color="auto" w:fill="FBFBFB"/>
-                                </w:rPr>
-                                <w:t>)</w:t>
+                                <w:t>setMinutes()</w:t>
                               </w:r>
                             </w:hyperlink>
                             <w:r>
@@ -1112,7 +3189,6 @@
                                 </w:rPr>
                                 <w:t>Метод </w:t>
                               </w:r>
-                              <w:proofErr w:type="gramStart"/>
                               <w:r>
                                 <w:rPr>
                                   <w:rFonts w:ascii="Consolas" w:eastAsia="Times New Roman" w:hAnsi="Consolas" w:cs="Calibri"/>
@@ -1122,19 +3198,7 @@
                                   <w:u w:val="single"/>
                                   <w:shd w:val="clear" w:color="auto" w:fill="FBFBFB"/>
                                 </w:rPr>
-                                <w:t>setSeconds(</w:t>
-                              </w:r>
-                              <w:proofErr w:type="gramEnd"/>
-                              <w:r>
-                                <w:rPr>
-                                  <w:rFonts w:ascii="Consolas" w:eastAsia="Times New Roman" w:hAnsi="Consolas" w:cs="Calibri"/>
-                                  <w:color w:val="0000FF"/>
-                                  <w:sz w:val="14"/>
-                                  <w:szCs w:val="14"/>
-                                  <w:u w:val="single"/>
-                                  <w:shd w:val="clear" w:color="auto" w:fill="FBFBFB"/>
-                                </w:rPr>
-                                <w:t>)</w:t>
+                                <w:t>setSeconds()</w:t>
                               </w:r>
                             </w:hyperlink>
                             <w:r>
@@ -1175,7 +3239,6 @@
                                 </w:rPr>
                                 <w:t>Метод </w:t>
                               </w:r>
-                              <w:proofErr w:type="gramStart"/>
                               <w:r>
                                 <w:rPr>
                                   <w:rFonts w:ascii="Consolas" w:eastAsia="Times New Roman" w:hAnsi="Consolas" w:cs="Calibri"/>
@@ -1185,19 +3248,7 @@
                                   <w:u w:val="single"/>
                                   <w:shd w:val="clear" w:color="auto" w:fill="FBFBFB"/>
                                 </w:rPr>
-                                <w:t>setMilliseconds(</w:t>
-                              </w:r>
-                              <w:proofErr w:type="gramEnd"/>
-                              <w:r>
-                                <w:rPr>
-                                  <w:rFonts w:ascii="Consolas" w:eastAsia="Times New Roman" w:hAnsi="Consolas" w:cs="Calibri"/>
-                                  <w:color w:val="0000FF"/>
-                                  <w:sz w:val="14"/>
-                                  <w:szCs w:val="14"/>
-                                  <w:u w:val="single"/>
-                                  <w:shd w:val="clear" w:color="auto" w:fill="FBFBFB"/>
-                                </w:rPr>
-                                <w:t>)</w:t>
+                                <w:t>setMilliseconds()</w:t>
                               </w:r>
                             </w:hyperlink>
                             <w:r>
@@ -1300,7 +3351,6 @@
                               </w:rPr>
                               <w:t xml:space="preserve"> </w:t>
                             </w:r>
-                            <w:proofErr w:type="gramStart"/>
                             <w:r>
                               <w:rPr>
                                 <w:rFonts w:ascii="Consolas" w:eastAsia="Times New Roman" w:hAnsi="Consolas" w:cs="Times New Roman"/>
@@ -1319,7 +3369,6 @@
                               </w:rPr>
                               <w:t>(</w:t>
                             </w:r>
-                            <w:proofErr w:type="gramEnd"/>
                             <w:r>
                               <w:rPr>
                                 <w:rFonts w:ascii="Consolas" w:eastAsia="Times New Roman" w:hAnsi="Consolas" w:cs="Times New Roman"/>
@@ -1350,7 +3399,6 @@
                                 <w:szCs w:val="14"/>
                               </w:rPr>
                             </w:pPr>
-                            <w:proofErr w:type="gramStart"/>
                             <w:r>
                               <w:rPr>
                                 <w:rFonts w:ascii="Consolas" w:eastAsia="Times New Roman" w:hAnsi="Consolas" w:cs="Times New Roman"/>
@@ -1378,7 +3426,6 @@
                               </w:rPr>
                               <w:t>setHours</w:t>
                             </w:r>
-                            <w:proofErr w:type="gramEnd"/>
                             <w:r>
                               <w:rPr>
                                 <w:rFonts w:ascii="Consolas" w:eastAsia="Times New Roman" w:hAnsi="Consolas" w:cs="Times New Roman"/>
@@ -1418,7 +3465,6 @@
                                 <w:szCs w:val="14"/>
                               </w:rPr>
                             </w:pPr>
-                            <w:proofErr w:type="gramStart"/>
                             <w:r>
                               <w:rPr>
                                 <w:rFonts w:ascii="Consolas" w:eastAsia="Times New Roman" w:hAnsi="Consolas" w:cs="Times New Roman"/>
@@ -1446,7 +3492,6 @@
                               </w:rPr>
                               <w:t>setMinutes</w:t>
                             </w:r>
-                            <w:proofErr w:type="gramEnd"/>
                             <w:r>
                               <w:rPr>
                                 <w:rFonts w:ascii="Consolas" w:eastAsia="Times New Roman" w:hAnsi="Consolas" w:cs="Times New Roman"/>
@@ -1486,7 +3531,6 @@
                                 <w:szCs w:val="14"/>
                               </w:rPr>
                             </w:pPr>
-                            <w:proofErr w:type="gramStart"/>
                             <w:r>
                               <w:rPr>
                                 <w:rFonts w:ascii="Consolas" w:eastAsia="Times New Roman" w:hAnsi="Consolas" w:cs="Times New Roman"/>
@@ -1514,7 +3558,6 @@
                               </w:rPr>
                               <w:t>setSeconds</w:t>
                             </w:r>
-                            <w:proofErr w:type="gramEnd"/>
                             <w:r>
                               <w:rPr>
                                 <w:rFonts w:ascii="Consolas" w:eastAsia="Times New Roman" w:hAnsi="Consolas" w:cs="Times New Roman"/>
@@ -1554,7 +3597,6 @@
                                 <w:szCs w:val="14"/>
                               </w:rPr>
                             </w:pPr>
-                            <w:proofErr w:type="gramStart"/>
                             <w:r>
                               <w:rPr>
                                 <w:rFonts w:ascii="Consolas" w:eastAsia="Times New Roman" w:hAnsi="Consolas" w:cs="Times New Roman"/>
@@ -1582,7 +3624,6 @@
                               </w:rPr>
                               <w:t>setMilliseconds</w:t>
                             </w:r>
-                            <w:proofErr w:type="gramEnd"/>
                             <w:r>
                               <w:rPr>
                                 <w:rFonts w:ascii="Consolas" w:eastAsia="Times New Roman" w:hAnsi="Consolas" w:cs="Times New Roman"/>
@@ -1622,7 +3663,6 @@
                                 <w:szCs w:val="14"/>
                               </w:rPr>
                             </w:pPr>
-                            <w:proofErr w:type="gramStart"/>
                             <w:r>
                               <w:rPr>
                                 <w:rFonts w:ascii="Consolas" w:eastAsia="Times New Roman" w:hAnsi="Consolas" w:cs="Times New Roman"/>
@@ -1659,7 +3699,6 @@
                               </w:rPr>
                               <w:t>(</w:t>
                             </w:r>
-                            <w:proofErr w:type="gramEnd"/>
                             <w:r>
                               <w:rPr>
                                 <w:rFonts w:ascii="Consolas" w:eastAsia="Times New Roman" w:hAnsi="Consolas" w:cs="Times New Roman"/>
@@ -1764,9 +3803,8 @@
                                 <w:szCs w:val="14"/>
                                 <w:shd w:val="clear" w:color="auto" w:fill="FBFBFB"/>
                               </w:rPr>
-                              <w:t> </w:t>
-                            </w:r>
-                            <w:proofErr w:type="gramStart"/>
+                              <w:t> getTime</w:t>
+                            </w:r>
                             <w:r>
                               <w:rPr>
                                 <w:rFonts w:ascii="Lato" w:eastAsia="Times New Roman" w:hAnsi="Lato" w:cs="Calibri"/>
@@ -1776,35 +3814,9 @@
                                 <w:sz w:val="14"/>
                                 <w:szCs w:val="14"/>
                                 <w:shd w:val="clear" w:color="auto" w:fill="FBFBFB"/>
-                              </w:rPr>
-                              <w:t>getTime</w:t>
-                            </w:r>
-                            <w:r>
-                              <w:rPr>
-                                <w:rFonts w:ascii="Lato" w:eastAsia="Times New Roman" w:hAnsi="Lato" w:cs="Calibri"/>
-                                <w:b/>
-                                <w:bCs/>
-                                <w:color w:val="2E2E2E"/>
-                                <w:sz w:val="14"/>
-                                <w:szCs w:val="14"/>
-                                <w:shd w:val="clear" w:color="auto" w:fill="FBFBFB"/>
                                 <w:lang w:val="ru-RU"/>
                               </w:rPr>
-                              <w:t>(</w:t>
-                            </w:r>
-                            <w:proofErr w:type="gramEnd"/>
-                            <w:r>
-                              <w:rPr>
-                                <w:rFonts w:ascii="Lato" w:eastAsia="Times New Roman" w:hAnsi="Lato" w:cs="Calibri"/>
-                                <w:b/>
-                                <w:bCs/>
-                                <w:color w:val="2E2E2E"/>
-                                <w:sz w:val="14"/>
-                                <w:szCs w:val="14"/>
-                                <w:shd w:val="clear" w:color="auto" w:fill="FBFBFB"/>
-                                <w:lang w:val="ru-RU"/>
-                              </w:rPr>
-                              <w:t>)</w:t>
+                              <w:t>()</w:t>
                             </w:r>
                           </w:p>
                           <w:p>
@@ -1990,7 +4002,6 @@
                               </w:rPr>
                               <w:t xml:space="preserve"> </w:t>
                             </w:r>
-                            <w:proofErr w:type="gramStart"/>
                             <w:r>
                               <w:rPr>
                                 <w:rFonts w:ascii="Consolas" w:eastAsia="Times New Roman" w:hAnsi="Consolas" w:cs="Times New Roman"/>
@@ -2009,7 +4020,6 @@
                               </w:rPr>
                               <w:t>(</w:t>
                             </w:r>
-                            <w:proofErr w:type="gramEnd"/>
                             <w:r>
                               <w:rPr>
                                 <w:rFonts w:ascii="Consolas" w:eastAsia="Times New Roman" w:hAnsi="Consolas" w:cs="Times New Roman"/>
@@ -2040,7 +4050,6 @@
                                 <w:szCs w:val="14"/>
                               </w:rPr>
                             </w:pPr>
-                            <w:proofErr w:type="gramStart"/>
                             <w:r>
                               <w:rPr>
                                 <w:rFonts w:ascii="Consolas" w:eastAsia="Times New Roman" w:hAnsi="Consolas" w:cs="Times New Roman"/>
@@ -2077,7 +4086,6 @@
                               </w:rPr>
                               <w:t>(</w:t>
                             </w:r>
-                            <w:proofErr w:type="gramEnd"/>
                             <w:r>
                               <w:rPr>
                                 <w:rFonts w:ascii="Consolas" w:eastAsia="Times New Roman" w:hAnsi="Consolas" w:cs="Times New Roman"/>
@@ -2232,7 +4240,6 @@
                               </w:rPr>
                               <w:t xml:space="preserve"> </w:t>
                             </w:r>
-                            <w:proofErr w:type="gramStart"/>
                             <w:r>
                               <w:rPr>
                                 <w:rFonts w:ascii="Consolas" w:eastAsia="Times New Roman" w:hAnsi="Consolas" w:cs="Times New Roman"/>
@@ -2251,7 +4258,6 @@
                               </w:rPr>
                               <w:t>(</w:t>
                             </w:r>
-                            <w:proofErr w:type="gramEnd"/>
                             <w:r>
                               <w:rPr>
                                 <w:rFonts w:ascii="Consolas" w:eastAsia="Times New Roman" w:hAnsi="Consolas" w:cs="Times New Roman"/>
@@ -2282,7 +4288,6 @@
                                 <w:szCs w:val="14"/>
                               </w:rPr>
                             </w:pPr>
-                            <w:proofErr w:type="gramStart"/>
                             <w:r>
                               <w:rPr>
                                 <w:rFonts w:ascii="Consolas" w:eastAsia="Times New Roman" w:hAnsi="Consolas" w:cs="Times New Roman"/>
@@ -2319,7 +4324,6 @@
                               </w:rPr>
                               <w:t>(</w:t>
                             </w:r>
-                            <w:proofErr w:type="gramEnd"/>
                             <w:r>
                               <w:rPr>
                                 <w:rFonts w:ascii="Consolas" w:eastAsia="Times New Roman" w:hAnsi="Consolas" w:cs="Times New Roman"/>
@@ -2558,7 +4562,6 @@
                                 <w:szCs w:val="14"/>
                               </w:rPr>
                             </w:pPr>
-                            <w:proofErr w:type="gramStart"/>
                             <w:r>
                               <w:rPr>
                                 <w:rFonts w:ascii="Consolas" w:eastAsia="Times New Roman" w:hAnsi="Consolas" w:cs="Times New Roman"/>
@@ -2595,7 +4598,6 @@
                               </w:rPr>
                               <w:t>(</w:t>
                             </w:r>
-                            <w:proofErr w:type="gramEnd"/>
                             <w:r>
                               <w:rPr>
                                 <w:rFonts w:ascii="Consolas" w:eastAsia="Times New Roman" w:hAnsi="Consolas" w:cs="Times New Roman"/>
@@ -2992,7 +4994,6 @@
                               </w:rPr>
                               <w:t xml:space="preserve"> </w:t>
                             </w:r>
-                            <w:proofErr w:type="gramStart"/>
                             <w:r>
                               <w:rPr>
                                 <w:rFonts w:ascii="Consolas" w:eastAsia="Times New Roman" w:hAnsi="Consolas" w:cs="Times New Roman"/>
@@ -3011,7 +5012,6 @@
                               </w:rPr>
                               <w:t>(</w:t>
                             </w:r>
-                            <w:proofErr w:type="gramEnd"/>
                             <w:r>
                               <w:rPr>
                                 <w:rFonts w:ascii="Consolas" w:eastAsia="Times New Roman" w:hAnsi="Consolas" w:cs="Times New Roman"/>
@@ -3042,7 +5042,6 @@
                                 <w:szCs w:val="14"/>
                               </w:rPr>
                             </w:pPr>
-                            <w:proofErr w:type="gramStart"/>
                             <w:r>
                               <w:rPr>
                                 <w:rFonts w:ascii="Consolas" w:eastAsia="Times New Roman" w:hAnsi="Consolas" w:cs="Times New Roman"/>
@@ -3079,7 +5078,6 @@
                               </w:rPr>
                               <w:t>(</w:t>
                             </w:r>
-                            <w:proofErr w:type="gramEnd"/>
                             <w:r>
                               <w:rPr>
                                 <w:rFonts w:ascii="Consolas" w:eastAsia="Times New Roman" w:hAnsi="Consolas" w:cs="Times New Roman"/>
@@ -3234,7 +5232,6 @@
                               </w:rPr>
                               <w:t xml:space="preserve"> </w:t>
                             </w:r>
-                            <w:proofErr w:type="gramStart"/>
                             <w:r>
                               <w:rPr>
                                 <w:rFonts w:ascii="Consolas" w:eastAsia="Times New Roman" w:hAnsi="Consolas" w:cs="Times New Roman"/>
@@ -3253,7 +5250,6 @@
                               </w:rPr>
                               <w:t>(</w:t>
                             </w:r>
-                            <w:proofErr w:type="gramEnd"/>
                             <w:r>
                               <w:rPr>
                                 <w:rFonts w:ascii="Consolas" w:eastAsia="Times New Roman" w:hAnsi="Consolas" w:cs="Times New Roman"/>
@@ -3284,7 +5280,6 @@
                                 <w:szCs w:val="14"/>
                               </w:rPr>
                             </w:pPr>
-                            <w:proofErr w:type="gramStart"/>
                             <w:r>
                               <w:rPr>
                                 <w:rFonts w:ascii="Consolas" w:eastAsia="Times New Roman" w:hAnsi="Consolas" w:cs="Times New Roman"/>
@@ -3321,7 +5316,6 @@
                               </w:rPr>
                               <w:t>(</w:t>
                             </w:r>
-                            <w:proofErr w:type="gramEnd"/>
                             <w:r>
                               <w:rPr>
                                 <w:rFonts w:ascii="Consolas" w:eastAsia="Times New Roman" w:hAnsi="Consolas" w:cs="Times New Roman"/>
@@ -3560,7 +5554,6 @@
                                 <w:szCs w:val="14"/>
                               </w:rPr>
                             </w:pPr>
-                            <w:proofErr w:type="gramStart"/>
                             <w:r>
                               <w:rPr>
                                 <w:rFonts w:ascii="Consolas" w:eastAsia="Times New Roman" w:hAnsi="Consolas" w:cs="Times New Roman"/>
@@ -3597,7 +5590,6 @@
                               </w:rPr>
                               <w:t>(</w:t>
                             </w:r>
-                            <w:proofErr w:type="gramEnd"/>
                             <w:r>
                               <w:rPr>
                                 <w:rFonts w:ascii="Consolas" w:eastAsia="Times New Roman" w:hAnsi="Consolas" w:cs="Times New Roman"/>
@@ -4240,7 +6232,6 @@
                               </w:rPr>
                               <w:t xml:space="preserve"> </w:t>
                             </w:r>
-                            <w:proofErr w:type="gramStart"/>
                             <w:r>
                               <w:rPr>
                                 <w:rFonts w:ascii="Consolas" w:eastAsia="Times New Roman" w:hAnsi="Consolas" w:cs="Times New Roman"/>
@@ -4259,7 +6250,6 @@
                               </w:rPr>
                               <w:t>(</w:t>
                             </w:r>
-                            <w:proofErr w:type="gramEnd"/>
                             <w:r>
                               <w:rPr>
                                 <w:rFonts w:ascii="Consolas" w:eastAsia="Times New Roman" w:hAnsi="Consolas" w:cs="Times New Roman"/>
@@ -4290,7 +6280,6 @@
                                 <w:szCs w:val="14"/>
                               </w:rPr>
                             </w:pPr>
-                            <w:proofErr w:type="gramStart"/>
                             <w:r>
                               <w:rPr>
                                 <w:rFonts w:ascii="Consolas" w:eastAsia="Times New Roman" w:hAnsi="Consolas" w:cs="Times New Roman"/>
@@ -4327,7 +6316,6 @@
                               </w:rPr>
                               <w:t>(</w:t>
                             </w:r>
-                            <w:proofErr w:type="gramEnd"/>
                             <w:r>
                               <w:rPr>
                                 <w:rFonts w:ascii="Consolas" w:eastAsia="Times New Roman" w:hAnsi="Consolas" w:cs="Times New Roman"/>
@@ -4482,7 +6470,6 @@
                               </w:rPr>
                               <w:t xml:space="preserve"> </w:t>
                             </w:r>
-                            <w:proofErr w:type="gramStart"/>
                             <w:r>
                               <w:rPr>
                                 <w:rFonts w:ascii="Consolas" w:eastAsia="Times New Roman" w:hAnsi="Consolas" w:cs="Times New Roman"/>
@@ -4501,7 +6488,6 @@
                               </w:rPr>
                               <w:t>(</w:t>
                             </w:r>
-                            <w:proofErr w:type="gramEnd"/>
                             <w:r>
                               <w:rPr>
                                 <w:rFonts w:ascii="Consolas" w:eastAsia="Times New Roman" w:hAnsi="Consolas" w:cs="Times New Roman"/>
@@ -4532,7 +6518,6 @@
                                 <w:szCs w:val="14"/>
                               </w:rPr>
                             </w:pPr>
-                            <w:proofErr w:type="gramStart"/>
                             <w:r>
                               <w:rPr>
                                 <w:rFonts w:ascii="Consolas" w:eastAsia="Times New Roman" w:hAnsi="Consolas" w:cs="Times New Roman"/>
@@ -4569,7 +6554,6 @@
                               </w:rPr>
                               <w:t>(</w:t>
                             </w:r>
-                            <w:proofErr w:type="gramEnd"/>
                             <w:r>
                               <w:rPr>
                                 <w:rFonts w:ascii="Consolas" w:eastAsia="Times New Roman" w:hAnsi="Consolas" w:cs="Times New Roman"/>
@@ -4808,7 +6792,6 @@
                                 <w:szCs w:val="14"/>
                               </w:rPr>
                             </w:pPr>
-                            <w:proofErr w:type="gramStart"/>
                             <w:r>
                               <w:rPr>
                                 <w:rFonts w:ascii="Consolas" w:eastAsia="Times New Roman" w:hAnsi="Consolas" w:cs="Times New Roman"/>
@@ -4845,7 +6828,6 @@
                               </w:rPr>
                               <w:t>(</w:t>
                             </w:r>
-                            <w:proofErr w:type="gramEnd"/>
                             <w:r>
                               <w:rPr>
                                 <w:rFonts w:ascii="Consolas" w:eastAsia="Times New Roman" w:hAnsi="Consolas" w:cs="Times New Roman"/>
@@ -5326,7 +7308,6 @@
                                 <w:szCs w:val="14"/>
                               </w:rPr>
                             </w:pPr>
-                            <w:proofErr w:type="gramStart"/>
                             <w:r>
                               <w:rPr>
                                 <w:rFonts w:ascii="Consolas" w:eastAsia="Times New Roman" w:hAnsi="Consolas" w:cs="Times New Roman"/>
@@ -5363,7 +7344,6 @@
                               </w:rPr>
                               <w:t>(</w:t>
                             </w:r>
-                            <w:proofErr w:type="gramEnd"/>
                             <w:r>
                               <w:rPr>
                                 <w:rFonts w:ascii="Consolas" w:eastAsia="Times New Roman" w:hAnsi="Consolas" w:cs="Times New Roman"/>
@@ -5457,31 +7437,7 @@
                                 <w:sz w:val="14"/>
                                 <w:szCs w:val="14"/>
                               </w:rPr>
-                              <w:t>// new Date(</w:t>
-                            </w:r>
-                            <w:proofErr w:type="gramStart"/>
-                            <w:r>
-                              <w:rPr>
-                                <w:rFonts w:ascii="Consolas" w:eastAsia="Times New Roman" w:hAnsi="Consolas" w:cs="Times New Roman"/>
-                                <w:i/>
-                                <w:iCs/>
-                                <w:color w:val="5C6370"/>
-                                <w:sz w:val="14"/>
-                                <w:szCs w:val="14"/>
-                              </w:rPr>
-                              <w:t>).getTime</w:t>
-                            </w:r>
-                            <w:proofErr w:type="gramEnd"/>
-                            <w:r>
-                              <w:rPr>
-                                <w:rFonts w:ascii="Consolas" w:eastAsia="Times New Roman" w:hAnsi="Consolas" w:cs="Times New Roman"/>
-                                <w:i/>
-                                <w:iCs/>
-                                <w:color w:val="5C6370"/>
-                                <w:sz w:val="14"/>
-                                <w:szCs w:val="14"/>
-                              </w:rPr>
-                              <w:t>() = 981831600000</w:t>
+                              <w:t>// new Date().getTime() = 981831600000</w:t>
                             </w:r>
                           </w:p>
                           <w:p>
@@ -5559,27 +7515,7 @@
                                 <w:sz w:val="14"/>
                                 <w:szCs w:val="14"/>
                               </w:rPr>
-                              <w:t>'</w:t>
-                            </w:r>
-                            <w:proofErr w:type="gramStart"/>
-                            <w:r>
-                              <w:rPr>
-                                <w:rFonts w:ascii="Consolas" w:eastAsia="Times New Roman" w:hAnsi="Consolas" w:cs="Times New Roman"/>
-                                <w:color w:val="FFD945"/>
-                                <w:sz w:val="14"/>
-                                <w:szCs w:val="14"/>
-                              </w:rPr>
-                              <w:t>Date.now(</w:t>
-                            </w:r>
-                            <w:proofErr w:type="gramEnd"/>
-                            <w:r>
-                              <w:rPr>
-                                <w:rFonts w:ascii="Consolas" w:eastAsia="Times New Roman" w:hAnsi="Consolas" w:cs="Times New Roman"/>
-                                <w:color w:val="FFD945"/>
-                                <w:sz w:val="14"/>
-                                <w:szCs w:val="14"/>
-                              </w:rPr>
-                              <w:t>) ='</w:t>
+                              <w:t>'Date.now() ='</w:t>
                             </w:r>
                             <w:r>
                               <w:rPr>
@@ -5651,7 +7587,6 @@
                               </w:rPr>
                               <w:t xml:space="preserve">// </w:t>
                             </w:r>
-                            <w:proofErr w:type="gramStart"/>
                             <w:r>
                               <w:rPr>
                                 <w:rFonts w:ascii="Consolas" w:eastAsia="Times New Roman" w:hAnsi="Consolas" w:cs="Times New Roman"/>
@@ -5696,20 +7631,7 @@
                                 <w:szCs w:val="14"/>
                                 <w:lang w:val="ru-RU"/>
                               </w:rPr>
-                              <w:t>(</w:t>
-                            </w:r>
-                            <w:proofErr w:type="gramEnd"/>
-                            <w:r>
-                              <w:rPr>
-                                <w:rFonts w:ascii="Consolas" w:eastAsia="Times New Roman" w:hAnsi="Consolas" w:cs="Times New Roman"/>
-                                <w:i/>
-                                <w:iCs/>
-                                <w:color w:val="5C6370"/>
-                                <w:sz w:val="14"/>
-                                <w:szCs w:val="14"/>
-                                <w:lang w:val="ru-RU"/>
-                              </w:rPr>
-                              <w:t>) = 981831600000</w:t>
+                              <w:t>() = 981831600000</w:t>
                             </w:r>
                           </w:p>
                           <w:p>
@@ -5899,7 +7821,6 @@
                               </w:rPr>
                               <w:t xml:space="preserve"> </w:t>
                             </w:r>
-                            <w:proofErr w:type="gramStart"/>
                             <w:r>
                               <w:rPr>
                                 <w:rFonts w:ascii="Consolas" w:eastAsia="Times New Roman" w:hAnsi="Consolas" w:cs="Times New Roman"/>
@@ -5936,18 +7857,7 @@
                                 <w:szCs w:val="14"/>
                                 <w:lang w:val="ru-RU"/>
                               </w:rPr>
-                              <w:t>(</w:t>
-                            </w:r>
-                            <w:proofErr w:type="gramEnd"/>
-                            <w:r>
-                              <w:rPr>
-                                <w:rFonts w:ascii="Consolas" w:eastAsia="Times New Roman" w:hAnsi="Consolas" w:cs="Times New Roman"/>
-                                <w:color w:val="F8F8F0"/>
-                                <w:sz w:val="14"/>
-                                <w:szCs w:val="14"/>
-                                <w:lang w:val="ru-RU"/>
-                              </w:rPr>
-                              <w:t>);</w:t>
+                              <w:t>();</w:t>
                             </w:r>
                           </w:p>
                           <w:p>
@@ -6235,7 +8145,6 @@
                               </w:rPr>
                               <w:t xml:space="preserve"> </w:t>
                             </w:r>
-                            <w:proofErr w:type="gramStart"/>
                             <w:r>
                               <w:rPr>
                                 <w:rFonts w:ascii="Consolas" w:eastAsia="Times New Roman" w:hAnsi="Consolas" w:cs="Times New Roman"/>
@@ -6270,17 +8179,7 @@
                                 <w:sz w:val="14"/>
                                 <w:szCs w:val="14"/>
                               </w:rPr>
-                              <w:t>(</w:t>
-                            </w:r>
-                            <w:proofErr w:type="gramEnd"/>
-                            <w:r>
-                              <w:rPr>
-                                <w:rFonts w:ascii="Consolas" w:eastAsia="Times New Roman" w:hAnsi="Consolas" w:cs="Times New Roman"/>
-                                <w:color w:val="F8F8F0"/>
-                                <w:sz w:val="14"/>
-                                <w:szCs w:val="14"/>
-                              </w:rPr>
-                              <w:t>);</w:t>
+                              <w:t>();</w:t>
                             </w:r>
                           </w:p>
                           <w:p>
@@ -6315,7 +8214,6 @@
                                 <w:szCs w:val="14"/>
                               </w:rPr>
                             </w:pPr>
-                            <w:proofErr w:type="gramStart"/>
                             <w:r>
                               <w:rPr>
                                 <w:rFonts w:ascii="Consolas" w:eastAsia="Times New Roman" w:hAnsi="Consolas" w:cs="Times New Roman"/>
@@ -6352,7 +8250,6 @@
                               </w:rPr>
                               <w:t>(</w:t>
                             </w:r>
-                            <w:proofErr w:type="gramEnd"/>
                             <w:r>
                               <w:rPr>
                                 <w:rFonts w:ascii="Consolas" w:eastAsia="Times New Roman" w:hAnsi="Consolas" w:cs="Times New Roman"/>
@@ -6394,7 +8291,6 @@
                                 <w:szCs w:val="14"/>
                               </w:rPr>
                             </w:pPr>
-                            <w:proofErr w:type="gramStart"/>
                             <w:r>
                               <w:rPr>
                                 <w:rFonts w:ascii="Consolas" w:eastAsia="Times New Roman" w:hAnsi="Consolas" w:cs="Times New Roman"/>
@@ -6431,7 +8327,6 @@
                               </w:rPr>
                               <w:t>(</w:t>
                             </w:r>
-                            <w:proofErr w:type="gramEnd"/>
                             <w:r>
                               <w:rPr>
                                 <w:rFonts w:ascii="Consolas" w:eastAsia="Times New Roman" w:hAnsi="Consolas" w:cs="Times New Roman"/>
@@ -6562,7 +8457,6 @@
                                 <w:szCs w:val="14"/>
                               </w:rPr>
                             </w:pPr>
-                            <w:proofErr w:type="gramStart"/>
                             <w:r>
                               <w:rPr>
                                 <w:rFonts w:ascii="Consolas" w:eastAsia="Times New Roman" w:hAnsi="Consolas" w:cs="Times New Roman"/>
@@ -6599,7 +8493,6 @@
                               </w:rPr>
                               <w:t>(</w:t>
                             </w:r>
-                            <w:proofErr w:type="gramEnd"/>
                             <w:r>
                               <w:rPr>
                                 <w:rFonts w:ascii="Consolas" w:eastAsia="Times New Roman" w:hAnsi="Consolas" w:cs="Times New Roman"/>
@@ -14240,7 +16133,6 @@
                               </w:rPr>
                               <w:t xml:space="preserve"> </w:t>
                             </w:r>
-                            <w:proofErr w:type="gramStart"/>
                             <w:r>
                               <w:rPr>
                                 <w:rFonts w:ascii="Consolas" w:eastAsia="Times New Roman" w:hAnsi="Consolas" w:cs="Calibri"/>
@@ -14260,19 +16152,7 @@
                                 <w:shd w:val="clear" w:color="auto" w:fill="FBFBFB"/>
                                 <w:lang w:val="ru-RU"/>
                               </w:rPr>
-                              <w:t>(</w:t>
-                            </w:r>
-                            <w:proofErr w:type="gramEnd"/>
-                            <w:r>
-                              <w:rPr>
-                                <w:rFonts w:ascii="Consolas" w:eastAsia="Times New Roman" w:hAnsi="Consolas" w:cs="Calibri"/>
-                                <w:color w:val="390707"/>
-                                <w:sz w:val="14"/>
-                                <w:szCs w:val="14"/>
-                                <w:shd w:val="clear" w:color="auto" w:fill="FBFBFB"/>
-                                <w:lang w:val="ru-RU"/>
-                              </w:rPr>
-                              <w:t>)</w:t>
+                              <w:t>()</w:t>
                             </w:r>
                             <w:r>
                               <w:rPr>
@@ -14377,7 +16257,6 @@
                               </w:rPr>
                               <w:t xml:space="preserve"> </w:t>
                             </w:r>
-                            <w:proofErr w:type="gramStart"/>
                             <w:r>
                               <w:rPr>
                                 <w:rFonts w:ascii="Consolas" w:eastAsia="Times New Roman" w:hAnsi="Consolas" w:cs="Times New Roman"/>
@@ -14394,17 +16273,7 @@
                                 <w:sz w:val="14"/>
                                 <w:szCs w:val="14"/>
                               </w:rPr>
-                              <w:t>(</w:t>
-                            </w:r>
-                            <w:proofErr w:type="gramEnd"/>
-                            <w:r>
-                              <w:rPr>
-                                <w:rFonts w:ascii="Consolas" w:eastAsia="Times New Roman" w:hAnsi="Consolas" w:cs="Times New Roman"/>
-                                <w:color w:val="F8F8F0"/>
-                                <w:sz w:val="14"/>
-                                <w:szCs w:val="14"/>
-                              </w:rPr>
-                              <w:t>);</w:t>
+                              <w:t>();</w:t>
                             </w:r>
                           </w:p>
                           <w:p>
@@ -14418,7 +16287,6 @@
                                 <w:szCs w:val="14"/>
                               </w:rPr>
                             </w:pPr>
-                            <w:proofErr w:type="gramStart"/>
                             <w:r>
                               <w:rPr>
                                 <w:rFonts w:ascii="Consolas" w:eastAsia="Times New Roman" w:hAnsi="Consolas" w:cs="Times New Roman"/>
@@ -14455,7 +16323,6 @@
                               </w:rPr>
                               <w:t>(</w:t>
                             </w:r>
-                            <w:proofErr w:type="gramEnd"/>
                             <w:r>
                               <w:rPr>
                                 <w:rFonts w:ascii="Consolas" w:eastAsia="Times New Roman" w:hAnsi="Consolas" w:cs="Times New Roman"/>
@@ -14678,7 +16545,6 @@
                               </w:rPr>
                               <w:t xml:space="preserve"> </w:t>
                             </w:r>
-                            <w:proofErr w:type="gramStart"/>
                             <w:r>
                               <w:rPr>
                                 <w:rFonts w:ascii="Consolas" w:eastAsia="Times New Roman" w:hAnsi="Consolas" w:cs="Calibri"/>
@@ -14698,19 +16564,7 @@
                                 <w:shd w:val="clear" w:color="auto" w:fill="FBFBFB"/>
                                 <w:lang w:val="ru-RU"/>
                               </w:rPr>
-                              <w:t>(</w:t>
-                            </w:r>
-                            <w:proofErr w:type="gramEnd"/>
-                            <w:r>
-                              <w:rPr>
-                                <w:rFonts w:ascii="Consolas" w:eastAsia="Times New Roman" w:hAnsi="Consolas" w:cs="Calibri"/>
-                                <w:color w:val="390707"/>
-                                <w:sz w:val="14"/>
-                                <w:szCs w:val="14"/>
-                                <w:shd w:val="clear" w:color="auto" w:fill="FBFBFB"/>
-                                <w:lang w:val="ru-RU"/>
-                              </w:rPr>
-                              <w:t>)</w:t>
+                              <w:t>()</w:t>
                             </w:r>
                             <w:r>
                               <w:rPr>
@@ -14787,7 +16641,6 @@
                               </w:rPr>
                               <w:t xml:space="preserve"> </w:t>
                             </w:r>
-                            <w:proofErr w:type="gramStart"/>
                             <w:r>
                               <w:rPr>
                                 <w:rFonts w:ascii="Consolas" w:eastAsia="Times New Roman" w:hAnsi="Consolas" w:cs="Calibri"/>
@@ -14807,19 +16660,7 @@
                                 <w:shd w:val="clear" w:color="auto" w:fill="FBFBFB"/>
                                 <w:lang w:val="ru-RU"/>
                               </w:rPr>
-                              <w:t>(</w:t>
-                            </w:r>
-                            <w:proofErr w:type="gramEnd"/>
-                            <w:r>
-                              <w:rPr>
-                                <w:rFonts w:ascii="Consolas" w:eastAsia="Times New Roman" w:hAnsi="Consolas" w:cs="Calibri"/>
-                                <w:color w:val="390707"/>
-                                <w:sz w:val="14"/>
-                                <w:szCs w:val="14"/>
-                                <w:shd w:val="clear" w:color="auto" w:fill="FBFBFB"/>
-                                <w:lang w:val="ru-RU"/>
-                              </w:rPr>
-                              <w:t>)</w:t>
+                              <w:t>()</w:t>
                             </w:r>
                             <w:r>
                               <w:rPr>
@@ -15024,7 +16865,6 @@
                               </w:rPr>
                               <w:t xml:space="preserve"> </w:t>
                             </w:r>
-                            <w:proofErr w:type="gramStart"/>
                             <w:r>
                               <w:rPr>
                                 <w:rFonts w:ascii="Consolas" w:eastAsia="Times New Roman" w:hAnsi="Consolas" w:cs="Calibri"/>
@@ -15044,19 +16884,7 @@
                                 <w:shd w:val="clear" w:color="auto" w:fill="FBFBFB"/>
                                 <w:lang w:val="ru-RU"/>
                               </w:rPr>
-                              <w:t>(</w:t>
-                            </w:r>
-                            <w:proofErr w:type="gramEnd"/>
-                            <w:r>
-                              <w:rPr>
-                                <w:rFonts w:ascii="Consolas" w:eastAsia="Times New Roman" w:hAnsi="Consolas" w:cs="Calibri"/>
-                                <w:color w:val="390707"/>
-                                <w:sz w:val="14"/>
-                                <w:szCs w:val="14"/>
-                                <w:shd w:val="clear" w:color="auto" w:fill="FBFBFB"/>
-                                <w:lang w:val="ru-RU"/>
-                              </w:rPr>
-                              <w:t>)</w:t>
+                              <w:t>()</w:t>
                             </w:r>
                             <w:r>
                               <w:rPr>
@@ -15168,7 +16996,6 @@
                               </w:rPr>
                               <w:t xml:space="preserve"> </w:t>
                             </w:r>
-                            <w:proofErr w:type="gramStart"/>
                             <w:r>
                               <w:rPr>
                                 <w:rFonts w:ascii="Consolas" w:eastAsia="Times New Roman" w:hAnsi="Consolas" w:cs="Times New Roman"/>
@@ -15187,7 +17014,6 @@
                               </w:rPr>
                               <w:t>(</w:t>
                             </w:r>
-                            <w:proofErr w:type="gramEnd"/>
                             <w:r>
                               <w:rPr>
                                 <w:rFonts w:ascii="Consolas" w:eastAsia="Times New Roman" w:hAnsi="Consolas" w:cs="Times New Roman"/>
@@ -15343,7 +17169,6 @@
                               </w:rPr>
                               <w:t xml:space="preserve"> </w:t>
                             </w:r>
-                            <w:proofErr w:type="gramStart"/>
                             <w:r>
                               <w:rPr>
                                 <w:rFonts w:ascii="Consolas" w:eastAsia="Times New Roman" w:hAnsi="Consolas" w:cs="Calibri"/>
@@ -15363,19 +17188,7 @@
                                 <w:shd w:val="clear" w:color="auto" w:fill="FBFBFB"/>
                                 <w:lang w:val="ru-RU"/>
                               </w:rPr>
-                              <w:t>(</w:t>
-                            </w:r>
-                            <w:proofErr w:type="gramEnd"/>
-                            <w:r>
-                              <w:rPr>
-                                <w:rFonts w:ascii="Consolas" w:eastAsia="Times New Roman" w:hAnsi="Consolas" w:cs="Calibri"/>
-                                <w:color w:val="390707"/>
-                                <w:sz w:val="14"/>
-                                <w:szCs w:val="14"/>
-                                <w:shd w:val="clear" w:color="auto" w:fill="FBFBFB"/>
-                                <w:lang w:val="ru-RU"/>
-                              </w:rPr>
-                              <w:t>)</w:t>
+                              <w:t>()</w:t>
                             </w:r>
                             <w:r>
                               <w:rPr>
@@ -15466,7 +17279,6 @@
                               </w:rPr>
                               <w:t xml:space="preserve"> </w:t>
                             </w:r>
-                            <w:proofErr w:type="gramStart"/>
                             <w:r>
                               <w:rPr>
                                 <w:rFonts w:ascii="Consolas" w:eastAsia="Times New Roman" w:hAnsi="Consolas" w:cs="Times New Roman"/>
@@ -15485,7 +17297,6 @@
                               </w:rPr>
                               <w:t>(</w:t>
                             </w:r>
-                            <w:proofErr w:type="gramEnd"/>
                             <w:r>
                               <w:rPr>
                                 <w:rFonts w:ascii="Consolas" w:eastAsia="Times New Roman" w:hAnsi="Consolas" w:cs="Times New Roman"/>
@@ -15685,7 +17496,6 @@
                               </w:rPr>
                               <w:t xml:space="preserve"> </w:t>
                             </w:r>
-                            <w:proofErr w:type="gramStart"/>
                             <w:r>
                               <w:rPr>
                                 <w:rFonts w:ascii="Consolas" w:eastAsia="Times New Roman" w:hAnsi="Consolas" w:cs="Times New Roman"/>
@@ -15704,7 +17514,6 @@
                               </w:rPr>
                               <w:t>(</w:t>
                             </w:r>
-                            <w:proofErr w:type="gramEnd"/>
                             <w:r>
                               <w:rPr>
                                 <w:rFonts w:ascii="Consolas" w:eastAsia="Times New Roman" w:hAnsi="Consolas" w:cs="Times New Roman"/>
@@ -15946,7 +17755,6 @@
                                 <w:szCs w:val="14"/>
                               </w:rPr>
                             </w:pPr>
-                            <w:proofErr w:type="gramStart"/>
                             <w:r>
                               <w:rPr>
                                 <w:rFonts w:ascii="Consolas" w:eastAsia="Times New Roman" w:hAnsi="Consolas" w:cs="Times New Roman"/>
@@ -15983,7 +17791,6 @@
                               </w:rPr>
                               <w:t>(</w:t>
                             </w:r>
-                            <w:proofErr w:type="gramEnd"/>
                             <w:r>
                               <w:rPr>
                                 <w:rFonts w:ascii="Consolas" w:eastAsia="Times New Roman" w:hAnsi="Consolas" w:cs="Times New Roman"/>
@@ -16103,7 +17910,6 @@
                               </w:rPr>
                               <w:t xml:space="preserve"> </w:t>
                             </w:r>
-                            <w:proofErr w:type="gramStart"/>
                             <w:r>
                               <w:rPr>
                                 <w:rFonts w:ascii="Consolas" w:eastAsia="Times New Roman" w:hAnsi="Consolas" w:cs="Calibri"/>
@@ -16123,19 +17929,7 @@
                                 <w:shd w:val="clear" w:color="auto" w:fill="FBFBFB"/>
                                 <w:lang w:val="ru-RU"/>
                               </w:rPr>
-                              <w:t>(</w:t>
-                            </w:r>
-                            <w:proofErr w:type="gramEnd"/>
-                            <w:r>
-                              <w:rPr>
-                                <w:rFonts w:ascii="Consolas" w:eastAsia="Times New Roman" w:hAnsi="Consolas" w:cs="Calibri"/>
-                                <w:color w:val="390707"/>
-                                <w:sz w:val="14"/>
-                                <w:szCs w:val="14"/>
-                                <w:shd w:val="clear" w:color="auto" w:fill="FBFBFB"/>
-                                <w:lang w:val="ru-RU"/>
-                              </w:rPr>
-                              <w:t>)</w:t>
+                              <w:t>()</w:t>
                             </w:r>
                             <w:r>
                               <w:rPr>
@@ -16308,7 +18102,6 @@
                               </w:rPr>
                               <w:t xml:space="preserve"> </w:t>
                             </w:r>
-                            <w:proofErr w:type="gramStart"/>
                             <w:r>
                               <w:rPr>
                                 <w:rFonts w:ascii="Consolas" w:eastAsia="Times New Roman" w:hAnsi="Consolas" w:cs="Times New Roman"/>
@@ -16325,17 +18118,7 @@
                                 <w:sz w:val="14"/>
                                 <w:szCs w:val="14"/>
                               </w:rPr>
-                              <w:t>(</w:t>
-                            </w:r>
-                            <w:proofErr w:type="gramEnd"/>
-                            <w:r>
-                              <w:rPr>
-                                <w:rFonts w:ascii="Consolas" w:eastAsia="Times New Roman" w:hAnsi="Consolas" w:cs="Times New Roman"/>
-                                <w:color w:val="F8F8F0"/>
-                                <w:sz w:val="14"/>
-                                <w:szCs w:val="14"/>
-                              </w:rPr>
-                              <w:t>year, month, date, hours, minutes, seconds, ms);</w:t>
+                              <w:t>(year, month, date, hours, minutes, seconds, ms);</w:t>
                             </w:r>
                           </w:p>
                           <w:p>
@@ -16443,31 +18226,7 @@
                                 <w:shd w:val="clear" w:color="auto" w:fill="FBFBFB"/>
                                 <w:lang w:val="ru-RU"/>
                               </w:rPr>
-                              <w:t xml:space="preserve"> месяцы нумеруются от 0 до 11. То есть январь </w:t>
-                            </w:r>
-                            <w:proofErr w:type="gramStart"/>
-                            <w:r>
-                              <w:rPr>
-                                <w:rFonts w:ascii="inherit" w:eastAsia="Times New Roman" w:hAnsi="inherit" w:cs="Calibri"/>
-                                <w:color w:val="2F2F2E"/>
-                                <w:sz w:val="14"/>
-                                <w:szCs w:val="14"/>
-                                <w:shd w:val="clear" w:color="auto" w:fill="FBFBFB"/>
-                                <w:lang w:val="ru-RU"/>
-                              </w:rPr>
-                              <w:t>- это</w:t>
-                            </w:r>
-                            <w:proofErr w:type="gramEnd"/>
-                            <w:r>
-                              <w:rPr>
-                                <w:rFonts w:ascii="inherit" w:eastAsia="Times New Roman" w:hAnsi="inherit" w:cs="Calibri"/>
-                                <w:color w:val="2F2F2E"/>
-                                <w:sz w:val="14"/>
-                                <w:szCs w:val="14"/>
-                                <w:shd w:val="clear" w:color="auto" w:fill="FBFBFB"/>
-                                <w:lang w:val="ru-RU"/>
-                              </w:rPr>
-                              <w:t xml:space="preserve"> число</w:t>
+                              <w:t xml:space="preserve"> месяцы нумеруются от 0 до 11. То есть январь - это число</w:t>
                             </w:r>
                             <w:r>
                               <w:rPr>
@@ -16587,7 +18346,6 @@
                               </w:rPr>
                               <w:t xml:space="preserve"> </w:t>
                             </w:r>
-                            <w:proofErr w:type="gramStart"/>
                             <w:r>
                               <w:rPr>
                                 <w:rFonts w:ascii="Consolas" w:eastAsia="Times New Roman" w:hAnsi="Consolas" w:cs="Calibri"/>
@@ -16607,19 +18365,7 @@
                                 <w:shd w:val="clear" w:color="auto" w:fill="FBFBFB"/>
                                 <w:lang w:val="ru-RU"/>
                               </w:rPr>
-                              <w:t>(</w:t>
-                            </w:r>
-                            <w:proofErr w:type="gramEnd"/>
-                            <w:r>
-                              <w:rPr>
-                                <w:rFonts w:ascii="Consolas" w:eastAsia="Times New Roman" w:hAnsi="Consolas" w:cs="Calibri"/>
-                                <w:color w:val="390707"/>
-                                <w:sz w:val="14"/>
-                                <w:szCs w:val="14"/>
-                                <w:shd w:val="clear" w:color="auto" w:fill="FBFBFB"/>
-                                <w:lang w:val="ru-RU"/>
-                              </w:rPr>
-                              <w:t>)</w:t>
+                              <w:t>()</w:t>
                             </w:r>
                             <w:r>
                               <w:rPr>
@@ -16710,7 +18456,6 @@
                               </w:rPr>
                               <w:t xml:space="preserve"> </w:t>
                             </w:r>
-                            <w:proofErr w:type="gramStart"/>
                             <w:r>
                               <w:rPr>
                                 <w:rFonts w:ascii="Consolas" w:eastAsia="Times New Roman" w:hAnsi="Consolas" w:cs="Times New Roman"/>
@@ -16729,7 +18474,6 @@
                               </w:rPr>
                               <w:t>(</w:t>
                             </w:r>
-                            <w:proofErr w:type="gramEnd"/>
                             <w:r>
                               <w:rPr>
                                 <w:rFonts w:ascii="Consolas" w:eastAsia="Times New Roman" w:hAnsi="Consolas" w:cs="Times New Roman"/>
@@ -16960,7 +18704,6 @@
                               </w:rPr>
                               <w:t> </w:t>
                             </w:r>
-                            <w:proofErr w:type="gramStart"/>
                             <w:r>
                               <w:rPr>
                                 <w:rFonts w:ascii="Consolas" w:eastAsia="Times New Roman" w:hAnsi="Consolas" w:cs="Calibri"/>
@@ -16980,19 +18723,7 @@
                                 <w:shd w:val="clear" w:color="auto" w:fill="FBFBFB"/>
                                 <w:lang w:val="ru-RU"/>
                               </w:rPr>
-                              <w:t>(</w:t>
-                            </w:r>
-                            <w:proofErr w:type="gramEnd"/>
-                            <w:r>
-                              <w:rPr>
-                                <w:rFonts w:ascii="Consolas" w:eastAsia="Times New Roman" w:hAnsi="Consolas" w:cs="Calibri"/>
-                                <w:color w:val="390707"/>
-                                <w:sz w:val="14"/>
-                                <w:szCs w:val="14"/>
-                                <w:shd w:val="clear" w:color="auto" w:fill="FBFBFB"/>
-                                <w:lang w:val="ru-RU"/>
-                              </w:rPr>
-                              <w:t>)</w:t>
+                              <w:t>()</w:t>
                             </w:r>
                             <w:r>
                               <w:rPr>
@@ -17376,33 +19107,7 @@
                                 <w:szCs w:val="14"/>
                                 <w:shd w:val="clear" w:color="auto" w:fill="FBFBFB"/>
                               </w:rPr>
-                              <w:t>Извлечение даты: </w:t>
-                            </w:r>
-                            <w:proofErr w:type="gramStart"/>
-                            <w:r>
-                              <w:rPr>
-                                <w:rFonts w:ascii="Lato" w:eastAsia="Times New Roman" w:hAnsi="Lato" w:cs="Calibri"/>
-                                <w:b/>
-                                <w:bCs/>
-                                <w:color w:val="2E2E2E"/>
-                                <w:sz w:val="14"/>
-                                <w:szCs w:val="14"/>
-                                <w:shd w:val="clear" w:color="auto" w:fill="FBFBFB"/>
-                              </w:rPr>
-                              <w:t>getFullYear(</w:t>
-                            </w:r>
-                            <w:proofErr w:type="gramEnd"/>
-                            <w:r>
-                              <w:rPr>
-                                <w:rFonts w:ascii="Lato" w:eastAsia="Times New Roman" w:hAnsi="Lato" w:cs="Calibri"/>
-                                <w:b/>
-                                <w:bCs/>
-                                <w:color w:val="2E2E2E"/>
-                                <w:sz w:val="14"/>
-                                <w:szCs w:val="14"/>
-                                <w:shd w:val="clear" w:color="auto" w:fill="FBFBFB"/>
-                              </w:rPr>
-                              <w:t>), getMonth(), getDate()</w:t>
+                              <w:t>Извлечение даты: getFullYear(), getMonth(), getDate()</w:t>
                             </w:r>
                           </w:p>
                           <w:p>
@@ -17466,7 +19171,6 @@
                                 </w:rPr>
                                 <w:t>Метод </w:t>
                               </w:r>
-                              <w:proofErr w:type="gramStart"/>
                               <w:r>
                                 <w:rPr>
                                   <w:rFonts w:ascii="Consolas" w:eastAsia="Times New Roman" w:hAnsi="Consolas" w:cs="Calibri"/>
@@ -17476,19 +19180,7 @@
                                   <w:u w:val="single"/>
                                   <w:shd w:val="clear" w:color="auto" w:fill="FBFBFB"/>
                                 </w:rPr>
-                                <w:t>getFullYear(</w:t>
-                              </w:r>
-                              <w:proofErr w:type="gramEnd"/>
-                              <w:r>
-                                <w:rPr>
-                                  <w:rFonts w:ascii="Consolas" w:eastAsia="Times New Roman" w:hAnsi="Consolas" w:cs="Calibri"/>
-                                  <w:color w:val="0000FF"/>
-                                  <w:sz w:val="14"/>
-                                  <w:szCs w:val="14"/>
-                                  <w:u w:val="single"/>
-                                  <w:shd w:val="clear" w:color="auto" w:fill="FBFBFB"/>
-                                </w:rPr>
-                                <w:t>)</w:t>
+                                <w:t>getFullYear()</w:t>
                               </w:r>
                             </w:hyperlink>
                             <w:r>
@@ -17529,7 +19221,6 @@
                                 </w:rPr>
                                 <w:t>Метод </w:t>
                               </w:r>
-                              <w:proofErr w:type="gramStart"/>
                               <w:r>
                                 <w:rPr>
                                   <w:rFonts w:ascii="Consolas" w:eastAsia="Times New Roman" w:hAnsi="Consolas" w:cs="Calibri"/>
@@ -17539,19 +19230,7 @@
                                   <w:u w:val="single"/>
                                   <w:shd w:val="clear" w:color="auto" w:fill="FBFBFB"/>
                                 </w:rPr>
-                                <w:t>getMonth(</w:t>
-                              </w:r>
-                              <w:proofErr w:type="gramEnd"/>
-                              <w:r>
-                                <w:rPr>
-                                  <w:rFonts w:ascii="Consolas" w:eastAsia="Times New Roman" w:hAnsi="Consolas" w:cs="Calibri"/>
-                                  <w:color w:val="0000FF"/>
-                                  <w:sz w:val="14"/>
-                                  <w:szCs w:val="14"/>
-                                  <w:u w:val="single"/>
-                                  <w:shd w:val="clear" w:color="auto" w:fill="FBFBFB"/>
-                                </w:rPr>
-                                <w:t>)</w:t>
+                                <w:t>getMonth()</w:t>
                               </w:r>
                             </w:hyperlink>
                             <w:r>
@@ -17592,7 +19271,6 @@
                                 </w:rPr>
                                 <w:t>Метод </w:t>
                               </w:r>
-                              <w:proofErr w:type="gramStart"/>
                               <w:r>
                                 <w:rPr>
                                   <w:rFonts w:ascii="Consolas" w:eastAsia="Times New Roman" w:hAnsi="Consolas" w:cs="Calibri"/>
@@ -17602,19 +19280,7 @@
                                   <w:u w:val="single"/>
                                   <w:shd w:val="clear" w:color="auto" w:fill="FBFBFB"/>
                                 </w:rPr>
-                                <w:t>getDate(</w:t>
-                              </w:r>
-                              <w:proofErr w:type="gramEnd"/>
-                              <w:r>
-                                <w:rPr>
-                                  <w:rFonts w:ascii="Consolas" w:eastAsia="Times New Roman" w:hAnsi="Consolas" w:cs="Calibri"/>
-                                  <w:color w:val="0000FF"/>
-                                  <w:sz w:val="14"/>
-                                  <w:szCs w:val="14"/>
-                                  <w:u w:val="single"/>
-                                  <w:shd w:val="clear" w:color="auto" w:fill="FBFBFB"/>
-                                </w:rPr>
-                                <w:t>)</w:t>
+                                <w:t>getDate()</w:t>
                               </w:r>
                             </w:hyperlink>
                             <w:r>
@@ -17719,7 +19385,6 @@
                               </w:rPr>
                               <w:t xml:space="preserve"> </w:t>
                             </w:r>
-                            <w:proofErr w:type="gramStart"/>
                             <w:r>
                               <w:rPr>
                                 <w:rFonts w:ascii="Consolas" w:eastAsia="Times New Roman" w:hAnsi="Consolas" w:cs="Times New Roman"/>
@@ -17738,7 +19403,6 @@
                               </w:rPr>
                               <w:t>(</w:t>
                             </w:r>
-                            <w:proofErr w:type="gramEnd"/>
                             <w:r>
                               <w:rPr>
                                 <w:rFonts w:ascii="Consolas" w:eastAsia="Times New Roman" w:hAnsi="Consolas" w:cs="Times New Roman"/>
@@ -17769,7 +19433,6 @@
                                 <w:szCs w:val="14"/>
                               </w:rPr>
                             </w:pPr>
-                            <w:proofErr w:type="gramStart"/>
                             <w:r>
                               <w:rPr>
                                 <w:rFonts w:ascii="Consolas" w:eastAsia="Times New Roman" w:hAnsi="Consolas" w:cs="Times New Roman"/>
@@ -17806,7 +19469,6 @@
                               </w:rPr>
                               <w:t>(</w:t>
                             </w:r>
-                            <w:proofErr w:type="gramEnd"/>
                             <w:r>
                               <w:rPr>
                                 <w:rFonts w:ascii="Consolas" w:eastAsia="Times New Roman" w:hAnsi="Consolas" w:cs="Times New Roman"/>
@@ -17884,7 +19546,6 @@
                                 <w:szCs w:val="14"/>
                               </w:rPr>
                             </w:pPr>
-                            <w:proofErr w:type="gramStart"/>
                             <w:r>
                               <w:rPr>
                                 <w:rFonts w:ascii="Consolas" w:eastAsia="Times New Roman" w:hAnsi="Consolas" w:cs="Times New Roman"/>
@@ -17921,7 +19582,6 @@
                               </w:rPr>
                               <w:t>(</w:t>
                             </w:r>
-                            <w:proofErr w:type="gramEnd"/>
                             <w:r>
                               <w:rPr>
                                 <w:rFonts w:ascii="Consolas" w:eastAsia="Times New Roman" w:hAnsi="Consolas" w:cs="Times New Roman"/>
@@ -17999,7 +19659,6 @@
                                 <w:szCs w:val="14"/>
                               </w:rPr>
                             </w:pPr>
-                            <w:proofErr w:type="gramStart"/>
                             <w:r>
                               <w:rPr>
                                 <w:rFonts w:ascii="Consolas" w:eastAsia="Times New Roman" w:hAnsi="Consolas" w:cs="Times New Roman"/>
@@ -18036,7 +19695,6 @@
                               </w:rPr>
                               <w:t>(</w:t>
                             </w:r>
-                            <w:proofErr w:type="gramEnd"/>
                             <w:r>
                               <w:rPr>
                                 <w:rFonts w:ascii="Consolas" w:eastAsia="Times New Roman" w:hAnsi="Consolas" w:cs="Times New Roman"/>
@@ -18160,7 +19818,6 @@
                               </w:rPr>
                               <w:t> </w:t>
                             </w:r>
-                            <w:proofErr w:type="gramStart"/>
                             <w:r>
                               <w:rPr>
                                 <w:rFonts w:ascii="Consolas" w:eastAsia="Times New Roman" w:hAnsi="Consolas" w:cs="Calibri"/>
@@ -18180,19 +19837,7 @@
                                 <w:shd w:val="clear" w:color="auto" w:fill="FBFBFB"/>
                                 <w:lang w:val="ru-RU"/>
                               </w:rPr>
-                              <w:t>(</w:t>
-                            </w:r>
-                            <w:proofErr w:type="gramEnd"/>
-                            <w:r>
-                              <w:rPr>
-                                <w:rFonts w:ascii="Consolas" w:eastAsia="Times New Roman" w:hAnsi="Consolas" w:cs="Calibri"/>
-                                <w:color w:val="390707"/>
-                                <w:sz w:val="14"/>
-                                <w:szCs w:val="14"/>
-                                <w:shd w:val="clear" w:color="auto" w:fill="FBFBFB"/>
-                                <w:lang w:val="ru-RU"/>
-                              </w:rPr>
-                              <w:t>)</w:t>
+                              <w:t>()</w:t>
                             </w:r>
                             <w:r>
                               <w:rPr>
@@ -18456,29 +20101,7 @@
                                 <w:szCs w:val="14"/>
                                 <w:shd w:val="clear" w:color="auto" w:fill="FBFBFB"/>
                               </w:rPr>
-                              <w:t>Извлечение времени: </w:t>
-                            </w:r>
-                            <w:proofErr w:type="gramStart"/>
-                            <w:r>
-                              <w:rPr>
-                                <w:rFonts w:ascii="Lato" w:eastAsia="Times New Roman" w:hAnsi="Lato" w:cs="Calibri"/>
-                                <w:color w:val="2E2E2E"/>
-                                <w:sz w:val="14"/>
-                                <w:szCs w:val="14"/>
-                                <w:shd w:val="clear" w:color="auto" w:fill="FBFBFB"/>
-                              </w:rPr>
-                              <w:t>getHours(</w:t>
-                            </w:r>
-                            <w:proofErr w:type="gramEnd"/>
-                            <w:r>
-                              <w:rPr>
-                                <w:rFonts w:ascii="Lato" w:eastAsia="Times New Roman" w:hAnsi="Lato" w:cs="Calibri"/>
-                                <w:color w:val="2E2E2E"/>
-                                <w:sz w:val="14"/>
-                                <w:szCs w:val="14"/>
-                                <w:shd w:val="clear" w:color="auto" w:fill="FBFBFB"/>
-                              </w:rPr>
-                              <w:t>), getMinutes(), getSeconds(), getMilliseconds()</w:t>
+                              <w:t>Извлечение времени: getHours(), getMinutes(), getSeconds(), getMilliseconds()</w:t>
                             </w:r>
                           </w:p>
                           <w:p>
@@ -18532,7 +20155,6 @@
                                 </w:rPr>
                                 <w:t>Метод </w:t>
                               </w:r>
-                              <w:proofErr w:type="gramStart"/>
                               <w:r>
                                 <w:rPr>
                                   <w:rFonts w:ascii="Consolas" w:eastAsia="Times New Roman" w:hAnsi="Consolas" w:cs="Calibri"/>
@@ -18542,19 +20164,7 @@
                                   <w:u w:val="single"/>
                                   <w:shd w:val="clear" w:color="auto" w:fill="FBFBFB"/>
                                 </w:rPr>
-                                <w:t>getHours(</w:t>
-                              </w:r>
-                              <w:proofErr w:type="gramEnd"/>
-                              <w:r>
-                                <w:rPr>
-                                  <w:rFonts w:ascii="Consolas" w:eastAsia="Times New Roman" w:hAnsi="Consolas" w:cs="Calibri"/>
-                                  <w:color w:val="0000FF"/>
-                                  <w:sz w:val="14"/>
-                                  <w:szCs w:val="14"/>
-                                  <w:u w:val="single"/>
-                                  <w:shd w:val="clear" w:color="auto" w:fill="FBFBFB"/>
-                                </w:rPr>
-                                <w:t>)</w:t>
+                                <w:t>getHours()</w:t>
                               </w:r>
                             </w:hyperlink>
                             <w:r>
@@ -18595,7 +20205,6 @@
                                 </w:rPr>
                                 <w:t>Метод </w:t>
                               </w:r>
-                              <w:proofErr w:type="gramStart"/>
                               <w:r>
                                 <w:rPr>
                                   <w:rFonts w:ascii="Consolas" w:eastAsia="Times New Roman" w:hAnsi="Consolas" w:cs="Calibri"/>
@@ -18605,19 +20214,7 @@
                                   <w:u w:val="single"/>
                                   <w:shd w:val="clear" w:color="auto" w:fill="FBFBFB"/>
                                 </w:rPr>
-                                <w:t>getMinutes(</w:t>
-                              </w:r>
-                              <w:proofErr w:type="gramEnd"/>
-                              <w:r>
-                                <w:rPr>
-                                  <w:rFonts w:ascii="Consolas" w:eastAsia="Times New Roman" w:hAnsi="Consolas" w:cs="Calibri"/>
-                                  <w:color w:val="0000FF"/>
-                                  <w:sz w:val="14"/>
-                                  <w:szCs w:val="14"/>
-                                  <w:u w:val="single"/>
-                                  <w:shd w:val="clear" w:color="auto" w:fill="FBFBFB"/>
-                                </w:rPr>
-                                <w:t>)</w:t>
+                                <w:t>getMinutes()</w:t>
                               </w:r>
                             </w:hyperlink>
                             <w:r>
@@ -18658,7 +20255,6 @@
                                 </w:rPr>
                                 <w:t>Метод </w:t>
                               </w:r>
-                              <w:proofErr w:type="gramStart"/>
                               <w:r>
                                 <w:rPr>
                                   <w:rFonts w:ascii="Consolas" w:eastAsia="Times New Roman" w:hAnsi="Consolas" w:cs="Calibri"/>
@@ -18668,19 +20264,7 @@
                                   <w:u w:val="single"/>
                                   <w:shd w:val="clear" w:color="auto" w:fill="FBFBFB"/>
                                 </w:rPr>
-                                <w:t>getSeconds(</w:t>
-                              </w:r>
-                              <w:proofErr w:type="gramEnd"/>
-                              <w:r>
-                                <w:rPr>
-                                  <w:rFonts w:ascii="Consolas" w:eastAsia="Times New Roman" w:hAnsi="Consolas" w:cs="Calibri"/>
-                                  <w:color w:val="0000FF"/>
-                                  <w:sz w:val="14"/>
-                                  <w:szCs w:val="14"/>
-                                  <w:u w:val="single"/>
-                                  <w:shd w:val="clear" w:color="auto" w:fill="FBFBFB"/>
-                                </w:rPr>
-                                <w:t>)</w:t>
+                                <w:t>getSeconds()</w:t>
                               </w:r>
                             </w:hyperlink>
                             <w:r>
@@ -18721,7 +20305,6 @@
                                 </w:rPr>
                                 <w:t>Метод </w:t>
                               </w:r>
-                              <w:proofErr w:type="gramStart"/>
                               <w:r>
                                 <w:rPr>
                                   <w:rFonts w:ascii="Consolas" w:eastAsia="Times New Roman" w:hAnsi="Consolas" w:cs="Calibri"/>
@@ -18731,19 +20314,7 @@
                                   <w:u w:val="single"/>
                                   <w:shd w:val="clear" w:color="auto" w:fill="FBFBFB"/>
                                 </w:rPr>
-                                <w:t>getMilliseconds(</w:t>
-                              </w:r>
-                              <w:proofErr w:type="gramEnd"/>
-                              <w:r>
-                                <w:rPr>
-                                  <w:rFonts w:ascii="Consolas" w:eastAsia="Times New Roman" w:hAnsi="Consolas" w:cs="Calibri"/>
-                                  <w:color w:val="0000FF"/>
-                                  <w:sz w:val="14"/>
-                                  <w:szCs w:val="14"/>
-                                  <w:u w:val="single"/>
-                                  <w:shd w:val="clear" w:color="auto" w:fill="FBFBFB"/>
-                                </w:rPr>
-                                <w:t>)</w:t>
+                                <w:t>getMilliseconds()</w:t>
                               </w:r>
                             </w:hyperlink>
                             <w:r>
@@ -18848,7 +20419,6 @@
                               </w:rPr>
                               <w:t xml:space="preserve"> </w:t>
                             </w:r>
-                            <w:proofErr w:type="gramStart"/>
                             <w:r>
                               <w:rPr>
                                 <w:rFonts w:ascii="Consolas" w:eastAsia="Times New Roman" w:hAnsi="Consolas" w:cs="Times New Roman"/>
@@ -18867,7 +20437,6 @@
                               </w:rPr>
                               <w:t>(</w:t>
                             </w:r>
-                            <w:proofErr w:type="gramEnd"/>
                             <w:r>
                               <w:rPr>
                                 <w:rFonts w:ascii="Consolas" w:eastAsia="Times New Roman" w:hAnsi="Consolas" w:cs="Times New Roman"/>
@@ -18898,7 +20467,6 @@
                                 <w:szCs w:val="14"/>
                               </w:rPr>
                             </w:pPr>
-                            <w:proofErr w:type="gramStart"/>
                             <w:r>
                               <w:rPr>
                                 <w:rFonts w:ascii="Consolas" w:eastAsia="Times New Roman" w:hAnsi="Consolas" w:cs="Times New Roman"/>
@@ -18935,7 +20503,6 @@
                               </w:rPr>
                               <w:t>(</w:t>
                             </w:r>
-                            <w:proofErr w:type="gramEnd"/>
                             <w:r>
                               <w:rPr>
                                 <w:rFonts w:ascii="Consolas" w:eastAsia="Times New Roman" w:hAnsi="Consolas" w:cs="Times New Roman"/>
@@ -19013,7 +20580,6 @@
                                 <w:szCs w:val="14"/>
                               </w:rPr>
                             </w:pPr>
-                            <w:proofErr w:type="gramStart"/>
                             <w:r>
                               <w:rPr>
                                 <w:rFonts w:ascii="Consolas" w:eastAsia="Times New Roman" w:hAnsi="Consolas" w:cs="Times New Roman"/>
@@ -19050,7 +20616,6 @@
                               </w:rPr>
                               <w:t>(</w:t>
                             </w:r>
-                            <w:proofErr w:type="gramEnd"/>
                             <w:r>
                               <w:rPr>
                                 <w:rFonts w:ascii="Consolas" w:eastAsia="Times New Roman" w:hAnsi="Consolas" w:cs="Times New Roman"/>
@@ -19128,7 +20693,6 @@
                                 <w:szCs w:val="14"/>
                               </w:rPr>
                             </w:pPr>
-                            <w:proofErr w:type="gramStart"/>
                             <w:r>
                               <w:rPr>
                                 <w:rFonts w:ascii="Consolas" w:eastAsia="Times New Roman" w:hAnsi="Consolas" w:cs="Times New Roman"/>
@@ -19165,7 +20729,6 @@
                               </w:rPr>
                               <w:t>(</w:t>
                             </w:r>
-                            <w:proofErr w:type="gramEnd"/>
                             <w:r>
                               <w:rPr>
                                 <w:rFonts w:ascii="Consolas" w:eastAsia="Times New Roman" w:hAnsi="Consolas" w:cs="Times New Roman"/>
@@ -19243,7 +20806,6 @@
                                 <w:szCs w:val="14"/>
                               </w:rPr>
                             </w:pPr>
-                            <w:proofErr w:type="gramStart"/>
                             <w:r>
                               <w:rPr>
                                 <w:rFonts w:ascii="Consolas" w:eastAsia="Times New Roman" w:hAnsi="Consolas" w:cs="Times New Roman"/>
@@ -19280,7 +20842,6 @@
                               </w:rPr>
                               <w:t>(</w:t>
                             </w:r>
-                            <w:proofErr w:type="gramEnd"/>
                             <w:r>
                               <w:rPr>
                                 <w:rFonts w:ascii="Consolas" w:eastAsia="Times New Roman" w:hAnsi="Consolas" w:cs="Times New Roman"/>
@@ -19402,9 +20963,8 @@
                                 <w:szCs w:val="14"/>
                                 <w:shd w:val="clear" w:color="auto" w:fill="FBFBFB"/>
                               </w:rPr>
-                              <w:t> </w:t>
-                            </w:r>
-                            <w:proofErr w:type="gramStart"/>
+                              <w:t> getDay</w:t>
+                            </w:r>
                             <w:r>
                               <w:rPr>
                                 <w:rFonts w:ascii="Lato" w:eastAsia="Times New Roman" w:hAnsi="Lato" w:cs="Calibri"/>
@@ -19412,31 +20972,9 @@
                                 <w:sz w:val="14"/>
                                 <w:szCs w:val="14"/>
                                 <w:shd w:val="clear" w:color="auto" w:fill="FBFBFB"/>
-                              </w:rPr>
-                              <w:t>getDay</w:t>
-                            </w:r>
-                            <w:r>
-                              <w:rPr>
-                                <w:rFonts w:ascii="Lato" w:eastAsia="Times New Roman" w:hAnsi="Lato" w:cs="Calibri"/>
-                                <w:color w:val="2E2E2E"/>
-                                <w:sz w:val="14"/>
-                                <w:szCs w:val="14"/>
-                                <w:shd w:val="clear" w:color="auto" w:fill="FBFBFB"/>
                                 <w:lang w:val="ru-RU"/>
                               </w:rPr>
-                              <w:t>(</w:t>
-                            </w:r>
-                            <w:proofErr w:type="gramEnd"/>
-                            <w:r>
-                              <w:rPr>
-                                <w:rFonts w:ascii="Lato" w:eastAsia="Times New Roman" w:hAnsi="Lato" w:cs="Calibri"/>
-                                <w:color w:val="2E2E2E"/>
-                                <w:sz w:val="14"/>
-                                <w:szCs w:val="14"/>
-                                <w:shd w:val="clear" w:color="auto" w:fill="FBFBFB"/>
-                                <w:lang w:val="ru-RU"/>
-                              </w:rPr>
-                              <w:t>)</w:t>
+                              <w:t>()</w:t>
                             </w:r>
                           </w:p>
                           <w:p>
@@ -19770,7 +21308,6 @@
                               </w:rPr>
                               <w:t xml:space="preserve"> </w:t>
                             </w:r>
-                            <w:proofErr w:type="gramStart"/>
                             <w:r>
                               <w:rPr>
                                 <w:rFonts w:ascii="Consolas" w:eastAsia="Times New Roman" w:hAnsi="Consolas" w:cs="Times New Roman"/>
@@ -19789,7 +21326,6 @@
                               </w:rPr>
                               <w:t>(</w:t>
                             </w:r>
-                            <w:proofErr w:type="gramEnd"/>
                             <w:r>
                               <w:rPr>
                                 <w:rFonts w:ascii="Consolas" w:eastAsia="Times New Roman" w:hAnsi="Consolas" w:cs="Times New Roman"/>
@@ -19820,7 +21356,6 @@
                                 <w:szCs w:val="14"/>
                               </w:rPr>
                             </w:pPr>
-                            <w:proofErr w:type="gramStart"/>
                             <w:r>
                               <w:rPr>
                                 <w:rFonts w:ascii="Consolas" w:eastAsia="Times New Roman" w:hAnsi="Consolas" w:cs="Times New Roman"/>
@@ -19857,7 +21392,6 @@
                               </w:rPr>
                               <w:t>(</w:t>
                             </w:r>
-                            <w:proofErr w:type="gramEnd"/>
                             <w:r>
                               <w:rPr>
                                 <w:rFonts w:ascii="Consolas" w:eastAsia="Times New Roman" w:hAnsi="Consolas" w:cs="Times New Roman"/>
@@ -25481,7 +27015,7 @@
                                     </pic:cNvPicPr>
                                   </pic:nvPicPr>
                                   <pic:blipFill>
-                                    <a:blip r:embed="rId32">
+                                    <a:blip r:embed="rId42">
                                       <a:extLst>
                                         <a:ext uri="{28A0092B-C50C-407E-A947-70E740481C1C}">
                                           <a14:useLocalDpi xmlns:a14="http://schemas.microsoft.com/office/drawing/2010/main" val="0"/>
@@ -27063,107 +28597,35 @@
   </w:num>
   <w:num w:numId="9" w16cid:durableId="1199969516">
     <w:abstractNumId w:val="3"/>
-    <w:lvlOverride w:ilvl="1">
-      <w:startOverride w:val="1"/>
-    </w:lvlOverride>
+    <w:lvlOverride w:ilvl="0"/>
   </w:num>
   <w:num w:numId="10" w16cid:durableId="1199969516">
     <w:abstractNumId w:val="3"/>
-    <w:lvlOverride w:ilvl="1">
-      <w:lvl w:ilvl="1">
-        <w:numFmt w:val="bullet"/>
-        <w:lvlText w:val=""/>
-        <w:lvlJc w:val="left"/>
-        <w:pPr>
-          <w:tabs>
-            <w:tab w:val="num" w:pos="1440"/>
-          </w:tabs>
-          <w:ind w:left="1440" w:hanging="360"/>
-        </w:pPr>
-        <w:rPr>
-          <w:rFonts w:ascii="Symbol" w:hAnsi="Symbol" w:hint="default"/>
-          <w:sz w:val="20"/>
-        </w:rPr>
-      </w:lvl>
-    </w:lvlOverride>
+    <w:lvlOverride w:ilvl="0"/>
   </w:num>
   <w:num w:numId="11" w16cid:durableId="1199969516">
     <w:abstractNumId w:val="3"/>
-    <w:lvlOverride w:ilvl="1">
-      <w:lvl w:ilvl="1">
-        <w:numFmt w:val="bullet"/>
-        <w:lvlText w:val=""/>
-        <w:lvlJc w:val="left"/>
-        <w:pPr>
-          <w:tabs>
-            <w:tab w:val="num" w:pos="1440"/>
-          </w:tabs>
-          <w:ind w:left="1440" w:hanging="360"/>
-        </w:pPr>
-        <w:rPr>
-          <w:rFonts w:ascii="Symbol" w:hAnsi="Symbol" w:hint="default"/>
-          <w:sz w:val="20"/>
-        </w:rPr>
-      </w:lvl>
-    </w:lvlOverride>
+    <w:lvlOverride w:ilvl="0"/>
   </w:num>
   <w:num w:numId="12" w16cid:durableId="1199969516">
     <w:abstractNumId w:val="3"/>
-    <w:lvlOverride w:ilvl="1">
-      <w:lvl w:ilvl="1">
-        <w:numFmt w:val="bullet"/>
-        <w:lvlText w:val=""/>
-        <w:lvlJc w:val="left"/>
-        <w:pPr>
-          <w:tabs>
-            <w:tab w:val="num" w:pos="1440"/>
-          </w:tabs>
-          <w:ind w:left="1440" w:hanging="360"/>
-        </w:pPr>
-        <w:rPr>
-          <w:rFonts w:ascii="Symbol" w:hAnsi="Symbol" w:hint="default"/>
-          <w:sz w:val="20"/>
-        </w:rPr>
-      </w:lvl>
-    </w:lvlOverride>
+    <w:lvlOverride w:ilvl="0"/>
   </w:num>
   <w:num w:numId="13" w16cid:durableId="1199969516">
     <w:abstractNumId w:val="3"/>
-    <w:lvlOverride w:ilvl="1">
-      <w:lvl w:ilvl="1">
-        <w:numFmt w:val="bullet"/>
-        <w:lvlText w:val=""/>
-        <w:lvlJc w:val="left"/>
-        <w:pPr>
-          <w:tabs>
-            <w:tab w:val="num" w:pos="1440"/>
-          </w:tabs>
-          <w:ind w:left="1440" w:hanging="360"/>
-        </w:pPr>
-        <w:rPr>
-          <w:rFonts w:ascii="Symbol" w:hAnsi="Symbol" w:hint="default"/>
-          <w:sz w:val="20"/>
-        </w:rPr>
-      </w:lvl>
-    </w:lvlOverride>
+    <w:lvlOverride w:ilvl="0"/>
   </w:num>
   <w:num w:numId="14" w16cid:durableId="1199969516">
     <w:abstractNumId w:val="3"/>
-    <w:lvlOverride w:ilvl="1">
-      <w:startOverride w:val="1"/>
-    </w:lvlOverride>
+    <w:lvlOverride w:ilvl="0"/>
   </w:num>
   <w:num w:numId="15" w16cid:durableId="1199969516">
     <w:abstractNumId w:val="3"/>
-    <w:lvlOverride w:ilvl="1">
-      <w:startOverride w:val="1"/>
-    </w:lvlOverride>
+    <w:lvlOverride w:ilvl="0"/>
   </w:num>
   <w:num w:numId="16" w16cid:durableId="1199969516">
     <w:abstractNumId w:val="3"/>
-    <w:lvlOverride w:ilvl="1">
-      <w:startOverride w:val="1"/>
-    </w:lvlOverride>
+    <w:lvlOverride w:ilvl="0"/>
   </w:num>
 </w:numbering>
 </file>
@@ -27697,6 +29159,17 @@
       <w:u w:val="single"/>
     </w:rPr>
   </w:style>
+  <w:style w:type="character" w:styleId="Strong">
+    <w:name w:val="Strong"/>
+    <w:basedOn w:val="DefaultParagraphFont"/>
+    <w:uiPriority w:val="22"/>
+    <w:qFormat/>
+    <w:rsid w:val="00B617FA"/>
+    <w:rPr>
+      <w:b/>
+      <w:bCs/>
+    </w:rPr>
+  </w:style>
 </w:styles>
 </file>
 

</xml_diff>